<commit_message>
feat: updated math exam
</commit_message>
<xml_diff>
--- a/Математика/ответы.docx
+++ b/Математика/ответы.docx
@@ -1116,13 +1116,7 @@
               <w:rPr>
                 <w:rFonts w:ascii="Cambria Math" w:eastAsiaTheme="minorEastAsia" w:hAnsi="Cambria Math"/>
               </w:rPr>
-              <m:t>f(</m:t>
-            </m:r>
-            <m:r>
-              <w:rPr>
-                <w:rFonts w:ascii="Cambria Math" w:eastAsiaTheme="minorEastAsia" w:hAnsi="Cambria Math"/>
-              </w:rPr>
-              <m:t>ε</m:t>
+              <m:t>f(ε</m:t>
             </m:r>
           </m:e>
           <m:sub>
@@ -1289,13 +1283,7 @@
           <w:rPr>
             <w:rFonts w:ascii="Cambria Math" w:eastAsiaTheme="minorEastAsia" w:hAnsi="Cambria Math"/>
           </w:rPr>
-          <m:t>=</m:t>
-        </m:r>
-        <m:r>
-          <w:rPr>
-            <w:rFonts w:ascii="Cambria Math" w:eastAsiaTheme="minorEastAsia" w:hAnsi="Cambria Math"/>
-          </w:rPr>
-          <m:t>f</m:t>
+          <m:t>=f</m:t>
         </m:r>
         <m:d>
           <m:dPr>
@@ -1437,13 +1425,7 @@
           <w:rPr>
             <w:rFonts w:ascii="Cambria Math" w:eastAsiaTheme="minorEastAsia" w:hAnsi="Cambria Math"/>
           </w:rPr>
-          <m:t>=</m:t>
-        </m:r>
-        <m:r>
-          <w:rPr>
-            <w:rFonts w:ascii="Cambria Math" w:eastAsiaTheme="minorEastAsia" w:hAnsi="Cambria Math"/>
-          </w:rPr>
-          <m:t>f</m:t>
+          <m:t>=f</m:t>
         </m:r>
         <m:d>
           <m:dPr>
@@ -1522,13 +1504,7 @@
           <w:rPr>
             <w:rFonts w:ascii="Cambria Math" w:eastAsiaTheme="minorEastAsia" w:hAnsi="Cambria Math"/>
           </w:rPr>
-          <m:t>+</m:t>
-        </m:r>
-        <m:r>
-          <w:rPr>
-            <w:rFonts w:ascii="Cambria Math" w:eastAsiaTheme="minorEastAsia" w:hAnsi="Cambria Math"/>
-          </w:rPr>
-          <m:t>f</m:t>
+          <m:t>+f</m:t>
         </m:r>
         <m:d>
           <m:dPr>
@@ -1607,13 +1583,7 @@
           <w:rPr>
             <w:rFonts w:ascii="Cambria Math" w:eastAsiaTheme="minorEastAsia" w:hAnsi="Cambria Math"/>
           </w:rPr>
-          <m:t>+…+</m:t>
-        </m:r>
-        <m:r>
-          <w:rPr>
-            <w:rFonts w:ascii="Cambria Math" w:eastAsiaTheme="minorEastAsia" w:hAnsi="Cambria Math"/>
-          </w:rPr>
-          <m:t>f</m:t>
+          <m:t>+…+f</m:t>
         </m:r>
         <m:d>
           <m:dPr>
@@ -1819,6 +1789,9 @@
           <w:numId w:val="2"/>
         </w:numPr>
         <w:ind w:left="1134" w:hanging="567"/>
+        <w:rPr>
+          <w:rFonts w:eastAsiaTheme="minorEastAsia"/>
+        </w:rPr>
       </w:pPr>
       <w:r>
         <w:rPr>
@@ -1931,12 +1904,26 @@
         <w:t xml:space="preserve">, стремящимся к нулю, не зависящий ни от способа разбиения отрезка </w:t>
       </w:r>
       <m:oMath>
-        <m:r>
-          <w:rPr>
-            <w:rFonts w:ascii="Cambria Math" w:hAnsi="Cambria Math"/>
-          </w:rPr>
-          <m:t>[a;b]</m:t>
-        </m:r>
+        <m:d>
+          <m:dPr>
+            <m:begChr m:val="["/>
+            <m:endChr m:val="]"/>
+            <m:ctrlPr>
+              <w:rPr>
+                <w:rFonts w:ascii="Cambria Math" w:hAnsi="Cambria Math"/>
+                <w:i/>
+              </w:rPr>
+            </m:ctrlPr>
+          </m:dPr>
+          <m:e>
+            <m:r>
+              <w:rPr>
+                <w:rFonts w:ascii="Cambria Math" w:hAnsi="Cambria Math"/>
+              </w:rPr>
+              <m:t>a;b</m:t>
+            </m:r>
+          </m:e>
+        </m:d>
       </m:oMath>
       <w:r>
         <w:rPr>
@@ -1990,8 +1977,26 @@
           <w:rPr>
             <w:rFonts w:ascii="Cambria Math" w:eastAsiaTheme="minorEastAsia" w:hAnsi="Cambria Math"/>
           </w:rPr>
-          <m:t>f(x)</m:t>
-        </m:r>
+          <m:t>f</m:t>
+        </m:r>
+        <m:d>
+          <m:dPr>
+            <m:ctrlPr>
+              <w:rPr>
+                <w:rFonts w:ascii="Cambria Math" w:eastAsiaTheme="minorEastAsia" w:hAnsi="Cambria Math"/>
+                <w:i/>
+              </w:rPr>
+            </m:ctrlPr>
+          </m:dPr>
+          <m:e>
+            <m:r>
+              <w:rPr>
+                <w:rFonts w:ascii="Cambria Math" w:eastAsiaTheme="minorEastAsia" w:hAnsi="Cambria Math"/>
+              </w:rPr>
+              <m:t>x</m:t>
+            </m:r>
+          </m:e>
+        </m:d>
       </m:oMath>
       <w:r>
         <w:rPr>
@@ -2000,12 +2005,24 @@
         <w:t xml:space="preserve"> по отрезку </w:t>
       </w:r>
       <m:oMath>
-        <m:r>
-          <w:rPr>
-            <w:rFonts w:ascii="Cambria Math" w:eastAsiaTheme="minorEastAsia" w:hAnsi="Cambria Math"/>
-          </w:rPr>
-          <m:t>(a;b)</m:t>
-        </m:r>
+        <m:d>
+          <m:dPr>
+            <m:ctrlPr>
+              <w:rPr>
+                <w:rFonts w:ascii="Cambria Math" w:eastAsiaTheme="minorEastAsia" w:hAnsi="Cambria Math"/>
+                <w:i/>
+              </w:rPr>
+            </m:ctrlPr>
+          </m:dPr>
+          <m:e>
+            <m:r>
+              <w:rPr>
+                <w:rFonts w:ascii="Cambria Math" w:eastAsiaTheme="minorEastAsia" w:hAnsi="Cambria Math"/>
+              </w:rPr>
+              <m:t>a;b</m:t>
+            </m:r>
+          </m:e>
+        </m:d>
       </m:oMath>
       <w:r>
         <w:rPr>
@@ -2131,26 +2148,6 @@
           <w:rPr>
             <w:rFonts w:ascii="Cambria Math" w:eastAsiaTheme="minorEastAsia" w:hAnsi="Cambria Math"/>
           </w:rPr>
-          <m:t>f(x)</m:t>
-        </m:r>
-      </m:oMath>
-      <w:r>
-        <w:rPr>
-          <w:rFonts w:eastAsiaTheme="minorEastAsia"/>
-        </w:rPr>
-        <w:t xml:space="preserve"> </w:t>
-      </w:r>
-      <w:r>
-        <w:rPr>
-          <w:rFonts w:eastAsiaTheme="minorEastAsia"/>
-        </w:rPr>
-        <w:t xml:space="preserve">– подынтегральной функцией, </w:t>
-      </w:r>
-      <m:oMath>
-        <m:r>
-          <w:rPr>
-            <w:rFonts w:ascii="Cambria Math" w:eastAsiaTheme="minorEastAsia" w:hAnsi="Cambria Math"/>
-          </w:rPr>
           <m:t>f</m:t>
         </m:r>
         <m:d>
@@ -2171,12 +2168,6 @@
             </m:r>
           </m:e>
         </m:d>
-        <m:r>
-          <w:rPr>
-            <w:rFonts w:ascii="Cambria Math" w:eastAsiaTheme="minorEastAsia" w:hAnsi="Cambria Math"/>
-          </w:rPr>
-          <m:t>dx</m:t>
-        </m:r>
       </m:oMath>
       <w:r>
         <w:rPr>
@@ -2188,83 +2179,7 @@
         <w:rPr>
           <w:rFonts w:eastAsiaTheme="minorEastAsia"/>
         </w:rPr>
-        <w:t>–</w:t>
-      </w:r>
-      <w:r>
-        <w:rPr>
-          <w:rFonts w:eastAsiaTheme="minorEastAsia"/>
-        </w:rPr>
-        <w:t xml:space="preserve"> </w:t>
-      </w:r>
-      <w:r>
-        <w:rPr>
-          <w:rFonts w:eastAsiaTheme="minorEastAsia"/>
-        </w:rPr>
-        <w:t xml:space="preserve">подынтегральным выражением, </w:t>
-      </w:r>
-      <m:oMath>
-        <m:r>
-          <w:rPr>
-            <w:rFonts w:ascii="Cambria Math" w:eastAsiaTheme="minorEastAsia" w:hAnsi="Cambria Math"/>
-          </w:rPr>
-          <m:t>x</m:t>
-        </m:r>
-      </m:oMath>
-      <w:r>
-        <w:rPr>
-          <w:rFonts w:eastAsiaTheme="minorEastAsia"/>
-        </w:rPr>
-        <w:t xml:space="preserve"> </w:t>
-      </w:r>
-      <w:r>
-        <w:rPr>
-          <w:rFonts w:eastAsiaTheme="minorEastAsia"/>
-        </w:rPr>
-        <w:t>–</w:t>
-      </w:r>
-      <w:r>
-        <w:rPr>
-          <w:rFonts w:eastAsiaTheme="minorEastAsia"/>
-        </w:rPr>
-        <w:t xml:space="preserve"> </w:t>
-      </w:r>
-      <w:r>
-        <w:rPr>
-          <w:rFonts w:eastAsiaTheme="minorEastAsia"/>
-        </w:rPr>
-        <w:t xml:space="preserve">переменной интегрирования, отрезок </w:t>
-      </w:r>
-      <m:oMath>
-        <m:r>
-          <w:rPr>
-            <w:rFonts w:ascii="Cambria Math" w:hAnsi="Cambria Math"/>
-          </w:rPr>
-          <m:t>[a;b]</m:t>
-        </m:r>
-      </m:oMath>
-      <w:r>
-        <w:rPr>
-          <w:rFonts w:eastAsiaTheme="minorEastAsia"/>
-        </w:rPr>
-        <w:t xml:space="preserve"> </w:t>
-      </w:r>
-      <w:r>
-        <w:rPr>
-          <w:rFonts w:eastAsiaTheme="minorEastAsia"/>
-        </w:rPr>
-        <w:t>–</w:t>
-      </w:r>
-      <w:r>
-        <w:rPr>
-          <w:rFonts w:eastAsiaTheme="minorEastAsia"/>
-        </w:rPr>
-        <w:t xml:space="preserve"> </w:t>
-      </w:r>
-      <w:r>
-        <w:rPr>
-          <w:rFonts w:eastAsiaTheme="minorEastAsia"/>
-        </w:rPr>
-        <w:t xml:space="preserve">отрезком интегрирования, функция </w:t>
+        <w:t xml:space="preserve">– подынтегральной функцией, </w:t>
       </w:r>
       <m:oMath>
         <m:r>
@@ -2291,6 +2206,140 @@
             </m:r>
           </m:e>
         </m:d>
+        <m:r>
+          <w:rPr>
+            <w:rFonts w:ascii="Cambria Math" w:eastAsiaTheme="minorEastAsia" w:hAnsi="Cambria Math"/>
+          </w:rPr>
+          <m:t>dx</m:t>
+        </m:r>
+      </m:oMath>
+      <w:r>
+        <w:rPr>
+          <w:rFonts w:eastAsiaTheme="minorEastAsia"/>
+        </w:rPr>
+        <w:t xml:space="preserve"> </w:t>
+      </w:r>
+      <w:r>
+        <w:rPr>
+          <w:rFonts w:eastAsiaTheme="minorEastAsia"/>
+        </w:rPr>
+        <w:t>–</w:t>
+      </w:r>
+      <w:r>
+        <w:rPr>
+          <w:rFonts w:eastAsiaTheme="minorEastAsia"/>
+        </w:rPr>
+        <w:t xml:space="preserve"> </w:t>
+      </w:r>
+      <w:r>
+        <w:rPr>
+          <w:rFonts w:eastAsiaTheme="minorEastAsia"/>
+        </w:rPr>
+        <w:t xml:space="preserve">подынтегральным выражением, </w:t>
+      </w:r>
+      <m:oMath>
+        <m:r>
+          <w:rPr>
+            <w:rFonts w:ascii="Cambria Math" w:eastAsiaTheme="minorEastAsia" w:hAnsi="Cambria Math"/>
+          </w:rPr>
+          <m:t>x</m:t>
+        </m:r>
+      </m:oMath>
+      <w:r>
+        <w:rPr>
+          <w:rFonts w:eastAsiaTheme="minorEastAsia"/>
+        </w:rPr>
+        <w:t xml:space="preserve"> </w:t>
+      </w:r>
+      <w:r>
+        <w:rPr>
+          <w:rFonts w:eastAsiaTheme="minorEastAsia"/>
+        </w:rPr>
+        <w:t>–</w:t>
+      </w:r>
+      <w:r>
+        <w:rPr>
+          <w:rFonts w:eastAsiaTheme="minorEastAsia"/>
+        </w:rPr>
+        <w:t xml:space="preserve"> </w:t>
+      </w:r>
+      <w:r>
+        <w:rPr>
+          <w:rFonts w:eastAsiaTheme="minorEastAsia"/>
+        </w:rPr>
+        <w:t xml:space="preserve">переменной интегрирования, отрезок </w:t>
+      </w:r>
+      <m:oMath>
+        <m:d>
+          <m:dPr>
+            <m:begChr m:val="["/>
+            <m:endChr m:val="]"/>
+            <m:ctrlPr>
+              <w:rPr>
+                <w:rFonts w:ascii="Cambria Math" w:hAnsi="Cambria Math"/>
+                <w:i/>
+              </w:rPr>
+            </m:ctrlPr>
+          </m:dPr>
+          <m:e>
+            <m:r>
+              <w:rPr>
+                <w:rFonts w:ascii="Cambria Math" w:hAnsi="Cambria Math"/>
+              </w:rPr>
+              <m:t>a;b</m:t>
+            </m:r>
+          </m:e>
+        </m:d>
+      </m:oMath>
+      <w:r>
+        <w:rPr>
+          <w:rFonts w:eastAsiaTheme="minorEastAsia"/>
+        </w:rPr>
+        <w:t xml:space="preserve"> </w:t>
+      </w:r>
+      <w:r>
+        <w:rPr>
+          <w:rFonts w:eastAsiaTheme="minorEastAsia"/>
+        </w:rPr>
+        <w:t>–</w:t>
+      </w:r>
+      <w:r>
+        <w:rPr>
+          <w:rFonts w:eastAsiaTheme="minorEastAsia"/>
+        </w:rPr>
+        <w:t xml:space="preserve"> </w:t>
+      </w:r>
+      <w:r>
+        <w:rPr>
+          <w:rFonts w:eastAsiaTheme="minorEastAsia"/>
+        </w:rPr>
+        <w:t xml:space="preserve">отрезком интегрирования, функция </w:t>
+      </w:r>
+      <m:oMath>
+        <m:r>
+          <w:rPr>
+            <w:rFonts w:ascii="Cambria Math" w:eastAsiaTheme="minorEastAsia" w:hAnsi="Cambria Math"/>
+          </w:rPr>
+          <m:t>f</m:t>
+        </m:r>
+        <m:d>
+          <m:dPr>
+            <m:ctrlPr>
+              <w:rPr>
+                <w:rFonts w:ascii="Cambria Math" w:eastAsiaTheme="minorEastAsia" w:hAnsi="Cambria Math"/>
+                <w:i/>
+              </w:rPr>
+            </m:ctrlPr>
+          </m:dPr>
+          <m:e>
+            <m:r>
+              <w:rPr>
+                <w:rFonts w:ascii="Cambria Math" w:eastAsiaTheme="minorEastAsia" w:hAnsi="Cambria Math"/>
+              </w:rPr>
+              <m:t>x</m:t>
+            </m:r>
+          </m:e>
+        </m:d>
       </m:oMath>
       <w:r>
         <w:rPr>
@@ -2299,12 +2348,26 @@
         <w:t xml:space="preserve"> в данном случае называется интегрируемой на отрезке </w:t>
       </w:r>
       <m:oMath>
-        <m:r>
-          <w:rPr>
-            <w:rFonts w:ascii="Cambria Math" w:hAnsi="Cambria Math"/>
-          </w:rPr>
-          <m:t>[a;b]</m:t>
-        </m:r>
+        <m:d>
+          <m:dPr>
+            <m:begChr m:val="["/>
+            <m:endChr m:val="]"/>
+            <m:ctrlPr>
+              <w:rPr>
+                <w:rFonts w:ascii="Cambria Math" w:hAnsi="Cambria Math"/>
+                <w:i/>
+              </w:rPr>
+            </m:ctrlPr>
+          </m:dPr>
+          <m:e>
+            <m:r>
+              <w:rPr>
+                <w:rFonts w:ascii="Cambria Math" w:hAnsi="Cambria Math"/>
+              </w:rPr>
+              <m:t>a;b</m:t>
+            </m:r>
+          </m:e>
+        </m:d>
       </m:oMath>
       <w:r>
         <w:rPr>
@@ -2948,13 +3011,7 @@
               <w:rPr>
                 <w:rFonts w:ascii="Cambria Math" w:eastAsiaTheme="minorEastAsia" w:hAnsi="Cambria Math"/>
               </w:rPr>
-              <m:t>(x))</m:t>
-            </m:r>
-            <m:r>
-              <w:rPr>
-                <w:rFonts w:ascii="Cambria Math" w:eastAsiaTheme="minorEastAsia" w:hAnsi="Cambria Math"/>
-              </w:rPr>
-              <m:t>dx</m:t>
+              <m:t>(x))dx</m:t>
             </m:r>
           </m:e>
         </m:nary>
@@ -3318,13 +3375,7 @@
           <w:rPr>
             <w:rFonts w:ascii="Cambria Math" w:eastAsiaTheme="minorEastAsia" w:hAnsi="Cambria Math"/>
           </w:rPr>
-          <m:t>=</m:t>
-        </m:r>
-        <m:r>
-          <w:rPr>
-            <w:rFonts w:ascii="Cambria Math" w:eastAsiaTheme="minorEastAsia" w:hAnsi="Cambria Math"/>
-          </w:rPr>
-          <m:t>-</m:t>
+          <m:t>=-</m:t>
         </m:r>
         <m:nary>
           <m:naryPr>
@@ -3909,6 +3960,9 @@
           <w:numId w:val="2"/>
         </w:numPr>
         <w:ind w:left="567" w:hanging="567"/>
+        <w:rPr>
+          <w:rFonts w:eastAsiaTheme="minorEastAsia"/>
+        </w:rPr>
       </w:pPr>
       <w:r>
         <w:rPr>
@@ -4513,6 +4567,12 @@
           </wp:inline>
         </w:drawing>
       </w:r>
+      <w:r>
+        <w:rPr>
+          <w:rFonts w:eastAsiaTheme="minorEastAsia"/>
+        </w:rPr>
+        <w:br w:type="page"/>
+      </w:r>
     </w:p>
     <w:p>
       <w:pPr>
@@ -4528,6 +4588,7 @@
           <w:b/>
           <w:bCs/>
         </w:rPr>
+        <w:lastRenderedPageBreak/>
         <w:t>Формула Ньютона-Лейбница (вывод).</w:t>
       </w:r>
       <w:r>
@@ -4747,21 +4808,18 @@
       <w:r>
         <w:rPr>
           <w:rFonts w:eastAsiaTheme="minorEastAsia"/>
-          <w:lang w:val="en-US"/>
         </w:rPr>
         <w:t>.</w:t>
       </w:r>
       <w:r>
         <w:rPr>
           <w:rFonts w:eastAsiaTheme="minorEastAsia"/>
-          <w:lang w:val="en-US"/>
         </w:rPr>
         <w:br/>
       </w:r>
       <w:r>
         <w:rPr>
           <w:rFonts w:eastAsiaTheme="minorEastAsia"/>
-          <w:lang w:val="en-US"/>
         </w:rPr>
         <w:br/>
       </w:r>
@@ -4774,7 +4832,6 @@
       <w:r>
         <w:rPr>
           <w:rFonts w:eastAsiaTheme="minorEastAsia"/>
-          <w:lang w:val="en-US"/>
         </w:rPr>
         <w:t>:</w:t>
       </w:r>
@@ -5459,6 +5516,9 @@
             <m:t>=</m:t>
           </m:r>
           <m:r>
+            <m:rPr>
+              <m:sty m:val="p"/>
+            </m:rPr>
             <w:rPr>
               <w:rFonts w:ascii="Cambria Math" w:hAnsi="Cambria Math"/>
             </w:rPr>
@@ -5682,13 +5742,7 @@
             <w:rPr>
               <w:rFonts w:ascii="Cambria Math" w:hAnsi="Cambria Math"/>
             </w:rPr>
-            <m:t>+(</m:t>
-          </m:r>
-          <m:r>
-            <w:rPr>
-              <w:rFonts w:ascii="Cambria Math" w:hAnsi="Cambria Math"/>
-            </w:rPr>
-            <m:t>F</m:t>
+            <m:t>+(F</m:t>
           </m:r>
           <m:d>
             <m:dPr>
@@ -6005,9 +6059,3566 @@
           <w:rPr>
             <w:rFonts w:ascii="Cambria Math" w:eastAsiaTheme="minorEastAsia" w:hAnsi="Cambria Math"/>
           </w:rPr>
-          <m:t>=F</m:t>
-        </m:r>
-      </m:oMath>
+          <m:t>=</m:t>
+        </m:r>
+        <m:sSup>
+          <m:sSupPr>
+            <m:ctrlPr>
+              <w:rPr>
+                <w:rFonts w:ascii="Cambria Math" w:eastAsiaTheme="minorEastAsia" w:hAnsi="Cambria Math"/>
+                <w:i/>
+              </w:rPr>
+            </m:ctrlPr>
+          </m:sSupPr>
+          <m:e>
+            <m:r>
+              <w:rPr>
+                <w:rFonts w:ascii="Cambria Math" w:eastAsiaTheme="minorEastAsia" w:hAnsi="Cambria Math"/>
+              </w:rPr>
+              <m:t>F</m:t>
+            </m:r>
+          </m:e>
+          <m:sup>
+            <m:r>
+              <w:rPr>
+                <w:rFonts w:ascii="Cambria Math" w:eastAsiaTheme="minorEastAsia" w:hAnsi="Cambria Math"/>
+              </w:rPr>
+              <m:t>'</m:t>
+            </m:r>
+          </m:sup>
+        </m:sSup>
+        <m:d>
+          <m:dPr>
+            <m:ctrlPr>
+              <w:rPr>
+                <w:rFonts w:ascii="Cambria Math" w:eastAsiaTheme="minorEastAsia" w:hAnsi="Cambria Math"/>
+                <w:i/>
+              </w:rPr>
+            </m:ctrlPr>
+          </m:dPr>
+          <m:e>
+            <m:sSub>
+              <m:sSubPr>
+                <m:ctrlPr>
+                  <w:rPr>
+                    <w:rFonts w:ascii="Cambria Math" w:eastAsiaTheme="minorEastAsia" w:hAnsi="Cambria Math"/>
+                    <w:i/>
+                  </w:rPr>
+                </m:ctrlPr>
+              </m:sSubPr>
+              <m:e>
+                <m:r>
+                  <w:rPr>
+                    <w:rFonts w:ascii="Cambria Math" w:eastAsiaTheme="minorEastAsia" w:hAnsi="Cambria Math"/>
+                  </w:rPr>
+                  <m:t>c</m:t>
+                </m:r>
+              </m:e>
+              <m:sub>
+                <m:r>
+                  <w:rPr>
+                    <w:rFonts w:ascii="Cambria Math" w:eastAsiaTheme="minorEastAsia" w:hAnsi="Cambria Math"/>
+                  </w:rPr>
+                  <m:t>n</m:t>
+                </m:r>
+              </m:sub>
+            </m:sSub>
+          </m:e>
+        </m:d>
+        <m:d>
+          <m:dPr>
+            <m:ctrlPr>
+              <w:rPr>
+                <w:rFonts w:ascii="Cambria Math" w:eastAsiaTheme="minorEastAsia" w:hAnsi="Cambria Math"/>
+                <w:i/>
+              </w:rPr>
+            </m:ctrlPr>
+          </m:dPr>
+          <m:e>
+            <m:sSub>
+              <m:sSubPr>
+                <m:ctrlPr>
+                  <w:rPr>
+                    <w:rFonts w:ascii="Cambria Math" w:eastAsiaTheme="minorEastAsia" w:hAnsi="Cambria Math"/>
+                    <w:i/>
+                  </w:rPr>
+                </m:ctrlPr>
+              </m:sSubPr>
+              <m:e>
+                <m:r>
+                  <w:rPr>
+                    <w:rFonts w:ascii="Cambria Math" w:eastAsiaTheme="minorEastAsia" w:hAnsi="Cambria Math"/>
+                  </w:rPr>
+                  <m:t>x</m:t>
+                </m:r>
+              </m:e>
+              <m:sub>
+                <m:r>
+                  <w:rPr>
+                    <w:rFonts w:ascii="Cambria Math" w:eastAsiaTheme="minorEastAsia" w:hAnsi="Cambria Math"/>
+                  </w:rPr>
+                  <m:t>n</m:t>
+                </m:r>
+              </m:sub>
+            </m:sSub>
+            <m:r>
+              <w:rPr>
+                <w:rFonts w:ascii="Cambria Math" w:eastAsiaTheme="minorEastAsia" w:hAnsi="Cambria Math"/>
+              </w:rPr>
+              <m:t>-</m:t>
+            </m:r>
+            <m:sSub>
+              <m:sSubPr>
+                <m:ctrlPr>
+                  <w:rPr>
+                    <w:rFonts w:ascii="Cambria Math" w:eastAsiaTheme="minorEastAsia" w:hAnsi="Cambria Math"/>
+                    <w:i/>
+                  </w:rPr>
+                </m:ctrlPr>
+              </m:sSubPr>
+              <m:e>
+                <m:r>
+                  <w:rPr>
+                    <w:rFonts w:ascii="Cambria Math" w:eastAsiaTheme="minorEastAsia" w:hAnsi="Cambria Math"/>
+                  </w:rPr>
+                  <m:t>x</m:t>
+                </m:r>
+              </m:e>
+              <m:sub>
+                <m:r>
+                  <w:rPr>
+                    <w:rFonts w:ascii="Cambria Math" w:eastAsiaTheme="minorEastAsia" w:hAnsi="Cambria Math"/>
+                  </w:rPr>
+                  <m:t>n</m:t>
+                </m:r>
+                <m:r>
+                  <w:rPr>
+                    <w:rFonts w:ascii="Cambria Math" w:eastAsiaTheme="minorEastAsia" w:hAnsi="Cambria Math"/>
+                  </w:rPr>
+                  <m:t>-1</m:t>
+                </m:r>
+              </m:sub>
+            </m:sSub>
+          </m:e>
+        </m:d>
+        <m:r>
+          <w:rPr>
+            <w:rFonts w:ascii="Cambria Math" w:eastAsiaTheme="minorEastAsia" w:hAnsi="Cambria Math"/>
+          </w:rPr>
+          <m:t>+…+</m:t>
+        </m:r>
+        <m:sSup>
+          <m:sSupPr>
+            <m:ctrlPr>
+              <w:rPr>
+                <w:rFonts w:ascii="Cambria Math" w:eastAsiaTheme="minorEastAsia" w:hAnsi="Cambria Math"/>
+                <w:i/>
+              </w:rPr>
+            </m:ctrlPr>
+          </m:sSupPr>
+          <m:e>
+            <m:r>
+              <w:rPr>
+                <w:rFonts w:ascii="Cambria Math" w:eastAsiaTheme="minorEastAsia" w:hAnsi="Cambria Math"/>
+              </w:rPr>
+              <m:t>F</m:t>
+            </m:r>
+          </m:e>
+          <m:sup>
+            <m:r>
+              <w:rPr>
+                <w:rFonts w:ascii="Cambria Math" w:eastAsiaTheme="minorEastAsia" w:hAnsi="Cambria Math"/>
+              </w:rPr>
+              <m:t>'</m:t>
+            </m:r>
+          </m:sup>
+        </m:sSup>
+        <m:d>
+          <m:dPr>
+            <m:ctrlPr>
+              <w:rPr>
+                <w:rFonts w:ascii="Cambria Math" w:eastAsiaTheme="minorEastAsia" w:hAnsi="Cambria Math"/>
+                <w:i/>
+              </w:rPr>
+            </m:ctrlPr>
+          </m:dPr>
+          <m:e>
+            <m:sSub>
+              <m:sSubPr>
+                <m:ctrlPr>
+                  <w:rPr>
+                    <w:rFonts w:ascii="Cambria Math" w:eastAsiaTheme="minorEastAsia" w:hAnsi="Cambria Math"/>
+                    <w:i/>
+                  </w:rPr>
+                </m:ctrlPr>
+              </m:sSubPr>
+              <m:e>
+                <m:r>
+                  <w:rPr>
+                    <w:rFonts w:ascii="Cambria Math" w:eastAsiaTheme="minorEastAsia" w:hAnsi="Cambria Math"/>
+                  </w:rPr>
+                  <m:t>c</m:t>
+                </m:r>
+              </m:e>
+              <m:sub>
+                <m:r>
+                  <w:rPr>
+                    <w:rFonts w:ascii="Cambria Math" w:eastAsiaTheme="minorEastAsia" w:hAnsi="Cambria Math"/>
+                  </w:rPr>
+                  <m:t>2</m:t>
+                </m:r>
+              </m:sub>
+            </m:sSub>
+          </m:e>
+        </m:d>
+        <m:d>
+          <m:dPr>
+            <m:ctrlPr>
+              <w:rPr>
+                <w:rFonts w:ascii="Cambria Math" w:eastAsiaTheme="minorEastAsia" w:hAnsi="Cambria Math"/>
+                <w:i/>
+              </w:rPr>
+            </m:ctrlPr>
+          </m:dPr>
+          <m:e>
+            <m:sSub>
+              <m:sSubPr>
+                <m:ctrlPr>
+                  <w:rPr>
+                    <w:rFonts w:ascii="Cambria Math" w:eastAsiaTheme="minorEastAsia" w:hAnsi="Cambria Math"/>
+                    <w:i/>
+                  </w:rPr>
+                </m:ctrlPr>
+              </m:sSubPr>
+              <m:e>
+                <m:r>
+                  <w:rPr>
+                    <w:rFonts w:ascii="Cambria Math" w:eastAsiaTheme="minorEastAsia" w:hAnsi="Cambria Math"/>
+                  </w:rPr>
+                  <m:t>x</m:t>
+                </m:r>
+              </m:e>
+              <m:sub>
+                <m:r>
+                  <w:rPr>
+                    <w:rFonts w:ascii="Cambria Math" w:eastAsiaTheme="minorEastAsia" w:hAnsi="Cambria Math"/>
+                  </w:rPr>
+                  <m:t>2</m:t>
+                </m:r>
+              </m:sub>
+            </m:sSub>
+            <m:r>
+              <w:rPr>
+                <w:rFonts w:ascii="Cambria Math" w:eastAsiaTheme="minorEastAsia" w:hAnsi="Cambria Math"/>
+              </w:rPr>
+              <m:t>-</m:t>
+            </m:r>
+            <m:sSub>
+              <m:sSubPr>
+                <m:ctrlPr>
+                  <w:rPr>
+                    <w:rFonts w:ascii="Cambria Math" w:eastAsiaTheme="minorEastAsia" w:hAnsi="Cambria Math"/>
+                    <w:i/>
+                  </w:rPr>
+                </m:ctrlPr>
+              </m:sSubPr>
+              <m:e>
+                <m:r>
+                  <w:rPr>
+                    <w:rFonts w:ascii="Cambria Math" w:eastAsiaTheme="minorEastAsia" w:hAnsi="Cambria Math"/>
+                  </w:rPr>
+                  <m:t>x</m:t>
+                </m:r>
+              </m:e>
+              <m:sub>
+                <m:r>
+                  <w:rPr>
+                    <w:rFonts w:ascii="Cambria Math" w:eastAsiaTheme="minorEastAsia" w:hAnsi="Cambria Math"/>
+                  </w:rPr>
+                  <m:t>1</m:t>
+                </m:r>
+              </m:sub>
+            </m:sSub>
+          </m:e>
+        </m:d>
+        <m:r>
+          <w:rPr>
+            <w:rFonts w:ascii="Cambria Math" w:eastAsiaTheme="minorEastAsia" w:hAnsi="Cambria Math"/>
+          </w:rPr>
+          <m:t>+</m:t>
+        </m:r>
+        <m:sSup>
+          <m:sSupPr>
+            <m:ctrlPr>
+              <w:rPr>
+                <w:rFonts w:ascii="Cambria Math" w:eastAsiaTheme="minorEastAsia" w:hAnsi="Cambria Math"/>
+                <w:i/>
+              </w:rPr>
+            </m:ctrlPr>
+          </m:sSupPr>
+          <m:e>
+            <m:r>
+              <w:rPr>
+                <w:rFonts w:ascii="Cambria Math" w:eastAsiaTheme="minorEastAsia" w:hAnsi="Cambria Math"/>
+              </w:rPr>
+              <m:t>F</m:t>
+            </m:r>
+          </m:e>
+          <m:sup>
+            <m:r>
+              <w:rPr>
+                <w:rFonts w:ascii="Cambria Math" w:eastAsiaTheme="minorEastAsia" w:hAnsi="Cambria Math"/>
+              </w:rPr>
+              <m:t>'</m:t>
+            </m:r>
+          </m:sup>
+        </m:sSup>
+        <m:d>
+          <m:dPr>
+            <m:ctrlPr>
+              <w:rPr>
+                <w:rFonts w:ascii="Cambria Math" w:eastAsiaTheme="minorEastAsia" w:hAnsi="Cambria Math"/>
+                <w:i/>
+              </w:rPr>
+            </m:ctrlPr>
+          </m:dPr>
+          <m:e>
+            <m:sSub>
+              <m:sSubPr>
+                <m:ctrlPr>
+                  <w:rPr>
+                    <w:rFonts w:ascii="Cambria Math" w:eastAsiaTheme="minorEastAsia" w:hAnsi="Cambria Math"/>
+                    <w:i/>
+                  </w:rPr>
+                </m:ctrlPr>
+              </m:sSubPr>
+              <m:e>
+                <m:r>
+                  <w:rPr>
+                    <w:rFonts w:ascii="Cambria Math" w:eastAsiaTheme="minorEastAsia" w:hAnsi="Cambria Math"/>
+                  </w:rPr>
+                  <m:t>c</m:t>
+                </m:r>
+              </m:e>
+              <m:sub>
+                <m:r>
+                  <w:rPr>
+                    <w:rFonts w:ascii="Cambria Math" w:eastAsiaTheme="minorEastAsia" w:hAnsi="Cambria Math"/>
+                  </w:rPr>
+                  <m:t>1</m:t>
+                </m:r>
+              </m:sub>
+            </m:sSub>
+          </m:e>
+        </m:d>
+        <m:d>
+          <m:dPr>
+            <m:ctrlPr>
+              <w:rPr>
+                <w:rFonts w:ascii="Cambria Math" w:eastAsiaTheme="minorEastAsia" w:hAnsi="Cambria Math"/>
+                <w:i/>
+              </w:rPr>
+            </m:ctrlPr>
+          </m:dPr>
+          <m:e>
+            <m:sSub>
+              <m:sSubPr>
+                <m:ctrlPr>
+                  <w:rPr>
+                    <w:rFonts w:ascii="Cambria Math" w:eastAsiaTheme="minorEastAsia" w:hAnsi="Cambria Math"/>
+                    <w:i/>
+                  </w:rPr>
+                </m:ctrlPr>
+              </m:sSubPr>
+              <m:e>
+                <m:r>
+                  <w:rPr>
+                    <w:rFonts w:ascii="Cambria Math" w:eastAsiaTheme="minorEastAsia" w:hAnsi="Cambria Math"/>
+                  </w:rPr>
+                  <m:t>x</m:t>
+                </m:r>
+              </m:e>
+              <m:sub>
+                <m:r>
+                  <w:rPr>
+                    <w:rFonts w:ascii="Cambria Math" w:eastAsiaTheme="minorEastAsia" w:hAnsi="Cambria Math"/>
+                  </w:rPr>
+                  <m:t>1</m:t>
+                </m:r>
+              </m:sub>
+            </m:sSub>
+            <m:r>
+              <w:rPr>
+                <w:rFonts w:ascii="Cambria Math" w:eastAsiaTheme="minorEastAsia" w:hAnsi="Cambria Math"/>
+              </w:rPr>
+              <m:t>-</m:t>
+            </m:r>
+            <m:sSub>
+              <m:sSubPr>
+                <m:ctrlPr>
+                  <w:rPr>
+                    <w:rFonts w:ascii="Cambria Math" w:eastAsiaTheme="minorEastAsia" w:hAnsi="Cambria Math"/>
+                    <w:i/>
+                  </w:rPr>
+                </m:ctrlPr>
+              </m:sSubPr>
+              <m:e>
+                <m:r>
+                  <w:rPr>
+                    <w:rFonts w:ascii="Cambria Math" w:eastAsiaTheme="minorEastAsia" w:hAnsi="Cambria Math"/>
+                  </w:rPr>
+                  <m:t>x</m:t>
+                </m:r>
+              </m:e>
+              <m:sub>
+                <m:r>
+                  <w:rPr>
+                    <w:rFonts w:ascii="Cambria Math" w:eastAsiaTheme="minorEastAsia" w:hAnsi="Cambria Math"/>
+                  </w:rPr>
+                  <m:t>0</m:t>
+                </m:r>
+              </m:sub>
+            </m:sSub>
+          </m:e>
+        </m:d>
+        <m:r>
+          <w:rPr>
+            <w:rFonts w:ascii="Cambria Math" w:hAnsi="Cambria Math"/>
+          </w:rPr>
+          <m:t>=</m:t>
+        </m:r>
+        <m:nary>
+          <m:naryPr>
+            <m:chr m:val="∑"/>
+            <m:limLoc m:val="undOvr"/>
+            <m:ctrlPr>
+              <w:rPr>
+                <w:rFonts w:ascii="Cambria Math" w:hAnsi="Cambria Math"/>
+                <w:i/>
+              </w:rPr>
+            </m:ctrlPr>
+          </m:naryPr>
+          <m:sub>
+            <m:r>
+              <w:rPr>
+                <w:rFonts w:ascii="Cambria Math" w:hAnsi="Cambria Math"/>
+              </w:rPr>
+              <m:t>i=1</m:t>
+            </m:r>
+          </m:sub>
+          <m:sup>
+            <m:r>
+              <w:rPr>
+                <w:rFonts w:ascii="Cambria Math" w:hAnsi="Cambria Math"/>
+              </w:rPr>
+              <m:t>n</m:t>
+            </m:r>
+          </m:sup>
+          <m:e>
+            <m:sSup>
+              <m:sSupPr>
+                <m:ctrlPr>
+                  <w:rPr>
+                    <w:rFonts w:ascii="Cambria Math" w:eastAsiaTheme="minorEastAsia" w:hAnsi="Cambria Math"/>
+                    <w:i/>
+                  </w:rPr>
+                </m:ctrlPr>
+              </m:sSupPr>
+              <m:e>
+                <m:r>
+                  <w:rPr>
+                    <w:rFonts w:ascii="Cambria Math" w:eastAsiaTheme="minorEastAsia" w:hAnsi="Cambria Math"/>
+                  </w:rPr>
+                  <m:t>F</m:t>
+                </m:r>
+              </m:e>
+              <m:sup>
+                <m:r>
+                  <w:rPr>
+                    <w:rFonts w:ascii="Cambria Math" w:eastAsiaTheme="minorEastAsia" w:hAnsi="Cambria Math"/>
+                  </w:rPr>
+                  <m:t>'</m:t>
+                </m:r>
+              </m:sup>
+            </m:sSup>
+            <m:d>
+              <m:dPr>
+                <m:ctrlPr>
+                  <w:rPr>
+                    <w:rFonts w:ascii="Cambria Math" w:eastAsiaTheme="minorEastAsia" w:hAnsi="Cambria Math"/>
+                    <w:i/>
+                  </w:rPr>
+                </m:ctrlPr>
+              </m:dPr>
+              <m:e>
+                <m:sSub>
+                  <m:sSubPr>
+                    <m:ctrlPr>
+                      <w:rPr>
+                        <w:rFonts w:ascii="Cambria Math" w:eastAsiaTheme="minorEastAsia" w:hAnsi="Cambria Math"/>
+                        <w:i/>
+                      </w:rPr>
+                    </m:ctrlPr>
+                  </m:sSubPr>
+                  <m:e>
+                    <m:r>
+                      <w:rPr>
+                        <w:rFonts w:ascii="Cambria Math" w:eastAsiaTheme="minorEastAsia" w:hAnsi="Cambria Math"/>
+                      </w:rPr>
+                      <m:t>c</m:t>
+                    </m:r>
+                  </m:e>
+                  <m:sub>
+                    <m:r>
+                      <w:rPr>
+                        <w:rFonts w:ascii="Cambria Math" w:eastAsiaTheme="minorEastAsia" w:hAnsi="Cambria Math"/>
+                      </w:rPr>
+                      <m:t>i</m:t>
+                    </m:r>
+                  </m:sub>
+                </m:sSub>
+              </m:e>
+            </m:d>
+            <m:r>
+              <w:rPr>
+                <w:rFonts w:ascii="Cambria Math" w:eastAsiaTheme="minorEastAsia" w:hAnsi="Cambria Math"/>
+              </w:rPr>
+              <m:t>∆</m:t>
+            </m:r>
+            <m:sSub>
+              <m:sSubPr>
+                <m:ctrlPr>
+                  <w:rPr>
+                    <w:rFonts w:ascii="Cambria Math" w:eastAsiaTheme="minorEastAsia" w:hAnsi="Cambria Math"/>
+                    <w:i/>
+                  </w:rPr>
+                </m:ctrlPr>
+              </m:sSubPr>
+              <m:e>
+                <m:r>
+                  <w:rPr>
+                    <w:rFonts w:ascii="Cambria Math" w:eastAsiaTheme="minorEastAsia" w:hAnsi="Cambria Math"/>
+                  </w:rPr>
+                  <m:t>x</m:t>
+                </m:r>
+              </m:e>
+              <m:sub>
+                <m:r>
+                  <w:rPr>
+                    <w:rFonts w:ascii="Cambria Math" w:eastAsiaTheme="minorEastAsia" w:hAnsi="Cambria Math"/>
+                  </w:rPr>
+                  <m:t>i</m:t>
+                </m:r>
+              </m:sub>
+            </m:sSub>
+          </m:e>
+        </m:nary>
+        <m:r>
+          <w:rPr>
+            <w:rFonts w:ascii="Cambria Math" w:hAnsi="Cambria Math"/>
+          </w:rPr>
+          <m:t>=</m:t>
+        </m:r>
+        <m:nary>
+          <m:naryPr>
+            <m:chr m:val="∑"/>
+            <m:limLoc m:val="undOvr"/>
+            <m:ctrlPr>
+              <w:rPr>
+                <w:rFonts w:ascii="Cambria Math" w:hAnsi="Cambria Math"/>
+                <w:i/>
+              </w:rPr>
+            </m:ctrlPr>
+          </m:naryPr>
+          <m:sub>
+            <m:r>
+              <w:rPr>
+                <w:rFonts w:ascii="Cambria Math" w:hAnsi="Cambria Math"/>
+              </w:rPr>
+              <m:t>i=1</m:t>
+            </m:r>
+          </m:sub>
+          <m:sup>
+            <m:r>
+              <w:rPr>
+                <w:rFonts w:ascii="Cambria Math" w:hAnsi="Cambria Math"/>
+              </w:rPr>
+              <m:t>n</m:t>
+            </m:r>
+          </m:sup>
+          <m:e>
+            <m:r>
+              <w:rPr>
+                <w:rFonts w:ascii="Cambria Math" w:eastAsiaTheme="minorEastAsia" w:hAnsi="Cambria Math"/>
+              </w:rPr>
+              <m:t>f</m:t>
+            </m:r>
+            <m:d>
+              <m:dPr>
+                <m:ctrlPr>
+                  <w:rPr>
+                    <w:rFonts w:ascii="Cambria Math" w:eastAsiaTheme="minorEastAsia" w:hAnsi="Cambria Math"/>
+                    <w:i/>
+                  </w:rPr>
+                </m:ctrlPr>
+              </m:dPr>
+              <m:e>
+                <m:sSub>
+                  <m:sSubPr>
+                    <m:ctrlPr>
+                      <w:rPr>
+                        <w:rFonts w:ascii="Cambria Math" w:eastAsiaTheme="minorEastAsia" w:hAnsi="Cambria Math"/>
+                        <w:i/>
+                      </w:rPr>
+                    </m:ctrlPr>
+                  </m:sSubPr>
+                  <m:e>
+                    <m:r>
+                      <w:rPr>
+                        <w:rFonts w:ascii="Cambria Math" w:eastAsiaTheme="minorEastAsia" w:hAnsi="Cambria Math"/>
+                      </w:rPr>
+                      <m:t>c</m:t>
+                    </m:r>
+                  </m:e>
+                  <m:sub>
+                    <m:r>
+                      <w:rPr>
+                        <w:rFonts w:ascii="Cambria Math" w:eastAsiaTheme="minorEastAsia" w:hAnsi="Cambria Math"/>
+                      </w:rPr>
+                      <m:t>i</m:t>
+                    </m:r>
+                  </m:sub>
+                </m:sSub>
+              </m:e>
+            </m:d>
+            <m:r>
+              <w:rPr>
+                <w:rFonts w:ascii="Cambria Math" w:eastAsiaTheme="minorEastAsia" w:hAnsi="Cambria Math"/>
+              </w:rPr>
+              <m:t>∆</m:t>
+            </m:r>
+            <m:sSub>
+              <m:sSubPr>
+                <m:ctrlPr>
+                  <w:rPr>
+                    <w:rFonts w:ascii="Cambria Math" w:eastAsiaTheme="minorEastAsia" w:hAnsi="Cambria Math"/>
+                    <w:i/>
+                  </w:rPr>
+                </m:ctrlPr>
+              </m:sSubPr>
+              <m:e>
+                <m:r>
+                  <w:rPr>
+                    <w:rFonts w:ascii="Cambria Math" w:eastAsiaTheme="minorEastAsia" w:hAnsi="Cambria Math"/>
+                  </w:rPr>
+                  <m:t>x</m:t>
+                </m:r>
+              </m:e>
+              <m:sub>
+                <m:r>
+                  <w:rPr>
+                    <w:rFonts w:ascii="Cambria Math" w:eastAsiaTheme="minorEastAsia" w:hAnsi="Cambria Math"/>
+                  </w:rPr>
+                  <m:t>i</m:t>
+                </m:r>
+              </m:sub>
+            </m:sSub>
+          </m:e>
+        </m:nary>
+      </m:oMath>
+      <w:r>
+        <w:rPr>
+          <w:rFonts w:eastAsiaTheme="minorEastAsia"/>
+        </w:rPr>
+        <w:t>,</w:t>
+      </w:r>
+      <w:r>
+        <w:rPr>
+          <w:rFonts w:eastAsiaTheme="minorEastAsia"/>
+        </w:rPr>
+        <w:br/>
+        <w:t xml:space="preserve">то есть сумма значений производной функции </w:t>
+      </w:r>
+      <m:oMath>
+        <m:r>
+          <w:rPr>
+            <w:rFonts w:ascii="Cambria Math" w:eastAsiaTheme="minorEastAsia" w:hAnsi="Cambria Math"/>
+          </w:rPr>
+          <m:t>F</m:t>
+        </m:r>
+      </m:oMath>
+      <w:r>
+        <w:rPr>
+          <w:rFonts w:eastAsiaTheme="minorEastAsia"/>
+        </w:rPr>
+        <w:t xml:space="preserve"> </w:t>
+      </w:r>
+      <w:r>
+        <w:rPr>
+          <w:rFonts w:eastAsiaTheme="minorEastAsia"/>
+        </w:rPr>
+        <w:t xml:space="preserve">в точке </w:t>
+      </w:r>
+      <m:oMath>
+        <m:sSub>
+          <m:sSubPr>
+            <m:ctrlPr>
+              <w:rPr>
+                <w:rFonts w:ascii="Cambria Math" w:eastAsiaTheme="minorEastAsia" w:hAnsi="Cambria Math"/>
+                <w:i/>
+              </w:rPr>
+            </m:ctrlPr>
+          </m:sSubPr>
+          <m:e>
+            <m:r>
+              <w:rPr>
+                <w:rFonts w:ascii="Cambria Math" w:eastAsiaTheme="minorEastAsia" w:hAnsi="Cambria Math"/>
+              </w:rPr>
+              <m:t>c</m:t>
+            </m:r>
+          </m:e>
+          <m:sub>
+            <m:r>
+              <w:rPr>
+                <w:rFonts w:ascii="Cambria Math" w:eastAsiaTheme="minorEastAsia" w:hAnsi="Cambria Math"/>
+              </w:rPr>
+              <m:t>i</m:t>
+            </m:r>
+          </m:sub>
+        </m:sSub>
+      </m:oMath>
+      <w:r>
+        <w:rPr>
+          <w:rFonts w:eastAsiaTheme="minorEastAsia"/>
+        </w:rPr>
+        <w:t xml:space="preserve"> </w:t>
+      </w:r>
+      <w:r>
+        <w:rPr>
+          <w:rFonts w:eastAsiaTheme="minorEastAsia"/>
+        </w:rPr>
+        <w:t xml:space="preserve">умноженное на </w:t>
+      </w:r>
+      <m:oMath>
+        <m:r>
+          <w:rPr>
+            <w:rFonts w:ascii="Cambria Math" w:eastAsiaTheme="minorEastAsia" w:hAnsi="Cambria Math"/>
+          </w:rPr>
+          <m:t>∆</m:t>
+        </m:r>
+        <m:sSub>
+          <m:sSubPr>
+            <m:ctrlPr>
+              <w:rPr>
+                <w:rFonts w:ascii="Cambria Math" w:eastAsiaTheme="minorEastAsia" w:hAnsi="Cambria Math"/>
+                <w:i/>
+              </w:rPr>
+            </m:ctrlPr>
+          </m:sSubPr>
+          <m:e>
+            <m:r>
+              <w:rPr>
+                <w:rFonts w:ascii="Cambria Math" w:eastAsiaTheme="minorEastAsia" w:hAnsi="Cambria Math"/>
+              </w:rPr>
+              <m:t>x</m:t>
+            </m:r>
+          </m:e>
+          <m:sub>
+            <m:r>
+              <w:rPr>
+                <w:rFonts w:ascii="Cambria Math" w:eastAsiaTheme="minorEastAsia" w:hAnsi="Cambria Math"/>
+              </w:rPr>
+              <m:t>i</m:t>
+            </m:r>
+          </m:sub>
+        </m:sSub>
+      </m:oMath>
+      <w:r>
+        <w:rPr>
+          <w:rFonts w:eastAsiaTheme="minorEastAsia"/>
+        </w:rPr>
+        <w:t xml:space="preserve">, когда </w:t>
+      </w:r>
+      <m:oMath>
+        <m:r>
+          <w:rPr>
+            <w:rFonts w:ascii="Cambria Math" w:eastAsiaTheme="minorEastAsia" w:hAnsi="Cambria Math"/>
+          </w:rPr>
+          <m:t>i</m:t>
+        </m:r>
+      </m:oMath>
+      <w:r>
+        <w:rPr>
+          <w:rFonts w:eastAsiaTheme="minorEastAsia"/>
+        </w:rPr>
+        <w:t xml:space="preserve"> </w:t>
+      </w:r>
+      <w:r>
+        <w:rPr>
+          <w:rFonts w:eastAsiaTheme="minorEastAsia"/>
+        </w:rPr>
+        <w:t xml:space="preserve">изменяется от </w:t>
+      </w:r>
+      <m:oMath>
+        <m:r>
+          <w:rPr>
+            <w:rFonts w:ascii="Cambria Math" w:eastAsiaTheme="minorEastAsia" w:hAnsi="Cambria Math"/>
+          </w:rPr>
+          <m:t>1</m:t>
+        </m:r>
+      </m:oMath>
+      <w:r>
+        <w:rPr>
+          <w:rFonts w:eastAsiaTheme="minorEastAsia"/>
+        </w:rPr>
+        <w:t xml:space="preserve"> до </w:t>
+      </w:r>
+      <m:oMath>
+        <m:r>
+          <w:rPr>
+            <w:rFonts w:ascii="Cambria Math" w:eastAsiaTheme="minorEastAsia" w:hAnsi="Cambria Math"/>
+          </w:rPr>
+          <m:t>n</m:t>
+        </m:r>
+      </m:oMath>
+      <w:r>
+        <w:rPr>
+          <w:rFonts w:eastAsiaTheme="minorEastAsia"/>
+        </w:rPr>
+        <w:t xml:space="preserve">, и </w:t>
+      </w:r>
+      <m:oMath>
+        <m:sSub>
+          <m:sSubPr>
+            <m:ctrlPr>
+              <w:rPr>
+                <w:rFonts w:ascii="Cambria Math" w:eastAsiaTheme="minorEastAsia" w:hAnsi="Cambria Math"/>
+                <w:i/>
+              </w:rPr>
+            </m:ctrlPr>
+          </m:sSubPr>
+          <m:e>
+            <m:r>
+              <w:rPr>
+                <w:rFonts w:ascii="Cambria Math" w:eastAsiaTheme="minorEastAsia" w:hAnsi="Cambria Math"/>
+              </w:rPr>
+              <m:t>c</m:t>
+            </m:r>
+          </m:e>
+          <m:sub>
+            <m:r>
+              <w:rPr>
+                <w:rFonts w:ascii="Cambria Math" w:eastAsiaTheme="minorEastAsia" w:hAnsi="Cambria Math"/>
+              </w:rPr>
+              <m:t>i</m:t>
+            </m:r>
+          </m:sub>
+        </m:sSub>
+      </m:oMath>
+      <w:r>
+        <w:rPr>
+          <w:rFonts w:eastAsiaTheme="minorEastAsia"/>
+        </w:rPr>
+        <w:t xml:space="preserve"> </w:t>
+      </w:r>
+      <w:r>
+        <w:rPr>
+          <w:rFonts w:eastAsiaTheme="minorEastAsia"/>
+        </w:rPr>
+        <w:t xml:space="preserve">есть некоторая точка интервала </w:t>
+      </w:r>
+      <m:oMath>
+        <m:r>
+          <w:rPr>
+            <w:rFonts w:ascii="Cambria Math" w:eastAsiaTheme="minorEastAsia" w:hAnsi="Cambria Math"/>
+          </w:rPr>
+          <m:t>[</m:t>
+        </m:r>
+        <m:sSub>
+          <m:sSubPr>
+            <m:ctrlPr>
+              <w:rPr>
+                <w:rFonts w:ascii="Cambria Math" w:eastAsiaTheme="minorEastAsia" w:hAnsi="Cambria Math"/>
+                <w:i/>
+              </w:rPr>
+            </m:ctrlPr>
+          </m:sSubPr>
+          <m:e>
+            <m:r>
+              <w:rPr>
+                <w:rFonts w:ascii="Cambria Math" w:eastAsiaTheme="minorEastAsia" w:hAnsi="Cambria Math"/>
+              </w:rPr>
+              <m:t>x</m:t>
+            </m:r>
+          </m:e>
+          <m:sub>
+            <m:r>
+              <w:rPr>
+                <w:rFonts w:ascii="Cambria Math" w:eastAsiaTheme="minorEastAsia" w:hAnsi="Cambria Math"/>
+              </w:rPr>
+              <m:t>i-1</m:t>
+            </m:r>
+          </m:sub>
+        </m:sSub>
+        <m:r>
+          <w:rPr>
+            <w:rFonts w:ascii="Cambria Math" w:eastAsiaTheme="minorEastAsia" w:hAnsi="Cambria Math"/>
+          </w:rPr>
+          <m:t>;</m:t>
+        </m:r>
+        <m:sSub>
+          <m:sSubPr>
+            <m:ctrlPr>
+              <w:rPr>
+                <w:rFonts w:ascii="Cambria Math" w:eastAsiaTheme="minorEastAsia" w:hAnsi="Cambria Math"/>
+                <w:i/>
+              </w:rPr>
+            </m:ctrlPr>
+          </m:sSubPr>
+          <m:e>
+            <m:r>
+              <w:rPr>
+                <w:rFonts w:ascii="Cambria Math" w:eastAsiaTheme="minorEastAsia" w:hAnsi="Cambria Math"/>
+              </w:rPr>
+              <m:t>x</m:t>
+            </m:r>
+          </m:e>
+          <m:sub>
+            <m:r>
+              <w:rPr>
+                <w:rFonts w:ascii="Cambria Math" w:eastAsiaTheme="minorEastAsia" w:hAnsi="Cambria Math"/>
+              </w:rPr>
+              <m:t>i</m:t>
+            </m:r>
+          </m:sub>
+        </m:sSub>
+        <m:r>
+          <w:rPr>
+            <w:rFonts w:ascii="Cambria Math" w:eastAsiaTheme="minorEastAsia" w:hAnsi="Cambria Math"/>
+          </w:rPr>
+          <m:t>]</m:t>
+        </m:r>
+      </m:oMath>
+      <w:r>
+        <w:rPr>
+          <w:rFonts w:eastAsiaTheme="minorEastAsia"/>
+        </w:rPr>
+        <w:t xml:space="preserve">, а </w:t>
+      </w:r>
+      <m:oMath>
+        <m:r>
+          <w:rPr>
+            <w:rFonts w:ascii="Cambria Math" w:eastAsiaTheme="minorEastAsia" w:hAnsi="Cambria Math"/>
+          </w:rPr>
+          <m:t>∆</m:t>
+        </m:r>
+        <m:sSub>
+          <m:sSubPr>
+            <m:ctrlPr>
+              <w:rPr>
+                <w:rFonts w:ascii="Cambria Math" w:eastAsiaTheme="minorEastAsia" w:hAnsi="Cambria Math"/>
+                <w:i/>
+              </w:rPr>
+            </m:ctrlPr>
+          </m:sSubPr>
+          <m:e>
+            <m:r>
+              <w:rPr>
+                <w:rFonts w:ascii="Cambria Math" w:eastAsiaTheme="minorEastAsia" w:hAnsi="Cambria Math"/>
+              </w:rPr>
+              <m:t>x</m:t>
+            </m:r>
+          </m:e>
+          <m:sub>
+            <m:r>
+              <w:rPr>
+                <w:rFonts w:ascii="Cambria Math" w:eastAsiaTheme="minorEastAsia" w:hAnsi="Cambria Math"/>
+              </w:rPr>
+              <m:t>i</m:t>
+            </m:r>
+          </m:sub>
+        </m:sSub>
+      </m:oMath>
+      <w:r>
+        <w:rPr>
+          <w:rFonts w:eastAsiaTheme="minorEastAsia"/>
+        </w:rPr>
+        <w:t xml:space="preserve"> </w:t>
+      </w:r>
+      <w:r>
+        <w:rPr>
+          <w:rFonts w:eastAsiaTheme="minorEastAsia"/>
+        </w:rPr>
+        <w:t>–</w:t>
+      </w:r>
+      <w:r>
+        <w:rPr>
+          <w:rFonts w:eastAsiaTheme="minorEastAsia"/>
+        </w:rPr>
+        <w:t xml:space="preserve"> </w:t>
+      </w:r>
+      <w:r>
+        <w:rPr>
+          <w:rFonts w:eastAsiaTheme="minorEastAsia"/>
+        </w:rPr>
+        <w:t>длина этого интервала</w:t>
+      </w:r>
+      <w:r>
+        <w:rPr>
+          <w:rFonts w:eastAsiaTheme="minorEastAsia"/>
+        </w:rPr>
+        <w:t xml:space="preserve">. А также, т.к. </w:t>
+      </w:r>
+      <m:oMath>
+        <m:r>
+          <w:rPr>
+            <w:rFonts w:ascii="Cambria Math" w:eastAsiaTheme="minorEastAsia" w:hAnsi="Cambria Math"/>
+          </w:rPr>
+          <m:t>F</m:t>
+        </m:r>
+        <m:r>
+          <w:rPr>
+            <w:rFonts w:ascii="Cambria Math" w:eastAsiaTheme="minorEastAsia" w:hAnsi="Cambria Math"/>
+          </w:rPr>
+          <m:t>(</m:t>
+        </m:r>
+        <m:r>
+          <w:rPr>
+            <w:rFonts w:ascii="Cambria Math" w:eastAsiaTheme="minorEastAsia" w:hAnsi="Cambria Math"/>
+            <w:lang w:val="en-US"/>
+          </w:rPr>
+          <m:t>x</m:t>
+        </m:r>
+        <m:r>
+          <w:rPr>
+            <w:rFonts w:ascii="Cambria Math" w:eastAsiaTheme="minorEastAsia" w:hAnsi="Cambria Math"/>
+          </w:rPr>
+          <m:t>)</m:t>
+        </m:r>
+      </m:oMath>
+      <w:r>
+        <w:rPr>
+          <w:rFonts w:eastAsiaTheme="minorEastAsia"/>
+        </w:rPr>
+        <w:t xml:space="preserve"> </w:t>
+      </w:r>
+      <w:r>
+        <w:rPr>
+          <w:rFonts w:eastAsiaTheme="minorEastAsia"/>
+        </w:rPr>
+        <w:t xml:space="preserve">является первообразной для функции </w:t>
+      </w:r>
+      <m:oMath>
+        <m:r>
+          <w:rPr>
+            <w:rFonts w:ascii="Cambria Math" w:eastAsiaTheme="minorEastAsia" w:hAnsi="Cambria Math"/>
+          </w:rPr>
+          <m:t>f(x)</m:t>
+        </m:r>
+      </m:oMath>
+      <w:r>
+        <w:rPr>
+          <w:rFonts w:eastAsiaTheme="minorEastAsia"/>
+        </w:rPr>
+        <w:t xml:space="preserve">, то </w:t>
+      </w:r>
+      <m:oMath>
+        <m:sSup>
+          <m:sSupPr>
+            <m:ctrlPr>
+              <w:rPr>
+                <w:rFonts w:ascii="Cambria Math" w:eastAsiaTheme="minorEastAsia" w:hAnsi="Cambria Math"/>
+                <w:i/>
+              </w:rPr>
+            </m:ctrlPr>
+          </m:sSupPr>
+          <m:e>
+            <m:r>
+              <w:rPr>
+                <w:rFonts w:ascii="Cambria Math" w:eastAsiaTheme="minorEastAsia" w:hAnsi="Cambria Math"/>
+              </w:rPr>
+              <m:t>F</m:t>
+            </m:r>
+          </m:e>
+          <m:sup>
+            <m:r>
+              <w:rPr>
+                <w:rFonts w:ascii="Cambria Math" w:eastAsiaTheme="minorEastAsia" w:hAnsi="Cambria Math"/>
+              </w:rPr>
+              <m:t>'</m:t>
+            </m:r>
+          </m:sup>
+        </m:sSup>
+        <m:d>
+          <m:dPr>
+            <m:ctrlPr>
+              <w:rPr>
+                <w:rFonts w:ascii="Cambria Math" w:eastAsiaTheme="minorEastAsia" w:hAnsi="Cambria Math"/>
+                <w:i/>
+              </w:rPr>
+            </m:ctrlPr>
+          </m:dPr>
+          <m:e>
+            <m:r>
+              <w:rPr>
+                <w:rFonts w:ascii="Cambria Math" w:eastAsiaTheme="minorEastAsia" w:hAnsi="Cambria Math"/>
+              </w:rPr>
+              <m:t>x</m:t>
+            </m:r>
+          </m:e>
+        </m:d>
+        <m:r>
+          <w:rPr>
+            <w:rFonts w:ascii="Cambria Math" w:eastAsiaTheme="minorEastAsia" w:hAnsi="Cambria Math"/>
+          </w:rPr>
+          <m:t>=f(x)</m:t>
+        </m:r>
+      </m:oMath>
+      <w:r>
+        <w:rPr>
+          <w:rFonts w:eastAsiaTheme="minorEastAsia"/>
+        </w:rPr>
+        <w:t>.</w:t>
+      </w:r>
+    </w:p>
+    <w:p>
+      <w:pPr>
+        <w:pStyle w:val="Mine0"/>
+        <w:numPr>
+          <w:ilvl w:val="1"/>
+          <w:numId w:val="2"/>
+        </w:numPr>
+        <w:ind w:left="1134" w:hanging="567"/>
+        <w:rPr>
+          <w:rFonts w:eastAsiaTheme="minorEastAsia"/>
+        </w:rPr>
+      </w:pPr>
+      <w:r>
+        <w:rPr>
+          <w:rFonts w:eastAsiaTheme="minorEastAsia"/>
+        </w:rPr>
+        <w:t xml:space="preserve">Т.к. функция </w:t>
+      </w:r>
+      <m:oMath>
+        <m:r>
+          <w:rPr>
+            <w:rFonts w:ascii="Cambria Math" w:eastAsiaTheme="minorEastAsia" w:hAnsi="Cambria Math"/>
+          </w:rPr>
+          <m:t>y=f(x)</m:t>
+        </m:r>
+      </m:oMath>
+      <w:r>
+        <w:rPr>
+          <w:rFonts w:eastAsiaTheme="minorEastAsia"/>
+        </w:rPr>
+        <w:t xml:space="preserve"> </w:t>
+      </w:r>
+      <w:r>
+        <w:rPr>
+          <w:rFonts w:eastAsiaTheme="minorEastAsia"/>
+        </w:rPr>
+        <w:t xml:space="preserve">непрерывна на отрезке </w:t>
+      </w:r>
+      <m:oMath>
+        <m:r>
+          <w:rPr>
+            <w:rFonts w:ascii="Cambria Math" w:eastAsiaTheme="minorEastAsia" w:hAnsi="Cambria Math"/>
+          </w:rPr>
+          <m:t>[a;b]</m:t>
+        </m:r>
+      </m:oMath>
+      <w:r>
+        <w:rPr>
+          <w:rFonts w:eastAsiaTheme="minorEastAsia"/>
+        </w:rPr>
+        <w:t>, то она интегрируема на этом отрезке, поэтому существует предел интегральной суммы</w:t>
+      </w:r>
+      <w:r>
+        <w:rPr>
+          <w:rFonts w:eastAsiaTheme="minorEastAsia"/>
+        </w:rPr>
+        <w:br/>
+      </w:r>
+      <m:oMath>
+        <m:r>
+          <w:rPr>
+            <w:rFonts w:ascii="Cambria Math" w:hAnsi="Cambria Math"/>
+          </w:rPr>
+          <m:t>F</m:t>
+        </m:r>
+        <m:d>
+          <m:dPr>
+            <m:ctrlPr>
+              <w:rPr>
+                <w:rFonts w:ascii="Cambria Math" w:hAnsi="Cambria Math"/>
+                <w:i/>
+              </w:rPr>
+            </m:ctrlPr>
+          </m:dPr>
+          <m:e>
+            <m:r>
+              <w:rPr>
+                <w:rFonts w:ascii="Cambria Math" w:hAnsi="Cambria Math"/>
+              </w:rPr>
+              <m:t>b</m:t>
+            </m:r>
+          </m:e>
+        </m:d>
+        <m:r>
+          <w:rPr>
+            <w:rFonts w:ascii="Cambria Math" w:hAnsi="Cambria Math"/>
+          </w:rPr>
+          <m:t>-F</m:t>
+        </m:r>
+        <m:d>
+          <m:dPr>
+            <m:ctrlPr>
+              <w:rPr>
+                <w:rFonts w:ascii="Cambria Math" w:hAnsi="Cambria Math"/>
+                <w:i/>
+              </w:rPr>
+            </m:ctrlPr>
+          </m:dPr>
+          <m:e>
+            <m:r>
+              <w:rPr>
+                <w:rFonts w:ascii="Cambria Math" w:hAnsi="Cambria Math"/>
+              </w:rPr>
+              <m:t>a</m:t>
+            </m:r>
+          </m:e>
+        </m:d>
+        <m:r>
+          <w:rPr>
+            <w:rFonts w:ascii="Cambria Math" w:hAnsi="Cambria Math"/>
+          </w:rPr>
+          <m:t>=</m:t>
+        </m:r>
+        <m:func>
+          <m:funcPr>
+            <m:ctrlPr>
+              <w:rPr>
+                <w:rFonts w:ascii="Cambria Math" w:hAnsi="Cambria Math"/>
+                <w:i/>
+              </w:rPr>
+            </m:ctrlPr>
+          </m:funcPr>
+          <m:fName>
+            <m:limLow>
+              <m:limLowPr>
+                <m:ctrlPr>
+                  <w:rPr>
+                    <w:rFonts w:ascii="Cambria Math" w:hAnsi="Cambria Math"/>
+                    <w:i/>
+                  </w:rPr>
+                </m:ctrlPr>
+              </m:limLowPr>
+              <m:e>
+                <m:r>
+                  <m:rPr>
+                    <m:sty m:val="p"/>
+                  </m:rPr>
+                  <w:rPr>
+                    <w:rFonts w:ascii="Cambria Math" w:hAnsi="Cambria Math"/>
+                  </w:rPr>
+                  <m:t>lim</m:t>
+                </m:r>
+              </m:e>
+              <m:lim>
+                <m:r>
+                  <w:rPr>
+                    <w:rFonts w:ascii="Cambria Math" w:hAnsi="Cambria Math"/>
+                  </w:rPr>
+                  <m:t>n→∞</m:t>
+                </m:r>
+              </m:lim>
+            </m:limLow>
+          </m:fName>
+          <m:e>
+            <m:nary>
+              <m:naryPr>
+                <m:chr m:val="∑"/>
+                <m:limLoc m:val="undOvr"/>
+                <m:ctrlPr>
+                  <w:rPr>
+                    <w:rFonts w:ascii="Cambria Math" w:hAnsi="Cambria Math"/>
+                    <w:i/>
+                  </w:rPr>
+                </m:ctrlPr>
+              </m:naryPr>
+              <m:sub>
+                <m:r>
+                  <w:rPr>
+                    <w:rFonts w:ascii="Cambria Math" w:hAnsi="Cambria Math"/>
+                  </w:rPr>
+                  <m:t>i=1</m:t>
+                </m:r>
+              </m:sub>
+              <m:sup>
+                <m:r>
+                  <w:rPr>
+                    <w:rFonts w:ascii="Cambria Math" w:hAnsi="Cambria Math"/>
+                  </w:rPr>
+                  <m:t>n</m:t>
+                </m:r>
+              </m:sup>
+              <m:e>
+                <m:r>
+                  <w:rPr>
+                    <w:rFonts w:ascii="Cambria Math" w:eastAsiaTheme="minorEastAsia" w:hAnsi="Cambria Math"/>
+                  </w:rPr>
+                  <m:t>f</m:t>
+                </m:r>
+                <m:d>
+                  <m:dPr>
+                    <m:ctrlPr>
+                      <w:rPr>
+                        <w:rFonts w:ascii="Cambria Math" w:eastAsiaTheme="minorEastAsia" w:hAnsi="Cambria Math"/>
+                        <w:i/>
+                      </w:rPr>
+                    </m:ctrlPr>
+                  </m:dPr>
+                  <m:e>
+                    <m:sSub>
+                      <m:sSubPr>
+                        <m:ctrlPr>
+                          <w:rPr>
+                            <w:rFonts w:ascii="Cambria Math" w:eastAsiaTheme="minorEastAsia" w:hAnsi="Cambria Math"/>
+                            <w:i/>
+                          </w:rPr>
+                        </m:ctrlPr>
+                      </m:sSubPr>
+                      <m:e>
+                        <m:r>
+                          <w:rPr>
+                            <w:rFonts w:ascii="Cambria Math" w:eastAsiaTheme="minorEastAsia" w:hAnsi="Cambria Math"/>
+                          </w:rPr>
+                          <m:t>c</m:t>
+                        </m:r>
+                      </m:e>
+                      <m:sub>
+                        <m:r>
+                          <w:rPr>
+                            <w:rFonts w:ascii="Cambria Math" w:eastAsiaTheme="minorEastAsia" w:hAnsi="Cambria Math"/>
+                          </w:rPr>
+                          <m:t>i</m:t>
+                        </m:r>
+                      </m:sub>
+                    </m:sSub>
+                  </m:e>
+                </m:d>
+                <m:r>
+                  <w:rPr>
+                    <w:rFonts w:ascii="Cambria Math" w:eastAsiaTheme="minorEastAsia" w:hAnsi="Cambria Math"/>
+                  </w:rPr>
+                  <m:t>∆</m:t>
+                </m:r>
+                <m:sSub>
+                  <m:sSubPr>
+                    <m:ctrlPr>
+                      <w:rPr>
+                        <w:rFonts w:ascii="Cambria Math" w:eastAsiaTheme="minorEastAsia" w:hAnsi="Cambria Math"/>
+                        <w:i/>
+                      </w:rPr>
+                    </m:ctrlPr>
+                  </m:sSubPr>
+                  <m:e>
+                    <m:r>
+                      <w:rPr>
+                        <w:rFonts w:ascii="Cambria Math" w:eastAsiaTheme="minorEastAsia" w:hAnsi="Cambria Math"/>
+                      </w:rPr>
+                      <m:t>x</m:t>
+                    </m:r>
+                  </m:e>
+                  <m:sub>
+                    <m:r>
+                      <w:rPr>
+                        <w:rFonts w:ascii="Cambria Math" w:eastAsiaTheme="minorEastAsia" w:hAnsi="Cambria Math"/>
+                      </w:rPr>
+                      <m:t>i</m:t>
+                    </m:r>
+                  </m:sub>
+                </m:sSub>
+              </m:e>
+            </m:nary>
+          </m:e>
+        </m:func>
+      </m:oMath>
+      <w:r>
+        <w:rPr>
+          <w:rFonts w:eastAsiaTheme="minorEastAsia"/>
+        </w:rPr>
+        <w:t xml:space="preserve">, т.е. </w:t>
+      </w:r>
+      <m:oMath>
+        <m:r>
+          <w:rPr>
+            <w:rFonts w:ascii="Cambria Math" w:hAnsi="Cambria Math"/>
+          </w:rPr>
+          <m:t>F</m:t>
+        </m:r>
+        <m:d>
+          <m:dPr>
+            <m:ctrlPr>
+              <w:rPr>
+                <w:rFonts w:ascii="Cambria Math" w:hAnsi="Cambria Math"/>
+                <w:i/>
+              </w:rPr>
+            </m:ctrlPr>
+          </m:dPr>
+          <m:e>
+            <m:r>
+              <w:rPr>
+                <w:rFonts w:ascii="Cambria Math" w:hAnsi="Cambria Math"/>
+              </w:rPr>
+              <m:t>b</m:t>
+            </m:r>
+          </m:e>
+        </m:d>
+        <m:r>
+          <w:rPr>
+            <w:rFonts w:ascii="Cambria Math" w:hAnsi="Cambria Math"/>
+          </w:rPr>
+          <m:t>-F</m:t>
+        </m:r>
+        <m:d>
+          <m:dPr>
+            <m:ctrlPr>
+              <w:rPr>
+                <w:rFonts w:ascii="Cambria Math" w:hAnsi="Cambria Math"/>
+                <w:i/>
+              </w:rPr>
+            </m:ctrlPr>
+          </m:dPr>
+          <m:e>
+            <m:r>
+              <w:rPr>
+                <w:rFonts w:ascii="Cambria Math" w:hAnsi="Cambria Math"/>
+              </w:rPr>
+              <m:t>a</m:t>
+            </m:r>
+          </m:e>
+        </m:d>
+        <m:r>
+          <w:rPr>
+            <w:rFonts w:ascii="Cambria Math" w:hAnsi="Cambria Math"/>
+          </w:rPr>
+          <m:t>=</m:t>
+        </m:r>
+        <m:nary>
+          <m:naryPr>
+            <m:limLoc m:val="undOvr"/>
+            <m:ctrlPr>
+              <w:rPr>
+                <w:rFonts w:ascii="Cambria Math" w:eastAsiaTheme="minorEastAsia" w:hAnsi="Cambria Math"/>
+                <w:i/>
+              </w:rPr>
+            </m:ctrlPr>
+          </m:naryPr>
+          <m:sub>
+            <m:r>
+              <w:rPr>
+                <w:rFonts w:ascii="Cambria Math" w:eastAsiaTheme="minorEastAsia" w:hAnsi="Cambria Math"/>
+              </w:rPr>
+              <m:t>a</m:t>
+            </m:r>
+          </m:sub>
+          <m:sup>
+            <m:r>
+              <w:rPr>
+                <w:rFonts w:ascii="Cambria Math" w:eastAsiaTheme="minorEastAsia" w:hAnsi="Cambria Math"/>
+              </w:rPr>
+              <m:t>b</m:t>
+            </m:r>
+          </m:sup>
+          <m:e>
+            <m:r>
+              <w:rPr>
+                <w:rFonts w:ascii="Cambria Math" w:eastAsiaTheme="minorEastAsia" w:hAnsi="Cambria Math"/>
+              </w:rPr>
+              <m:t>f</m:t>
+            </m:r>
+            <m:d>
+              <m:dPr>
+                <m:ctrlPr>
+                  <w:rPr>
+                    <w:rFonts w:ascii="Cambria Math" w:eastAsiaTheme="minorEastAsia" w:hAnsi="Cambria Math"/>
+                    <w:i/>
+                  </w:rPr>
+                </m:ctrlPr>
+              </m:dPr>
+              <m:e>
+                <m:r>
+                  <w:rPr>
+                    <w:rFonts w:ascii="Cambria Math" w:eastAsiaTheme="minorEastAsia" w:hAnsi="Cambria Math"/>
+                  </w:rPr>
+                  <m:t>x</m:t>
+                </m:r>
+              </m:e>
+            </m:d>
+            <m:r>
+              <w:rPr>
+                <w:rFonts w:ascii="Cambria Math" w:eastAsiaTheme="minorEastAsia" w:hAnsi="Cambria Math"/>
+              </w:rPr>
+              <m:t>dx</m:t>
+            </m:r>
+          </m:e>
+        </m:nary>
+      </m:oMath>
+      <w:r>
+        <w:rPr>
+          <w:rFonts w:eastAsiaTheme="minorEastAsia"/>
+        </w:rPr>
+        <w:t>.</w:t>
+      </w:r>
+      <w:r>
+        <w:rPr>
+          <w:rFonts w:eastAsiaTheme="minorEastAsia"/>
+        </w:rPr>
+        <w:br w:type="page"/>
+      </w:r>
+    </w:p>
+    <w:p>
+      <w:pPr>
+        <w:pStyle w:val="Mine0"/>
+        <w:numPr>
+          <w:ilvl w:val="0"/>
+          <w:numId w:val="2"/>
+        </w:numPr>
+        <w:ind w:left="567" w:hanging="567"/>
+        <w:rPr>
+          <w:rFonts w:eastAsiaTheme="minorEastAsia"/>
+        </w:rPr>
+      </w:pPr>
+      <w:r>
+        <w:rPr>
+          <w:b/>
+          <w:bCs/>
+        </w:rPr>
+        <w:lastRenderedPageBreak/>
+        <w:t>Формула интегрирования по частям для определенного интеграла (знать практически).</w:t>
+      </w:r>
+      <w:r>
+        <w:br/>
+      </w:r>
+      <w:r>
+        <w:t xml:space="preserve">Если функции </w:t>
+      </w:r>
+      <m:oMath>
+        <m:r>
+          <w:rPr>
+            <w:rFonts w:ascii="Cambria Math" w:hAnsi="Cambria Math"/>
+          </w:rPr>
+          <m:t>u=u</m:t>
+        </m:r>
+        <m:d>
+          <m:dPr>
+            <m:ctrlPr>
+              <w:rPr>
+                <w:rFonts w:ascii="Cambria Math" w:hAnsi="Cambria Math"/>
+                <w:i/>
+              </w:rPr>
+            </m:ctrlPr>
+          </m:dPr>
+          <m:e>
+            <m:r>
+              <w:rPr>
+                <w:rFonts w:ascii="Cambria Math" w:hAnsi="Cambria Math"/>
+              </w:rPr>
+              <m:t>x</m:t>
+            </m:r>
+          </m:e>
+        </m:d>
+      </m:oMath>
+      <w:r>
+        <w:rPr>
+          <w:rFonts w:eastAsiaTheme="minorEastAsia"/>
+        </w:rPr>
+        <w:t xml:space="preserve">, </w:t>
+      </w:r>
+      <m:oMath>
+        <m:r>
+          <w:rPr>
+            <w:rFonts w:ascii="Cambria Math" w:eastAsiaTheme="minorEastAsia" w:hAnsi="Cambria Math"/>
+            <w:lang w:val="en-US"/>
+          </w:rPr>
+          <m:t>v</m:t>
+        </m:r>
+        <m:r>
+          <w:rPr>
+            <w:rFonts w:ascii="Cambria Math" w:eastAsiaTheme="minorEastAsia" w:hAnsi="Cambria Math"/>
+          </w:rPr>
+          <m:t>=</m:t>
+        </m:r>
+        <m:r>
+          <w:rPr>
+            <w:rFonts w:ascii="Cambria Math" w:eastAsiaTheme="minorEastAsia" w:hAnsi="Cambria Math"/>
+            <w:lang w:val="en-US"/>
+          </w:rPr>
+          <m:t>v</m:t>
+        </m:r>
+        <m:d>
+          <m:dPr>
+            <m:ctrlPr>
+              <w:rPr>
+                <w:rFonts w:ascii="Cambria Math" w:eastAsiaTheme="minorEastAsia" w:hAnsi="Cambria Math"/>
+                <w:i/>
+              </w:rPr>
+            </m:ctrlPr>
+          </m:dPr>
+          <m:e>
+            <m:r>
+              <w:rPr>
+                <w:rFonts w:ascii="Cambria Math" w:eastAsiaTheme="minorEastAsia" w:hAnsi="Cambria Math"/>
+                <w:lang w:val="en-US"/>
+              </w:rPr>
+              <m:t>x</m:t>
+            </m:r>
+          </m:e>
+        </m:d>
+      </m:oMath>
+      <w:r>
+        <w:rPr>
+          <w:rFonts w:eastAsiaTheme="minorEastAsia"/>
+        </w:rPr>
+        <w:t xml:space="preserve"> </w:t>
+      </w:r>
+      <w:r>
+        <w:rPr>
+          <w:rFonts w:eastAsiaTheme="minorEastAsia"/>
+        </w:rPr>
+        <w:t xml:space="preserve">непрерывны на отрезке </w:t>
+      </w:r>
+      <m:oMath>
+        <m:d>
+          <m:dPr>
+            <m:begChr m:val="["/>
+            <m:endChr m:val="]"/>
+            <m:ctrlPr>
+              <w:rPr>
+                <w:rFonts w:ascii="Cambria Math" w:eastAsiaTheme="minorEastAsia" w:hAnsi="Cambria Math"/>
+                <w:i/>
+              </w:rPr>
+            </m:ctrlPr>
+          </m:dPr>
+          <m:e>
+            <m:r>
+              <w:rPr>
+                <w:rFonts w:ascii="Cambria Math" w:eastAsiaTheme="minorEastAsia" w:hAnsi="Cambria Math"/>
+              </w:rPr>
+              <m:t>a;b</m:t>
+            </m:r>
+          </m:e>
+        </m:d>
+      </m:oMath>
+      <w:r>
+        <w:rPr>
+          <w:rFonts w:eastAsiaTheme="minorEastAsia"/>
+        </w:rPr>
+        <w:t>, а так же непрерывны на этом отрезке их производные, то справедлива формула интегрирования по частям</w:t>
+      </w:r>
+      <w:r>
+        <w:rPr>
+          <w:rFonts w:eastAsiaTheme="minorEastAsia"/>
+        </w:rPr>
+        <w:t>:</w:t>
+      </w:r>
+      <w:r>
+        <w:rPr>
+          <w:rFonts w:eastAsiaTheme="minorEastAsia"/>
+        </w:rPr>
+        <w:t xml:space="preserve"> </w:t>
+      </w:r>
+      <m:oMath>
+        <m:nary>
+          <m:naryPr>
+            <m:limLoc m:val="undOvr"/>
+            <m:ctrlPr>
+              <w:rPr>
+                <w:rFonts w:ascii="Cambria Math" w:eastAsiaTheme="minorEastAsia" w:hAnsi="Cambria Math"/>
+                <w:i/>
+              </w:rPr>
+            </m:ctrlPr>
+          </m:naryPr>
+          <m:sub>
+            <m:r>
+              <w:rPr>
+                <w:rFonts w:ascii="Cambria Math" w:eastAsiaTheme="minorEastAsia" w:hAnsi="Cambria Math"/>
+              </w:rPr>
+              <m:t>a</m:t>
+            </m:r>
+          </m:sub>
+          <m:sup>
+            <m:r>
+              <w:rPr>
+                <w:rFonts w:ascii="Cambria Math" w:eastAsiaTheme="minorEastAsia" w:hAnsi="Cambria Math"/>
+              </w:rPr>
+              <m:t>b</m:t>
+            </m:r>
+          </m:sup>
+          <m:e>
+            <m:r>
+              <w:rPr>
+                <w:rFonts w:ascii="Cambria Math" w:eastAsiaTheme="minorEastAsia" w:hAnsi="Cambria Math"/>
+              </w:rPr>
+              <m:t>udv</m:t>
+            </m:r>
+          </m:e>
+        </m:nary>
+        <m:r>
+          <w:rPr>
+            <w:rFonts w:ascii="Cambria Math" w:eastAsiaTheme="minorEastAsia" w:hAnsi="Cambria Math"/>
+          </w:rPr>
+          <m:t>=(u</m:t>
+        </m:r>
+        <m:d>
+          <m:dPr>
+            <m:begChr m:val=""/>
+            <m:endChr m:val="|"/>
+            <m:ctrlPr>
+              <w:rPr>
+                <w:rFonts w:ascii="Cambria Math" w:eastAsiaTheme="minorEastAsia" w:hAnsi="Cambria Math"/>
+                <w:i/>
+              </w:rPr>
+            </m:ctrlPr>
+          </m:dPr>
+          <m:e>
+            <m:r>
+              <w:rPr>
+                <w:rFonts w:ascii="Cambria Math" w:eastAsiaTheme="minorEastAsia" w:hAnsi="Cambria Math"/>
+              </w:rPr>
+              <m:t>v)</m:t>
+            </m:r>
+          </m:e>
+        </m:d>
+        <m:f>
+          <m:fPr>
+            <m:type m:val="noBar"/>
+            <m:ctrlPr>
+              <w:rPr>
+                <w:rFonts w:ascii="Cambria Math" w:eastAsiaTheme="minorEastAsia" w:hAnsi="Cambria Math"/>
+                <w:i/>
+              </w:rPr>
+            </m:ctrlPr>
+          </m:fPr>
+          <m:num>
+            <m:r>
+              <w:rPr>
+                <w:rFonts w:ascii="Cambria Math" w:eastAsiaTheme="minorEastAsia" w:hAnsi="Cambria Math"/>
+              </w:rPr>
+              <m:t>b</m:t>
+            </m:r>
+          </m:num>
+          <m:den>
+            <m:r>
+              <w:rPr>
+                <w:rFonts w:ascii="Cambria Math" w:eastAsiaTheme="minorEastAsia" w:hAnsi="Cambria Math"/>
+              </w:rPr>
+              <m:t>a</m:t>
+            </m:r>
+          </m:den>
+        </m:f>
+        <m:r>
+          <w:rPr>
+            <w:rFonts w:ascii="Cambria Math" w:eastAsiaTheme="minorEastAsia" w:hAnsi="Cambria Math"/>
+          </w:rPr>
+          <m:t>-</m:t>
+        </m:r>
+        <m:nary>
+          <m:naryPr>
+            <m:limLoc m:val="undOvr"/>
+            <m:ctrlPr>
+              <w:rPr>
+                <w:rFonts w:ascii="Cambria Math" w:eastAsiaTheme="minorEastAsia" w:hAnsi="Cambria Math"/>
+                <w:i/>
+              </w:rPr>
+            </m:ctrlPr>
+          </m:naryPr>
+          <m:sub>
+            <m:r>
+              <w:rPr>
+                <w:rFonts w:ascii="Cambria Math" w:eastAsiaTheme="minorEastAsia" w:hAnsi="Cambria Math"/>
+              </w:rPr>
+              <m:t>a</m:t>
+            </m:r>
+          </m:sub>
+          <m:sup>
+            <m:r>
+              <w:rPr>
+                <w:rFonts w:ascii="Cambria Math" w:eastAsiaTheme="minorEastAsia" w:hAnsi="Cambria Math"/>
+              </w:rPr>
+              <m:t>b</m:t>
+            </m:r>
+          </m:sup>
+          <m:e>
+            <m:r>
+              <w:rPr>
+                <w:rFonts w:ascii="Cambria Math" w:eastAsiaTheme="minorEastAsia" w:hAnsi="Cambria Math"/>
+              </w:rPr>
+              <m:t>v</m:t>
+            </m:r>
+            <m:r>
+              <w:rPr>
+                <w:rFonts w:ascii="Cambria Math" w:eastAsiaTheme="minorEastAsia" w:hAnsi="Cambria Math"/>
+              </w:rPr>
+              <m:t>d</m:t>
+            </m:r>
+            <m:r>
+              <w:rPr>
+                <w:rFonts w:ascii="Cambria Math" w:eastAsiaTheme="minorEastAsia" w:hAnsi="Cambria Math"/>
+              </w:rPr>
+              <m:t>u</m:t>
+            </m:r>
+          </m:e>
+        </m:nary>
+      </m:oMath>
+      <w:r>
+        <w:rPr>
+          <w:rFonts w:eastAsiaTheme="minorEastAsia"/>
+        </w:rPr>
+        <w:t>.</w:t>
+      </w:r>
+      <w:r>
+        <w:rPr>
+          <w:rFonts w:eastAsiaTheme="minorEastAsia"/>
+        </w:rPr>
+        <w:t xml:space="preserve"> Вывод формулы аналогичен выводу формулы интегрирования по частям для неопределенного интеграла.</w:t>
+      </w:r>
+      <w:r>
+        <w:rPr>
+          <w:rFonts w:eastAsiaTheme="minorEastAsia"/>
+        </w:rPr>
+        <w:br/>
+        <w:t xml:space="preserve">Пример: </w:t>
+      </w:r>
+      <w:r>
+        <w:rPr>
+          <w:rFonts w:eastAsiaTheme="minorEastAsia"/>
+        </w:rPr>
+        <w:br/>
+      </w:r>
+      <m:oMathPara>
+        <m:oMath>
+          <m:nary>
+            <m:naryPr>
+              <m:limLoc m:val="subSup"/>
+              <m:ctrlPr>
+                <w:rPr>
+                  <w:rFonts w:ascii="Cambria Math" w:eastAsiaTheme="minorEastAsia" w:hAnsi="Cambria Math"/>
+                  <w:i/>
+                </w:rPr>
+              </m:ctrlPr>
+            </m:naryPr>
+            <m:sub>
+              <m:r>
+                <w:rPr>
+                  <w:rFonts w:ascii="Cambria Math" w:eastAsiaTheme="minorEastAsia" w:hAnsi="Cambria Math"/>
+                </w:rPr>
+                <m:t>0</m:t>
+              </m:r>
+            </m:sub>
+            <m:sup>
+              <m:r>
+                <w:rPr>
+                  <w:rFonts w:ascii="Cambria Math" w:eastAsiaTheme="minorEastAsia" w:hAnsi="Cambria Math"/>
+                </w:rPr>
+                <m:t>1</m:t>
+              </m:r>
+            </m:sup>
+            <m:e>
+              <m:r>
+                <w:rPr>
+                  <w:rFonts w:ascii="Cambria Math" w:eastAsiaTheme="minorEastAsia" w:hAnsi="Cambria Math"/>
+                </w:rPr>
+                <m:t>x</m:t>
+              </m:r>
+              <m:sSup>
+                <m:sSupPr>
+                  <m:ctrlPr>
+                    <w:rPr>
+                      <w:rFonts w:ascii="Cambria Math" w:eastAsiaTheme="minorEastAsia" w:hAnsi="Cambria Math"/>
+                      <w:i/>
+                    </w:rPr>
+                  </m:ctrlPr>
+                </m:sSupPr>
+                <m:e>
+                  <m:r>
+                    <w:rPr>
+                      <w:rFonts w:ascii="Cambria Math" w:eastAsiaTheme="minorEastAsia" w:hAnsi="Cambria Math"/>
+                    </w:rPr>
+                    <m:t>e</m:t>
+                  </m:r>
+                </m:e>
+                <m:sup>
+                  <m:r>
+                    <w:rPr>
+                      <w:rFonts w:ascii="Cambria Math" w:eastAsiaTheme="minorEastAsia" w:hAnsi="Cambria Math"/>
+                    </w:rPr>
+                    <m:t>x</m:t>
+                  </m:r>
+                </m:sup>
+              </m:sSup>
+              <m:r>
+                <w:rPr>
+                  <w:rFonts w:ascii="Cambria Math" w:eastAsiaTheme="minorEastAsia" w:hAnsi="Cambria Math"/>
+                </w:rPr>
+                <m:t>dx</m:t>
+              </m:r>
+            </m:e>
+          </m:nary>
+          <m:r>
+            <w:rPr>
+              <w:rFonts w:eastAsiaTheme="minorEastAsia"/>
+            </w:rPr>
+            <w:br/>
+          </m:r>
+        </m:oMath>
+        <m:oMath>
+          <m:r>
+            <w:rPr>
+              <w:rFonts w:ascii="Cambria Math" w:eastAsiaTheme="minorEastAsia" w:hAnsi="Cambria Math"/>
+              <w:lang w:val="en-US"/>
+            </w:rPr>
+            <m:t>u</m:t>
+          </m:r>
+          <m:d>
+            <m:dPr>
+              <m:ctrlPr>
+                <w:rPr>
+                  <w:rFonts w:ascii="Cambria Math" w:eastAsiaTheme="minorEastAsia" w:hAnsi="Cambria Math"/>
+                  <w:i/>
+                  <w:lang w:val="en-US"/>
+                </w:rPr>
+              </m:ctrlPr>
+            </m:dPr>
+            <m:e>
+              <m:r>
+                <w:rPr>
+                  <w:rFonts w:ascii="Cambria Math" w:eastAsiaTheme="minorEastAsia" w:hAnsi="Cambria Math"/>
+                  <w:lang w:val="en-US"/>
+                </w:rPr>
+                <m:t>x</m:t>
+              </m:r>
+            </m:e>
+          </m:d>
+          <m:r>
+            <w:rPr>
+              <w:rFonts w:ascii="Cambria Math" w:eastAsiaTheme="minorEastAsia" w:hAnsi="Cambria Math"/>
+            </w:rPr>
+            <m:t>=</m:t>
+          </m:r>
+          <m:r>
+            <w:rPr>
+              <w:rFonts w:ascii="Cambria Math" w:eastAsiaTheme="minorEastAsia" w:hAnsi="Cambria Math"/>
+              <w:lang w:val="en-US"/>
+            </w:rPr>
+            <m:t>x</m:t>
+          </m:r>
+          <m:r>
+            <w:rPr>
+              <w:rFonts w:ascii="Cambria Math" w:eastAsiaTheme="minorEastAsia" w:hAnsi="Cambria Math"/>
+              <w:lang w:val="en-US"/>
+            </w:rPr>
+            <m:t xml:space="preserve">       =&gt;      du=dx</m:t>
+          </m:r>
+          <m:r>
+            <w:rPr>
+              <w:rFonts w:eastAsiaTheme="minorEastAsia"/>
+              <w:lang w:val="en-US"/>
+            </w:rPr>
+            <w:br/>
+          </m:r>
+        </m:oMath>
+        <m:oMath>
+          <m:r>
+            <w:rPr>
+              <w:rFonts w:ascii="Cambria Math" w:hAnsi="Cambria Math"/>
+            </w:rPr>
+            <m:t>dv=</m:t>
+          </m:r>
+          <m:sSup>
+            <m:sSupPr>
+              <m:ctrlPr>
+                <w:rPr>
+                  <w:rFonts w:ascii="Cambria Math" w:hAnsi="Cambria Math"/>
+                  <w:i/>
+                </w:rPr>
+              </m:ctrlPr>
+            </m:sSupPr>
+            <m:e>
+              <m:r>
+                <w:rPr>
+                  <w:rFonts w:ascii="Cambria Math" w:hAnsi="Cambria Math"/>
+                </w:rPr>
+                <m:t>e</m:t>
+              </m:r>
+            </m:e>
+            <m:sup>
+              <m:r>
+                <w:rPr>
+                  <w:rFonts w:ascii="Cambria Math" w:hAnsi="Cambria Math"/>
+                </w:rPr>
+                <m:t>x</m:t>
+              </m:r>
+            </m:sup>
+          </m:sSup>
+          <m:r>
+            <w:rPr>
+              <w:rFonts w:ascii="Cambria Math" w:hAnsi="Cambria Math"/>
+            </w:rPr>
+            <m:t>dx   =&gt;      v</m:t>
+          </m:r>
+          <m:d>
+            <m:dPr>
+              <m:ctrlPr>
+                <w:rPr>
+                  <w:rFonts w:ascii="Cambria Math" w:hAnsi="Cambria Math"/>
+                  <w:i/>
+                </w:rPr>
+              </m:ctrlPr>
+            </m:dPr>
+            <m:e>
+              <m:r>
+                <w:rPr>
+                  <w:rFonts w:ascii="Cambria Math" w:hAnsi="Cambria Math"/>
+                </w:rPr>
+                <m:t>x</m:t>
+              </m:r>
+            </m:e>
+          </m:d>
+          <m:r>
+            <w:rPr>
+              <w:rFonts w:ascii="Cambria Math" w:hAnsi="Cambria Math"/>
+            </w:rPr>
+            <m:t>=</m:t>
+          </m:r>
+          <m:sSup>
+            <m:sSupPr>
+              <m:ctrlPr>
+                <w:rPr>
+                  <w:rFonts w:ascii="Cambria Math" w:hAnsi="Cambria Math"/>
+                  <w:i/>
+                </w:rPr>
+              </m:ctrlPr>
+            </m:sSupPr>
+            <m:e>
+              <m:r>
+                <w:rPr>
+                  <w:rFonts w:ascii="Cambria Math" w:hAnsi="Cambria Math"/>
+                </w:rPr>
+                <m:t>e</m:t>
+              </m:r>
+            </m:e>
+            <m:sup>
+              <m:r>
+                <w:rPr>
+                  <w:rFonts w:ascii="Cambria Math" w:hAnsi="Cambria Math"/>
+                </w:rPr>
+                <m:t>x</m:t>
+              </m:r>
+            </m:sup>
+          </m:sSup>
+          <m:r>
+            <w:rPr>
+              <w:rFonts w:eastAsiaTheme="minorEastAsia"/>
+            </w:rPr>
+            <w:br/>
+          </m:r>
+        </m:oMath>
+        <m:oMath>
+          <m:nary>
+            <m:naryPr>
+              <m:limLoc m:val="subSup"/>
+              <m:ctrlPr>
+                <w:rPr>
+                  <w:rFonts w:ascii="Cambria Math" w:eastAsiaTheme="minorEastAsia" w:hAnsi="Cambria Math"/>
+                  <w:i/>
+                </w:rPr>
+              </m:ctrlPr>
+            </m:naryPr>
+            <m:sub>
+              <m:r>
+                <w:rPr>
+                  <w:rFonts w:ascii="Cambria Math" w:eastAsiaTheme="minorEastAsia" w:hAnsi="Cambria Math"/>
+                </w:rPr>
+                <m:t>0</m:t>
+              </m:r>
+            </m:sub>
+            <m:sup>
+              <m:r>
+                <w:rPr>
+                  <w:rFonts w:ascii="Cambria Math" w:eastAsiaTheme="minorEastAsia" w:hAnsi="Cambria Math"/>
+                </w:rPr>
+                <m:t>1</m:t>
+              </m:r>
+            </m:sup>
+            <m:e>
+              <m:r>
+                <w:rPr>
+                  <w:rFonts w:ascii="Cambria Math" w:eastAsiaTheme="minorEastAsia" w:hAnsi="Cambria Math"/>
+                </w:rPr>
+                <m:t>x</m:t>
+              </m:r>
+              <m:sSup>
+                <m:sSupPr>
+                  <m:ctrlPr>
+                    <w:rPr>
+                      <w:rFonts w:ascii="Cambria Math" w:eastAsiaTheme="minorEastAsia" w:hAnsi="Cambria Math"/>
+                      <w:i/>
+                    </w:rPr>
+                  </m:ctrlPr>
+                </m:sSupPr>
+                <m:e>
+                  <m:r>
+                    <w:rPr>
+                      <w:rFonts w:ascii="Cambria Math" w:eastAsiaTheme="minorEastAsia" w:hAnsi="Cambria Math"/>
+                    </w:rPr>
+                    <m:t>e</m:t>
+                  </m:r>
+                </m:e>
+                <m:sup>
+                  <m:r>
+                    <w:rPr>
+                      <w:rFonts w:ascii="Cambria Math" w:eastAsiaTheme="minorEastAsia" w:hAnsi="Cambria Math"/>
+                    </w:rPr>
+                    <m:t>x</m:t>
+                  </m:r>
+                </m:sup>
+              </m:sSup>
+              <m:r>
+                <w:rPr>
+                  <w:rFonts w:ascii="Cambria Math" w:eastAsiaTheme="minorEastAsia" w:hAnsi="Cambria Math"/>
+                </w:rPr>
+                <m:t>dx</m:t>
+              </m:r>
+            </m:e>
+          </m:nary>
+          <m:r>
+            <w:rPr>
+              <w:rFonts w:ascii="Cambria Math" w:hAnsi="Cambria Math"/>
+            </w:rPr>
+            <m:t>=(x</m:t>
+          </m:r>
+          <m:d>
+            <m:dPr>
+              <m:begChr m:val=""/>
+              <m:endChr m:val="|"/>
+              <m:ctrlPr>
+                <w:rPr>
+                  <w:rFonts w:ascii="Cambria Math" w:hAnsi="Cambria Math"/>
+                  <w:i/>
+                </w:rPr>
+              </m:ctrlPr>
+            </m:dPr>
+            <m:e>
+              <m:sSup>
+                <m:sSupPr>
+                  <m:ctrlPr>
+                    <w:rPr>
+                      <w:rFonts w:ascii="Cambria Math" w:hAnsi="Cambria Math"/>
+                      <w:i/>
+                    </w:rPr>
+                  </m:ctrlPr>
+                </m:sSupPr>
+                <m:e>
+                  <m:r>
+                    <w:rPr>
+                      <w:rFonts w:ascii="Cambria Math" w:hAnsi="Cambria Math"/>
+                    </w:rPr>
+                    <m:t>e</m:t>
+                  </m:r>
+                </m:e>
+                <m:sup>
+                  <m:r>
+                    <w:rPr>
+                      <w:rFonts w:ascii="Cambria Math" w:hAnsi="Cambria Math"/>
+                    </w:rPr>
+                    <m:t>x</m:t>
+                  </m:r>
+                </m:sup>
+              </m:sSup>
+              <m:r>
+                <w:rPr>
+                  <w:rFonts w:ascii="Cambria Math" w:hAnsi="Cambria Math"/>
+                </w:rPr>
+                <m:t>)</m:t>
+              </m:r>
+            </m:e>
+          </m:d>
+          <m:f>
+            <m:fPr>
+              <m:type m:val="noBar"/>
+              <m:ctrlPr>
+                <w:rPr>
+                  <w:rFonts w:ascii="Cambria Math" w:hAnsi="Cambria Math"/>
+                  <w:i/>
+                </w:rPr>
+              </m:ctrlPr>
+            </m:fPr>
+            <m:num>
+              <m:r>
+                <w:rPr>
+                  <w:rFonts w:ascii="Cambria Math" w:hAnsi="Cambria Math"/>
+                </w:rPr>
+                <m:t>1</m:t>
+              </m:r>
+            </m:num>
+            <m:den>
+              <m:r>
+                <w:rPr>
+                  <w:rFonts w:ascii="Cambria Math" w:hAnsi="Cambria Math"/>
+                </w:rPr>
+                <m:t>0</m:t>
+              </m:r>
+            </m:den>
+          </m:f>
+          <m:r>
+            <w:rPr>
+              <w:rFonts w:ascii="Cambria Math" w:hAnsi="Cambria Math"/>
+            </w:rPr>
+            <m:t>-</m:t>
+          </m:r>
+          <m:nary>
+            <m:naryPr>
+              <m:limLoc m:val="subSup"/>
+              <m:ctrlPr>
+                <w:rPr>
+                  <w:rFonts w:ascii="Cambria Math" w:eastAsiaTheme="minorEastAsia" w:hAnsi="Cambria Math"/>
+                  <w:i/>
+                </w:rPr>
+              </m:ctrlPr>
+            </m:naryPr>
+            <m:sub>
+              <m:r>
+                <w:rPr>
+                  <w:rFonts w:ascii="Cambria Math" w:eastAsiaTheme="minorEastAsia" w:hAnsi="Cambria Math"/>
+                </w:rPr>
+                <m:t>0</m:t>
+              </m:r>
+            </m:sub>
+            <m:sup>
+              <m:r>
+                <w:rPr>
+                  <w:rFonts w:ascii="Cambria Math" w:eastAsiaTheme="minorEastAsia" w:hAnsi="Cambria Math"/>
+                </w:rPr>
+                <m:t>1</m:t>
+              </m:r>
+            </m:sup>
+            <m:e>
+              <m:sSup>
+                <m:sSupPr>
+                  <m:ctrlPr>
+                    <w:rPr>
+                      <w:rFonts w:ascii="Cambria Math" w:eastAsiaTheme="minorEastAsia" w:hAnsi="Cambria Math"/>
+                      <w:i/>
+                    </w:rPr>
+                  </m:ctrlPr>
+                </m:sSupPr>
+                <m:e>
+                  <m:r>
+                    <w:rPr>
+                      <w:rFonts w:ascii="Cambria Math" w:eastAsiaTheme="minorEastAsia" w:hAnsi="Cambria Math"/>
+                    </w:rPr>
+                    <m:t>e</m:t>
+                  </m:r>
+                </m:e>
+                <m:sup>
+                  <m:r>
+                    <w:rPr>
+                      <w:rFonts w:ascii="Cambria Math" w:eastAsiaTheme="minorEastAsia" w:hAnsi="Cambria Math"/>
+                    </w:rPr>
+                    <m:t>x</m:t>
+                  </m:r>
+                </m:sup>
+              </m:sSup>
+              <m:r>
+                <w:rPr>
+                  <w:rFonts w:ascii="Cambria Math" w:eastAsiaTheme="minorEastAsia" w:hAnsi="Cambria Math"/>
+                </w:rPr>
+                <m:t>dx</m:t>
+              </m:r>
+            </m:e>
+          </m:nary>
+          <m:r>
+            <w:rPr>
+              <w:rFonts w:ascii="Cambria Math" w:eastAsiaTheme="minorEastAsia" w:hAnsi="Cambria Math"/>
+            </w:rPr>
+            <m:t>=</m:t>
+          </m:r>
+          <m:d>
+            <m:dPr>
+              <m:ctrlPr>
+                <w:rPr>
+                  <w:rFonts w:ascii="Cambria Math" w:eastAsiaTheme="minorEastAsia" w:hAnsi="Cambria Math"/>
+                  <w:i/>
+                </w:rPr>
+              </m:ctrlPr>
+            </m:dPr>
+            <m:e>
+              <m:r>
+                <w:rPr>
+                  <w:rFonts w:ascii="Cambria Math" w:eastAsiaTheme="minorEastAsia" w:hAnsi="Cambria Math"/>
+                </w:rPr>
+                <m:t>1∙</m:t>
+              </m:r>
+              <m:sSup>
+                <m:sSupPr>
+                  <m:ctrlPr>
+                    <w:rPr>
+                      <w:rFonts w:ascii="Cambria Math" w:eastAsiaTheme="minorEastAsia" w:hAnsi="Cambria Math"/>
+                      <w:i/>
+                    </w:rPr>
+                  </m:ctrlPr>
+                </m:sSupPr>
+                <m:e>
+                  <m:r>
+                    <w:rPr>
+                      <w:rFonts w:ascii="Cambria Math" w:eastAsiaTheme="minorEastAsia" w:hAnsi="Cambria Math"/>
+                    </w:rPr>
+                    <m:t>e</m:t>
+                  </m:r>
+                </m:e>
+                <m:sup>
+                  <m:r>
+                    <w:rPr>
+                      <w:rFonts w:ascii="Cambria Math" w:eastAsiaTheme="minorEastAsia" w:hAnsi="Cambria Math"/>
+                    </w:rPr>
+                    <m:t>1</m:t>
+                  </m:r>
+                </m:sup>
+              </m:sSup>
+              <m:r>
+                <w:rPr>
+                  <w:rFonts w:ascii="Cambria Math" w:eastAsiaTheme="minorEastAsia" w:hAnsi="Cambria Math"/>
+                </w:rPr>
+                <m:t>-0∙</m:t>
+              </m:r>
+              <m:sSup>
+                <m:sSupPr>
+                  <m:ctrlPr>
+                    <w:rPr>
+                      <w:rFonts w:ascii="Cambria Math" w:eastAsiaTheme="minorEastAsia" w:hAnsi="Cambria Math"/>
+                      <w:i/>
+                    </w:rPr>
+                  </m:ctrlPr>
+                </m:sSupPr>
+                <m:e>
+                  <m:r>
+                    <w:rPr>
+                      <w:rFonts w:ascii="Cambria Math" w:eastAsiaTheme="minorEastAsia" w:hAnsi="Cambria Math"/>
+                    </w:rPr>
+                    <m:t>e</m:t>
+                  </m:r>
+                </m:e>
+                <m:sup>
+                  <m:r>
+                    <w:rPr>
+                      <w:rFonts w:ascii="Cambria Math" w:eastAsiaTheme="minorEastAsia" w:hAnsi="Cambria Math"/>
+                    </w:rPr>
+                    <m:t>0</m:t>
+                  </m:r>
+                </m:sup>
+              </m:sSup>
+            </m:e>
+          </m:d>
+          <m:r>
+            <w:rPr>
+              <w:rFonts w:ascii="Cambria Math" w:eastAsiaTheme="minorEastAsia" w:hAnsi="Cambria Math"/>
+            </w:rPr>
+            <m:t>-</m:t>
+          </m:r>
+          <m:d>
+            <m:dPr>
+              <m:begChr m:val=""/>
+              <m:endChr m:val="|"/>
+              <m:ctrlPr>
+                <w:rPr>
+                  <w:rFonts w:ascii="Cambria Math" w:eastAsiaTheme="minorEastAsia" w:hAnsi="Cambria Math"/>
+                  <w:i/>
+                </w:rPr>
+              </m:ctrlPr>
+            </m:dPr>
+            <m:e>
+              <m:sSup>
+                <m:sSupPr>
+                  <m:ctrlPr>
+                    <w:rPr>
+                      <w:rFonts w:ascii="Cambria Math" w:eastAsiaTheme="minorEastAsia" w:hAnsi="Cambria Math"/>
+                      <w:i/>
+                    </w:rPr>
+                  </m:ctrlPr>
+                </m:sSupPr>
+                <m:e>
+                  <m:r>
+                    <w:rPr>
+                      <w:rFonts w:ascii="Cambria Math" w:eastAsiaTheme="minorEastAsia" w:hAnsi="Cambria Math"/>
+                    </w:rPr>
+                    <m:t>e</m:t>
+                  </m:r>
+                </m:e>
+                <m:sup>
+                  <m:r>
+                    <w:rPr>
+                      <w:rFonts w:ascii="Cambria Math" w:eastAsiaTheme="minorEastAsia" w:hAnsi="Cambria Math"/>
+                    </w:rPr>
+                    <m:t>x</m:t>
+                  </m:r>
+                </m:sup>
+              </m:sSup>
+            </m:e>
+          </m:d>
+          <m:f>
+            <m:fPr>
+              <m:type m:val="noBar"/>
+              <m:ctrlPr>
+                <w:rPr>
+                  <w:rFonts w:ascii="Cambria Math" w:eastAsiaTheme="minorEastAsia" w:hAnsi="Cambria Math"/>
+                  <w:i/>
+                </w:rPr>
+              </m:ctrlPr>
+            </m:fPr>
+            <m:num>
+              <m:r>
+                <w:rPr>
+                  <w:rFonts w:ascii="Cambria Math" w:eastAsiaTheme="minorEastAsia" w:hAnsi="Cambria Math"/>
+                </w:rPr>
+                <m:t>1</m:t>
+              </m:r>
+            </m:num>
+            <m:den>
+              <m:r>
+                <w:rPr>
+                  <w:rFonts w:ascii="Cambria Math" w:eastAsiaTheme="minorEastAsia" w:hAnsi="Cambria Math"/>
+                </w:rPr>
+                <m:t>0</m:t>
+              </m:r>
+            </m:den>
+          </m:f>
+          <m:r>
+            <w:rPr>
+              <w:rFonts w:ascii="Cambria Math" w:eastAsiaTheme="minorEastAsia" w:hAnsi="Cambria Math"/>
+            </w:rPr>
+            <m:t>=e-</m:t>
+          </m:r>
+          <m:d>
+            <m:dPr>
+              <m:ctrlPr>
+                <w:rPr>
+                  <w:rFonts w:ascii="Cambria Math" w:eastAsiaTheme="minorEastAsia" w:hAnsi="Cambria Math"/>
+                  <w:i/>
+                </w:rPr>
+              </m:ctrlPr>
+            </m:dPr>
+            <m:e>
+              <m:sSup>
+                <m:sSupPr>
+                  <m:ctrlPr>
+                    <w:rPr>
+                      <w:rFonts w:ascii="Cambria Math" w:eastAsiaTheme="minorEastAsia" w:hAnsi="Cambria Math"/>
+                      <w:i/>
+                    </w:rPr>
+                  </m:ctrlPr>
+                </m:sSupPr>
+                <m:e>
+                  <m:r>
+                    <w:rPr>
+                      <w:rFonts w:ascii="Cambria Math" w:eastAsiaTheme="minorEastAsia" w:hAnsi="Cambria Math"/>
+                    </w:rPr>
+                    <m:t>e</m:t>
+                  </m:r>
+                </m:e>
+                <m:sup>
+                  <m:r>
+                    <w:rPr>
+                      <w:rFonts w:ascii="Cambria Math" w:eastAsiaTheme="minorEastAsia" w:hAnsi="Cambria Math"/>
+                    </w:rPr>
+                    <m:t>1</m:t>
+                  </m:r>
+                </m:sup>
+              </m:sSup>
+              <m:r>
+                <w:rPr>
+                  <w:rFonts w:ascii="Cambria Math" w:eastAsiaTheme="minorEastAsia" w:hAnsi="Cambria Math"/>
+                </w:rPr>
+                <m:t>-</m:t>
+              </m:r>
+              <m:sSup>
+                <m:sSupPr>
+                  <m:ctrlPr>
+                    <w:rPr>
+                      <w:rFonts w:ascii="Cambria Math" w:eastAsiaTheme="minorEastAsia" w:hAnsi="Cambria Math"/>
+                      <w:i/>
+                    </w:rPr>
+                  </m:ctrlPr>
+                </m:sSupPr>
+                <m:e>
+                  <m:r>
+                    <w:rPr>
+                      <w:rFonts w:ascii="Cambria Math" w:eastAsiaTheme="minorEastAsia" w:hAnsi="Cambria Math"/>
+                    </w:rPr>
+                    <m:t>e</m:t>
+                  </m:r>
+                </m:e>
+                <m:sup>
+                  <m:r>
+                    <w:rPr>
+                      <w:rFonts w:ascii="Cambria Math" w:eastAsiaTheme="minorEastAsia" w:hAnsi="Cambria Math"/>
+                    </w:rPr>
+                    <m:t>0</m:t>
+                  </m:r>
+                </m:sup>
+              </m:sSup>
+            </m:e>
+          </m:d>
+          <m:r>
+            <w:rPr>
+              <w:rFonts w:ascii="Cambria Math" w:eastAsiaTheme="minorEastAsia" w:hAnsi="Cambria Math"/>
+            </w:rPr>
+            <m:t>=</m:t>
+          </m:r>
+          <m:r>
+            <w:rPr>
+              <w:rFonts w:ascii="Cambria Math" w:eastAsiaTheme="minorEastAsia" w:hAnsi="Cambria Math"/>
+            </w:rPr>
+            <w:br/>
+          </m:r>
+        </m:oMath>
+      </m:oMathPara>
+      <m:oMath>
+        <m:r>
+          <w:rPr>
+            <w:rFonts w:ascii="Cambria Math" w:hAnsi="Cambria Math"/>
+          </w:rPr>
+          <m:t>=e-e+1=1</m:t>
+        </m:r>
+      </m:oMath>
+      <w:r>
+        <w:rPr>
+          <w:rFonts w:eastAsiaTheme="minorEastAsia"/>
+        </w:rPr>
+        <w:br w:type="page"/>
+      </w:r>
+    </w:p>
+    <w:p>
+      <w:pPr>
+        <w:pStyle w:val="Mine0"/>
+        <w:numPr>
+          <w:ilvl w:val="0"/>
+          <w:numId w:val="2"/>
+        </w:numPr>
+        <w:ind w:left="567" w:hanging="567"/>
+      </w:pPr>
+      <w:r>
+        <w:rPr>
+          <w:b/>
+          <w:bCs/>
+        </w:rPr>
+        <w:lastRenderedPageBreak/>
+        <w:t>Несобственные интегралы (определение, геометрический смысл).</w:t>
+      </w:r>
+      <w:r>
+        <w:br/>
+        <w:t xml:space="preserve">При рассмотрении определенного интеграла мы считали, что отрезок интегрирования конечен, а подынтегральная функция непрерывна или кусочно непрерывна, но во всяком случае ограничена, такие интегралы называются собственными по определению. Если хотя бы одно з этих двух условий не выполнено, то отрезок </w:t>
+      </w:r>
+      <m:oMath>
+        <m:r>
+          <w:rPr>
+            <w:rFonts w:ascii="Cambria Math" w:hAnsi="Cambria Math"/>
+          </w:rPr>
+          <m:t>[a;b]</m:t>
+        </m:r>
+      </m:oMath>
+      <w:r>
+        <w:rPr>
+          <w:rFonts w:eastAsiaTheme="minorEastAsia"/>
+        </w:rPr>
+        <w:t xml:space="preserve"> бесконечен или функция </w:t>
+      </w:r>
+      <m:oMath>
+        <m:r>
+          <w:rPr>
+            <w:rFonts w:ascii="Cambria Math" w:eastAsiaTheme="minorEastAsia" w:hAnsi="Cambria Math"/>
+          </w:rPr>
+          <m:t>f(x)</m:t>
+        </m:r>
+      </m:oMath>
+      <w:r>
+        <w:rPr>
+          <w:rFonts w:eastAsiaTheme="minorEastAsia"/>
+        </w:rPr>
+        <w:t xml:space="preserve"> имеет на отрезке </w:t>
+      </w:r>
+      <m:oMath>
+        <m:r>
+          <w:rPr>
+            <w:rFonts w:ascii="Cambria Math" w:eastAsiaTheme="minorEastAsia" w:hAnsi="Cambria Math"/>
+          </w:rPr>
+          <m:t>[a;b]</m:t>
+        </m:r>
+      </m:oMath>
+      <w:r>
+        <w:rPr>
+          <w:rFonts w:eastAsiaTheme="minorEastAsia"/>
+        </w:rPr>
+        <w:t xml:space="preserve"> </w:t>
+      </w:r>
+      <w:r>
+        <w:rPr>
+          <w:rFonts w:eastAsiaTheme="minorEastAsia"/>
+        </w:rPr>
+        <w:t>разрыв второго рода и по этой причине не является ограниченной, то интеграл называется несобственным. Собственный интеграл всегда имеет определенное значение, в отличии от него несобственные интегралы не все имеют такое значение.</w:t>
+      </w:r>
+      <w:r>
+        <w:rPr>
+          <w:rFonts w:eastAsiaTheme="minorEastAsia"/>
+        </w:rPr>
+        <w:br/>
+      </w:r>
+      <w:r>
+        <w:br/>
+      </w:r>
+      <w:r>
+        <w:rPr>
+          <w:u w:val="single"/>
+        </w:rPr>
+        <w:t>Несобственный интеграл с бесконечным верхним пределом.</w:t>
+      </w:r>
+      <w:r>
+        <w:br/>
+        <w:t xml:space="preserve">Пусть функция </w:t>
+      </w:r>
+      <m:oMath>
+        <m:r>
+          <w:rPr>
+            <w:rFonts w:ascii="Cambria Math" w:hAnsi="Cambria Math"/>
+          </w:rPr>
+          <m:t>y=f(x)</m:t>
+        </m:r>
+      </m:oMath>
+      <w:r>
+        <w:rPr>
+          <w:rFonts w:eastAsiaTheme="minorEastAsia"/>
+        </w:rPr>
+        <w:t xml:space="preserve"> </w:t>
+      </w:r>
+      <w:r>
+        <w:rPr>
+          <w:rFonts w:eastAsiaTheme="minorEastAsia"/>
+        </w:rPr>
+        <w:t xml:space="preserve">непрерывна на </w:t>
+      </w:r>
+      <w:r>
+        <w:rPr>
+          <w:rFonts w:eastAsiaTheme="minorEastAsia"/>
+        </w:rPr>
+        <w:t>полу</w:t>
+      </w:r>
+      <w:r>
+        <w:rPr>
+          <w:rFonts w:eastAsiaTheme="minorEastAsia"/>
+        </w:rPr>
+        <w:t xml:space="preserve">интервале </w:t>
+      </w:r>
+      <m:oMath>
+        <m:r>
+          <w:rPr>
+            <w:rFonts w:ascii="Cambria Math" w:eastAsiaTheme="minorEastAsia" w:hAnsi="Cambria Math"/>
+          </w:rPr>
+          <m:t>[a;+∞)</m:t>
+        </m:r>
+      </m:oMath>
+      <w:r>
+        <w:rPr>
+          <w:rFonts w:eastAsiaTheme="minorEastAsia"/>
+        </w:rPr>
+        <w:t xml:space="preserve">, причем </w:t>
+      </w:r>
+      <m:oMath>
+        <m:r>
+          <w:rPr>
+            <w:rFonts w:ascii="Cambria Math" w:eastAsiaTheme="minorEastAsia" w:hAnsi="Cambria Math"/>
+          </w:rPr>
+          <m:t>f</m:t>
+        </m:r>
+        <m:d>
+          <m:dPr>
+            <m:ctrlPr>
+              <w:rPr>
+                <w:rFonts w:ascii="Cambria Math" w:eastAsiaTheme="minorEastAsia" w:hAnsi="Cambria Math"/>
+                <w:i/>
+              </w:rPr>
+            </m:ctrlPr>
+          </m:dPr>
+          <m:e>
+            <m:r>
+              <w:rPr>
+                <w:rFonts w:ascii="Cambria Math" w:eastAsiaTheme="minorEastAsia" w:hAnsi="Cambria Math"/>
+              </w:rPr>
+              <m:t>x</m:t>
+            </m:r>
+          </m:e>
+        </m:d>
+        <m:r>
+          <w:rPr>
+            <w:rFonts w:ascii="Cambria Math" w:eastAsiaTheme="minorEastAsia" w:hAnsi="Cambria Math"/>
+          </w:rPr>
+          <m:t>≥0</m:t>
+        </m:r>
+      </m:oMath>
+      <w:r>
+        <w:rPr>
+          <w:rFonts w:eastAsiaTheme="minorEastAsia"/>
+        </w:rPr>
+        <w:t>. Тогда с одной стороны интеграл от этой функции можно трактовать, как площадь бесконечной криволинейной трапеции, а с другой – он не может быть вычислен по определению</w:t>
+      </w:r>
+      <w:r>
+        <w:rPr>
+          <w:rFonts w:eastAsiaTheme="minorEastAsia"/>
+        </w:rPr>
+        <w:t>, п</w:t>
+      </w:r>
+      <w:r>
+        <w:rPr>
+          <w:rFonts w:eastAsiaTheme="minorEastAsia"/>
+        </w:rPr>
+        <w:t>ри любом конечном разбие</w:t>
+      </w:r>
+      <w:r>
+        <w:rPr>
+          <w:rFonts w:eastAsiaTheme="minorEastAsia"/>
+        </w:rPr>
+        <w:t xml:space="preserve">нии последний из отрезков имеет бесконечную длину, а значит в подынтегральной сумме нельзя перейти к пределу при максимальном значении </w:t>
+      </w:r>
+      <m:oMath>
+        <m:r>
+          <w:rPr>
+            <w:rFonts w:ascii="Cambria Math" w:eastAsiaTheme="minorEastAsia" w:hAnsi="Cambria Math"/>
+          </w:rPr>
+          <m:t>∆</m:t>
+        </m:r>
+        <m:sSub>
+          <m:sSubPr>
+            <m:ctrlPr>
+              <w:rPr>
+                <w:rFonts w:ascii="Cambria Math" w:eastAsiaTheme="minorEastAsia" w:hAnsi="Cambria Math"/>
+                <w:i/>
+                <w:lang w:val="en-US"/>
+              </w:rPr>
+            </m:ctrlPr>
+          </m:sSubPr>
+          <m:e>
+            <m:r>
+              <w:rPr>
+                <w:rFonts w:ascii="Cambria Math" w:eastAsiaTheme="minorEastAsia" w:hAnsi="Cambria Math"/>
+                <w:lang w:val="en-US"/>
+              </w:rPr>
+              <m:t>x</m:t>
+            </m:r>
+          </m:e>
+          <m:sub>
+            <m:r>
+              <w:rPr>
+                <w:rFonts w:ascii="Cambria Math" w:eastAsiaTheme="minorEastAsia" w:hAnsi="Cambria Math"/>
+                <w:lang w:val="en-US"/>
+              </w:rPr>
+              <m:t>i</m:t>
+            </m:r>
+          </m:sub>
+        </m:sSub>
+      </m:oMath>
+      <w:r>
+        <w:rPr>
+          <w:rFonts w:eastAsiaTheme="minorEastAsia"/>
+        </w:rPr>
+        <w:t xml:space="preserve"> </w:t>
+      </w:r>
+      <w:r>
+        <w:rPr>
+          <w:rFonts w:eastAsiaTheme="minorEastAsia"/>
+        </w:rPr>
+        <w:t xml:space="preserve">стремящимся к нулю. Но функция </w:t>
+      </w:r>
+      <m:oMath>
+        <m:r>
+          <w:rPr>
+            <w:rFonts w:ascii="Cambria Math" w:eastAsiaTheme="minorEastAsia" w:hAnsi="Cambria Math"/>
+          </w:rPr>
+          <m:t>y=f(x)</m:t>
+        </m:r>
+      </m:oMath>
+      <w:r>
+        <w:rPr>
+          <w:rFonts w:eastAsiaTheme="minorEastAsia"/>
+        </w:rPr>
+        <w:t xml:space="preserve"> </w:t>
+      </w:r>
+      <w:r>
+        <w:rPr>
+          <w:rFonts w:eastAsiaTheme="minorEastAsia"/>
+        </w:rPr>
+        <w:t xml:space="preserve">непрерывна на полуинтервале </w:t>
+      </w:r>
+      <m:oMath>
+        <m:r>
+          <w:rPr>
+            <w:rFonts w:ascii="Cambria Math" w:eastAsiaTheme="minorEastAsia" w:hAnsi="Cambria Math"/>
+          </w:rPr>
+          <m:t>[a;+∞)</m:t>
+        </m:r>
+      </m:oMath>
+      <w:r>
+        <w:rPr>
+          <w:rFonts w:eastAsiaTheme="minorEastAsia"/>
+        </w:rPr>
+        <w:t xml:space="preserve">, поэтому для любого </w:t>
+      </w:r>
+      <m:oMath>
+        <m:r>
+          <w:rPr>
+            <w:rFonts w:ascii="Cambria Math" w:eastAsiaTheme="minorEastAsia" w:hAnsi="Cambria Math"/>
+          </w:rPr>
+          <m:t>b</m:t>
+        </m:r>
+      </m:oMath>
+      <w:r>
+        <w:rPr>
+          <w:rFonts w:eastAsiaTheme="minorEastAsia"/>
+        </w:rPr>
+        <w:t xml:space="preserve"> </w:t>
+      </w:r>
+      <w:r>
+        <w:rPr>
+          <w:rFonts w:eastAsiaTheme="minorEastAsia"/>
+        </w:rPr>
+        <w:t xml:space="preserve">принадлежащего этому интервалу существует интеграл </w:t>
+      </w:r>
+      <m:oMath>
+        <m:nary>
+          <m:naryPr>
+            <m:limLoc m:val="subSup"/>
+            <m:ctrlPr>
+              <w:rPr>
+                <w:rFonts w:ascii="Cambria Math" w:eastAsiaTheme="minorEastAsia" w:hAnsi="Cambria Math"/>
+                <w:i/>
+              </w:rPr>
+            </m:ctrlPr>
+          </m:naryPr>
+          <m:sub>
+            <m:r>
+              <w:rPr>
+                <w:rFonts w:ascii="Cambria Math" w:eastAsiaTheme="minorEastAsia" w:hAnsi="Cambria Math"/>
+              </w:rPr>
+              <m:t>a</m:t>
+            </m:r>
+          </m:sub>
+          <m:sup>
+            <m:r>
+              <w:rPr>
+                <w:rFonts w:ascii="Cambria Math" w:eastAsiaTheme="minorEastAsia" w:hAnsi="Cambria Math"/>
+              </w:rPr>
+              <m:t>b</m:t>
+            </m:r>
+          </m:sup>
+          <m:e>
+            <m:r>
+              <w:rPr>
+                <w:rFonts w:ascii="Cambria Math" w:eastAsiaTheme="minorEastAsia" w:hAnsi="Cambria Math"/>
+              </w:rPr>
+              <m:t>f</m:t>
+            </m:r>
+            <m:d>
+              <m:dPr>
+                <m:ctrlPr>
+                  <w:rPr>
+                    <w:rFonts w:ascii="Cambria Math" w:eastAsiaTheme="minorEastAsia" w:hAnsi="Cambria Math"/>
+                    <w:i/>
+                  </w:rPr>
+                </m:ctrlPr>
+              </m:dPr>
+              <m:e>
+                <m:r>
+                  <w:rPr>
+                    <w:rFonts w:ascii="Cambria Math" w:eastAsiaTheme="minorEastAsia" w:hAnsi="Cambria Math"/>
+                  </w:rPr>
+                  <m:t>x</m:t>
+                </m:r>
+              </m:e>
+            </m:d>
+            <m:r>
+              <w:rPr>
+                <w:rFonts w:ascii="Cambria Math" w:eastAsiaTheme="minorEastAsia" w:hAnsi="Cambria Math"/>
+              </w:rPr>
+              <m:t>dx</m:t>
+            </m:r>
+          </m:e>
+        </m:nary>
+      </m:oMath>
+      <w:r>
+        <w:rPr>
+          <w:rFonts w:eastAsiaTheme="minorEastAsia"/>
+        </w:rPr>
+        <w:t xml:space="preserve"> – этот интеграл численно равен площади криволинейной трапеции, изображенной на рисунке</w:t>
+      </w:r>
+      <w:r>
+        <w:rPr>
+          <w:rFonts w:eastAsiaTheme="minorEastAsia"/>
+        </w:rPr>
+        <w:br/>
+      </w:r>
+      <w:r>
+        <w:rPr>
+          <w:noProof/>
+        </w:rPr>
+        <w:drawing>
+          <wp:inline distT="0" distB="0" distL="0" distR="0" wp14:anchorId="28070D5D" wp14:editId="782A5096">
+            <wp:extent cx="1600200" cy="1326524"/>
+            <wp:effectExtent l="0" t="0" r="0" b="6985"/>
+            <wp:docPr id="1" name="Рисунок 1"/>
+            <wp:cNvGraphicFramePr>
+              <a:graphicFrameLocks xmlns:a="http://schemas.openxmlformats.org/drawingml/2006/main" noChangeAspect="1"/>
+            </wp:cNvGraphicFramePr>
+            <a:graphic xmlns:a="http://schemas.openxmlformats.org/drawingml/2006/main">
+              <a:graphicData uri="http://schemas.openxmlformats.org/drawingml/2006/picture">
+                <pic:pic xmlns:pic="http://schemas.openxmlformats.org/drawingml/2006/picture">
+                  <pic:nvPicPr>
+                    <pic:cNvPr id="0" name="Picture 1"/>
+                    <pic:cNvPicPr>
+                      <a:picLocks noChangeAspect="1" noChangeArrowheads="1"/>
+                    </pic:cNvPicPr>
+                  </pic:nvPicPr>
+                  <pic:blipFill>
+                    <a:blip r:embed="rId7" cstate="print">
+                      <a:extLst>
+                        <a:ext uri="{28A0092B-C50C-407E-A947-70E740481C1C}">
+                          <a14:useLocalDpi xmlns:a14="http://schemas.microsoft.com/office/drawing/2010/main" val="0"/>
+                        </a:ext>
+                      </a:extLst>
+                    </a:blip>
+                    <a:srcRect/>
+                    <a:stretch>
+                      <a:fillRect/>
+                    </a:stretch>
+                  </pic:blipFill>
+                  <pic:spPr bwMode="auto">
+                    <a:xfrm>
+                      <a:off x="0" y="0"/>
+                      <a:ext cx="1611448" cy="1335848"/>
+                    </a:xfrm>
+                    <a:prstGeom prst="rect">
+                      <a:avLst/>
+                    </a:prstGeom>
+                    <a:noFill/>
+                    <a:ln>
+                      <a:noFill/>
+                    </a:ln>
+                  </pic:spPr>
+                </pic:pic>
+              </a:graphicData>
+            </a:graphic>
+          </wp:inline>
+        </w:drawing>
+      </w:r>
+      <w:r>
+        <w:rPr>
+          <w:rFonts w:eastAsiaTheme="minorEastAsia"/>
+        </w:rPr>
+        <w:t xml:space="preserve">, а величина его зависит от </w:t>
+      </w:r>
+      <m:oMath>
+        <m:r>
+          <w:rPr>
+            <w:rFonts w:ascii="Cambria Math" w:eastAsiaTheme="minorEastAsia" w:hAnsi="Cambria Math"/>
+          </w:rPr>
+          <m:t>b</m:t>
+        </m:r>
+      </m:oMath>
+      <w:r>
+        <w:rPr>
+          <w:rFonts w:eastAsiaTheme="minorEastAsia"/>
+        </w:rPr>
+        <w:t xml:space="preserve">. Если сдвигать </w:t>
+      </w:r>
+      <m:oMath>
+        <m:r>
+          <w:rPr>
+            <w:rFonts w:ascii="Cambria Math" w:eastAsiaTheme="minorEastAsia" w:hAnsi="Cambria Math"/>
+          </w:rPr>
+          <m:t>b</m:t>
+        </m:r>
+      </m:oMath>
+      <w:r>
+        <w:rPr>
+          <w:rFonts w:eastAsiaTheme="minorEastAsia"/>
+        </w:rPr>
+        <w:t xml:space="preserve"> </w:t>
+      </w:r>
+      <w:r>
+        <w:rPr>
+          <w:rFonts w:eastAsiaTheme="minorEastAsia"/>
+        </w:rPr>
+        <w:t xml:space="preserve">неограниченно вправо, то величина будет меняться, либо неограниченно возрастая, либо оставаясь ограниченной. Если существует конечный </w:t>
+      </w:r>
+      <m:oMath>
+        <m:func>
+          <m:funcPr>
+            <m:ctrlPr>
+              <w:rPr>
+                <w:rFonts w:ascii="Cambria Math" w:eastAsiaTheme="minorEastAsia" w:hAnsi="Cambria Math"/>
+                <w:i/>
+              </w:rPr>
+            </m:ctrlPr>
+          </m:funcPr>
+          <m:fName>
+            <m:limLow>
+              <m:limLowPr>
+                <m:ctrlPr>
+                  <w:rPr>
+                    <w:rFonts w:ascii="Cambria Math" w:eastAsiaTheme="minorEastAsia" w:hAnsi="Cambria Math"/>
+                    <w:i/>
+                  </w:rPr>
+                </m:ctrlPr>
+              </m:limLowPr>
+              <m:e>
+                <m:r>
+                  <m:rPr>
+                    <m:sty m:val="p"/>
+                  </m:rPr>
+                  <w:rPr>
+                    <w:rFonts w:ascii="Cambria Math" w:hAnsi="Cambria Math"/>
+                  </w:rPr>
+                  <m:t>lim</m:t>
+                </m:r>
+              </m:e>
+              <m:lim>
+                <m:r>
+                  <w:rPr>
+                    <w:rFonts w:ascii="Cambria Math" w:eastAsiaTheme="minorEastAsia" w:hAnsi="Cambria Math"/>
+                  </w:rPr>
+                  <m:t>b→+∞</m:t>
+                </m:r>
+              </m:lim>
+            </m:limLow>
+          </m:fName>
+          <m:e>
+            <m:nary>
+              <m:naryPr>
+                <m:limLoc m:val="subSup"/>
+                <m:ctrlPr>
+                  <w:rPr>
+                    <w:rFonts w:ascii="Cambria Math" w:eastAsiaTheme="minorEastAsia" w:hAnsi="Cambria Math"/>
+                    <w:i/>
+                  </w:rPr>
+                </m:ctrlPr>
+              </m:naryPr>
+              <m:sub>
+                <m:r>
+                  <w:rPr>
+                    <w:rFonts w:ascii="Cambria Math" w:eastAsiaTheme="minorEastAsia" w:hAnsi="Cambria Math"/>
+                  </w:rPr>
+                  <m:t>a</m:t>
+                </m:r>
+              </m:sub>
+              <m:sup>
+                <m:r>
+                  <w:rPr>
+                    <w:rFonts w:ascii="Cambria Math" w:eastAsiaTheme="minorEastAsia" w:hAnsi="Cambria Math"/>
+                  </w:rPr>
+                  <m:t>b</m:t>
+                </m:r>
+              </m:sup>
+              <m:e>
+                <m:r>
+                  <w:rPr>
+                    <w:rFonts w:ascii="Cambria Math" w:eastAsiaTheme="minorEastAsia" w:hAnsi="Cambria Math"/>
+                  </w:rPr>
+                  <m:t>f</m:t>
+                </m:r>
+                <m:d>
+                  <m:dPr>
+                    <m:ctrlPr>
+                      <w:rPr>
+                        <w:rFonts w:ascii="Cambria Math" w:eastAsiaTheme="minorEastAsia" w:hAnsi="Cambria Math"/>
+                        <w:i/>
+                      </w:rPr>
+                    </m:ctrlPr>
+                  </m:dPr>
+                  <m:e>
+                    <m:r>
+                      <w:rPr>
+                        <w:rFonts w:ascii="Cambria Math" w:eastAsiaTheme="minorEastAsia" w:hAnsi="Cambria Math"/>
+                      </w:rPr>
+                      <m:t>x</m:t>
+                    </m:r>
+                  </m:e>
+                </m:d>
+                <m:r>
+                  <w:rPr>
+                    <w:rFonts w:ascii="Cambria Math" w:eastAsiaTheme="minorEastAsia" w:hAnsi="Cambria Math"/>
+                  </w:rPr>
+                  <m:t>dx</m:t>
+                </m:r>
+              </m:e>
+            </m:nary>
+          </m:e>
+        </m:func>
+      </m:oMath>
+      <w:r>
+        <w:rPr>
+          <w:rFonts w:eastAsiaTheme="minorEastAsia"/>
+        </w:rPr>
+        <w:t xml:space="preserve">, то он называется несобственным интегралом первого рода (с бесконечным верхним пределом) от функции </w:t>
+      </w:r>
+      <m:oMath>
+        <m:r>
+          <w:rPr>
+            <w:rFonts w:ascii="Cambria Math" w:eastAsiaTheme="minorEastAsia" w:hAnsi="Cambria Math"/>
+          </w:rPr>
+          <m:t>y=f(x)</m:t>
+        </m:r>
+      </m:oMath>
+      <w:r>
+        <w:rPr>
+          <w:rFonts w:eastAsiaTheme="minorEastAsia"/>
+        </w:rPr>
+        <w:t xml:space="preserve">. В этом случае говорят, что несобственный интеграл сходится и полагают </w:t>
+      </w:r>
+      <m:oMath>
+        <m:func>
+          <m:funcPr>
+            <m:ctrlPr>
+              <w:rPr>
+                <w:rFonts w:ascii="Cambria Math" w:eastAsiaTheme="minorEastAsia" w:hAnsi="Cambria Math"/>
+                <w:i/>
+              </w:rPr>
+            </m:ctrlPr>
+          </m:funcPr>
+          <m:fName>
+            <m:nary>
+              <m:naryPr>
+                <m:limLoc m:val="subSup"/>
+                <m:ctrlPr>
+                  <w:rPr>
+                    <w:rFonts w:ascii="Cambria Math" w:eastAsiaTheme="minorEastAsia" w:hAnsi="Cambria Math"/>
+                    <w:i/>
+                  </w:rPr>
+                </m:ctrlPr>
+              </m:naryPr>
+              <m:sub>
+                <m:r>
+                  <w:rPr>
+                    <w:rFonts w:ascii="Cambria Math" w:eastAsiaTheme="minorEastAsia" w:hAnsi="Cambria Math"/>
+                  </w:rPr>
+                  <m:t>a</m:t>
+                </m:r>
+              </m:sub>
+              <m:sup>
+                <m:r>
+                  <w:rPr>
+                    <w:rFonts w:ascii="Cambria Math" w:eastAsiaTheme="minorEastAsia" w:hAnsi="Cambria Math"/>
+                  </w:rPr>
+                  <m:t>+∞</m:t>
+                </m:r>
+              </m:sup>
+              <m:e>
+                <m:r>
+                  <w:rPr>
+                    <w:rFonts w:ascii="Cambria Math" w:eastAsiaTheme="minorEastAsia" w:hAnsi="Cambria Math"/>
+                  </w:rPr>
+                  <m:t>f</m:t>
+                </m:r>
+                <m:d>
+                  <m:dPr>
+                    <m:ctrlPr>
+                      <w:rPr>
+                        <w:rFonts w:ascii="Cambria Math" w:eastAsiaTheme="minorEastAsia" w:hAnsi="Cambria Math"/>
+                        <w:i/>
+                      </w:rPr>
+                    </m:ctrlPr>
+                  </m:dPr>
+                  <m:e>
+                    <m:r>
+                      <w:rPr>
+                        <w:rFonts w:ascii="Cambria Math" w:eastAsiaTheme="minorEastAsia" w:hAnsi="Cambria Math"/>
+                      </w:rPr>
+                      <m:t>x</m:t>
+                    </m:r>
+                  </m:e>
+                </m:d>
+                <m:r>
+                  <w:rPr>
+                    <w:rFonts w:ascii="Cambria Math" w:eastAsiaTheme="minorEastAsia" w:hAnsi="Cambria Math"/>
+                  </w:rPr>
+                  <m:t>dx</m:t>
+                </m:r>
+              </m:e>
+            </m:nary>
+            <m:r>
+              <w:rPr>
+                <w:rFonts w:ascii="Cambria Math" w:eastAsiaTheme="minorEastAsia" w:hAnsi="Cambria Math"/>
+              </w:rPr>
+              <m:t>=</m:t>
+            </m:r>
+            <m:limLow>
+              <m:limLowPr>
+                <m:ctrlPr>
+                  <w:rPr>
+                    <w:rFonts w:ascii="Cambria Math" w:eastAsiaTheme="minorEastAsia" w:hAnsi="Cambria Math"/>
+                    <w:i/>
+                  </w:rPr>
+                </m:ctrlPr>
+              </m:limLowPr>
+              <m:e>
+                <m:r>
+                  <m:rPr>
+                    <m:sty m:val="p"/>
+                  </m:rPr>
+                  <w:rPr>
+                    <w:rFonts w:ascii="Cambria Math" w:hAnsi="Cambria Math"/>
+                  </w:rPr>
+                  <m:t>lim</m:t>
+                </m:r>
+              </m:e>
+              <m:lim>
+                <m:r>
+                  <w:rPr>
+                    <w:rFonts w:ascii="Cambria Math" w:eastAsiaTheme="minorEastAsia" w:hAnsi="Cambria Math"/>
+                  </w:rPr>
+                  <m:t>b→</m:t>
+                </m:r>
+                <m:r>
+                  <w:rPr>
+                    <w:rFonts w:ascii="Cambria Math" w:eastAsiaTheme="minorEastAsia" w:hAnsi="Cambria Math"/>
+                  </w:rPr>
+                  <m:t>+</m:t>
+                </m:r>
+                <m:r>
+                  <w:rPr>
+                    <w:rFonts w:ascii="Cambria Math" w:eastAsiaTheme="minorEastAsia" w:hAnsi="Cambria Math"/>
+                  </w:rPr>
+                  <m:t>∞</m:t>
+                </m:r>
+              </m:lim>
+            </m:limLow>
+          </m:fName>
+          <m:e>
+            <m:nary>
+              <m:naryPr>
+                <m:limLoc m:val="subSup"/>
+                <m:ctrlPr>
+                  <w:rPr>
+                    <w:rFonts w:ascii="Cambria Math" w:eastAsiaTheme="minorEastAsia" w:hAnsi="Cambria Math"/>
+                    <w:i/>
+                  </w:rPr>
+                </m:ctrlPr>
+              </m:naryPr>
+              <m:sub>
+                <m:r>
+                  <w:rPr>
+                    <w:rFonts w:ascii="Cambria Math" w:eastAsiaTheme="minorEastAsia" w:hAnsi="Cambria Math"/>
+                  </w:rPr>
+                  <m:t>a</m:t>
+                </m:r>
+              </m:sub>
+              <m:sup>
+                <m:r>
+                  <w:rPr>
+                    <w:rFonts w:ascii="Cambria Math" w:eastAsiaTheme="minorEastAsia" w:hAnsi="Cambria Math"/>
+                  </w:rPr>
+                  <m:t>b</m:t>
+                </m:r>
+              </m:sup>
+              <m:e>
+                <m:r>
+                  <w:rPr>
+                    <w:rFonts w:ascii="Cambria Math" w:eastAsiaTheme="minorEastAsia" w:hAnsi="Cambria Math"/>
+                  </w:rPr>
+                  <m:t>f</m:t>
+                </m:r>
+                <m:d>
+                  <m:dPr>
+                    <m:ctrlPr>
+                      <w:rPr>
+                        <w:rFonts w:ascii="Cambria Math" w:eastAsiaTheme="minorEastAsia" w:hAnsi="Cambria Math"/>
+                        <w:i/>
+                      </w:rPr>
+                    </m:ctrlPr>
+                  </m:dPr>
+                  <m:e>
+                    <m:r>
+                      <w:rPr>
+                        <w:rFonts w:ascii="Cambria Math" w:eastAsiaTheme="minorEastAsia" w:hAnsi="Cambria Math"/>
+                      </w:rPr>
+                      <m:t>x</m:t>
+                    </m:r>
+                  </m:e>
+                </m:d>
+                <m:r>
+                  <w:rPr>
+                    <w:rFonts w:ascii="Cambria Math" w:eastAsiaTheme="minorEastAsia" w:hAnsi="Cambria Math"/>
+                  </w:rPr>
+                  <m:t>dx</m:t>
+                </m:r>
+              </m:e>
+            </m:nary>
+          </m:e>
+        </m:func>
+      </m:oMath>
+      <w:r>
+        <w:rPr>
+          <w:rFonts w:eastAsiaTheme="minorEastAsia"/>
+        </w:rPr>
+        <w:t xml:space="preserve">. </w:t>
+      </w:r>
+      <w:r>
+        <w:rPr>
+          <w:rFonts w:eastAsiaTheme="minorEastAsia"/>
+        </w:rPr>
+        <w:t xml:space="preserve">Если этот предел не существует или равен </w:t>
+      </w:r>
+      <w:r>
+        <w:rPr>
+          <w:rFonts w:eastAsiaTheme="minorEastAsia"/>
+        </w:rPr>
+        <w:lastRenderedPageBreak/>
+        <w:t>бесконечности, то несобственный интеграл называется расходящимся. В этом случае определенного численного значения ему не приписывается.</w:t>
+      </w:r>
+      <w:r>
+        <w:rPr>
+          <w:rFonts w:eastAsiaTheme="minorEastAsia"/>
+        </w:rPr>
+        <w:br/>
+      </w:r>
+      <w:r>
+        <w:rPr>
+          <w:rFonts w:eastAsiaTheme="minorEastAsia"/>
+        </w:rPr>
+        <w:br/>
+      </w:r>
+      <w:r>
+        <w:rPr>
+          <w:rFonts w:eastAsiaTheme="minorEastAsia"/>
+          <w:u w:val="single"/>
+        </w:rPr>
+        <w:t>Несобственный интеграл с бесконечным нижним пределом.</w:t>
+      </w:r>
+      <w:r>
+        <w:rPr>
+          <w:rFonts w:eastAsiaTheme="minorEastAsia"/>
+        </w:rPr>
+        <w:br/>
+        <w:t xml:space="preserve">Аналогично определяется несобственный интеграл на интервале </w:t>
+      </w:r>
+      <m:oMath>
+        <m:r>
+          <w:rPr>
+            <w:rFonts w:ascii="Cambria Math" w:eastAsiaTheme="minorEastAsia" w:hAnsi="Cambria Math"/>
+          </w:rPr>
+          <m:t>(-∞;b]</m:t>
+        </m:r>
+      </m:oMath>
+      <w:r>
+        <w:rPr>
+          <w:rFonts w:eastAsiaTheme="minorEastAsia"/>
+          <w:lang w:val="en-US"/>
+        </w:rPr>
+        <w:t>:</w:t>
+      </w:r>
+      <w:r>
+        <w:rPr>
+          <w:rFonts w:eastAsiaTheme="minorEastAsia"/>
+          <w:lang w:val="en-US"/>
+        </w:rPr>
+        <w:br/>
+      </w:r>
+      <m:oMathPara>
+        <m:oMath>
+          <m:func>
+            <m:funcPr>
+              <m:ctrlPr>
+                <w:rPr>
+                  <w:rFonts w:ascii="Cambria Math" w:eastAsiaTheme="minorEastAsia" w:hAnsi="Cambria Math"/>
+                  <w:i/>
+                </w:rPr>
+              </m:ctrlPr>
+            </m:funcPr>
+            <m:fName>
+              <m:nary>
+                <m:naryPr>
+                  <m:limLoc m:val="subSup"/>
+                  <m:ctrlPr>
+                    <w:rPr>
+                      <w:rFonts w:ascii="Cambria Math" w:eastAsiaTheme="minorEastAsia" w:hAnsi="Cambria Math"/>
+                      <w:i/>
+                    </w:rPr>
+                  </m:ctrlPr>
+                </m:naryPr>
+                <m:sub>
+                  <m:r>
+                    <w:rPr>
+                      <w:rFonts w:ascii="Cambria Math" w:eastAsiaTheme="minorEastAsia" w:hAnsi="Cambria Math"/>
+                    </w:rPr>
+                    <m:t>-∞</m:t>
+                  </m:r>
+                </m:sub>
+                <m:sup>
+                  <m:r>
+                    <w:rPr>
+                      <w:rFonts w:ascii="Cambria Math" w:eastAsiaTheme="minorEastAsia" w:hAnsi="Cambria Math"/>
+                    </w:rPr>
+                    <m:t>b</m:t>
+                  </m:r>
+                </m:sup>
+                <m:e>
+                  <m:r>
+                    <w:rPr>
+                      <w:rFonts w:ascii="Cambria Math" w:eastAsiaTheme="minorEastAsia" w:hAnsi="Cambria Math"/>
+                    </w:rPr>
+                    <m:t>f</m:t>
+                  </m:r>
+                  <m:d>
+                    <m:dPr>
+                      <m:ctrlPr>
+                        <w:rPr>
+                          <w:rFonts w:ascii="Cambria Math" w:eastAsiaTheme="minorEastAsia" w:hAnsi="Cambria Math"/>
+                          <w:i/>
+                        </w:rPr>
+                      </m:ctrlPr>
+                    </m:dPr>
+                    <m:e>
+                      <m:r>
+                        <w:rPr>
+                          <w:rFonts w:ascii="Cambria Math" w:eastAsiaTheme="minorEastAsia" w:hAnsi="Cambria Math"/>
+                        </w:rPr>
+                        <m:t>x</m:t>
+                      </m:r>
+                    </m:e>
+                  </m:d>
+                  <m:r>
+                    <w:rPr>
+                      <w:rFonts w:ascii="Cambria Math" w:eastAsiaTheme="minorEastAsia" w:hAnsi="Cambria Math"/>
+                    </w:rPr>
+                    <m:t>dx</m:t>
+                  </m:r>
+                </m:e>
+              </m:nary>
+              <m:r>
+                <w:rPr>
+                  <w:rFonts w:ascii="Cambria Math" w:eastAsiaTheme="minorEastAsia" w:hAnsi="Cambria Math"/>
+                </w:rPr>
+                <m:t>=</m:t>
+              </m:r>
+              <m:limLow>
+                <m:limLowPr>
+                  <m:ctrlPr>
+                    <w:rPr>
+                      <w:rFonts w:ascii="Cambria Math" w:eastAsiaTheme="minorEastAsia" w:hAnsi="Cambria Math"/>
+                      <w:i/>
+                    </w:rPr>
+                  </m:ctrlPr>
+                </m:limLowPr>
+                <m:e>
+                  <m:r>
+                    <m:rPr>
+                      <m:sty m:val="p"/>
+                    </m:rPr>
+                    <w:rPr>
+                      <w:rFonts w:ascii="Cambria Math" w:hAnsi="Cambria Math"/>
+                    </w:rPr>
+                    <m:t>lim</m:t>
+                  </m:r>
+                </m:e>
+                <m:lim>
+                  <m:r>
+                    <w:rPr>
+                      <w:rFonts w:ascii="Cambria Math" w:eastAsiaTheme="minorEastAsia" w:hAnsi="Cambria Math"/>
+                    </w:rPr>
+                    <m:t>a</m:t>
+                  </m:r>
+                  <m:r>
+                    <w:rPr>
+                      <w:rFonts w:ascii="Cambria Math" w:eastAsiaTheme="minorEastAsia" w:hAnsi="Cambria Math"/>
+                    </w:rPr>
+                    <m:t>→</m:t>
+                  </m:r>
+                  <m:r>
+                    <w:rPr>
+                      <w:rFonts w:ascii="Cambria Math" w:eastAsiaTheme="minorEastAsia" w:hAnsi="Cambria Math"/>
+                    </w:rPr>
+                    <m:t>-</m:t>
+                  </m:r>
+                  <m:r>
+                    <w:rPr>
+                      <w:rFonts w:ascii="Cambria Math" w:eastAsiaTheme="minorEastAsia" w:hAnsi="Cambria Math"/>
+                    </w:rPr>
+                    <m:t>∞</m:t>
+                  </m:r>
+                </m:lim>
+              </m:limLow>
+            </m:fName>
+            <m:e>
+              <m:nary>
+                <m:naryPr>
+                  <m:limLoc m:val="subSup"/>
+                  <m:ctrlPr>
+                    <w:rPr>
+                      <w:rFonts w:ascii="Cambria Math" w:eastAsiaTheme="minorEastAsia" w:hAnsi="Cambria Math"/>
+                      <w:i/>
+                    </w:rPr>
+                  </m:ctrlPr>
+                </m:naryPr>
+                <m:sub>
+                  <m:r>
+                    <w:rPr>
+                      <w:rFonts w:ascii="Cambria Math" w:eastAsiaTheme="minorEastAsia" w:hAnsi="Cambria Math"/>
+                    </w:rPr>
+                    <m:t>a</m:t>
+                  </m:r>
+                </m:sub>
+                <m:sup>
+                  <m:r>
+                    <w:rPr>
+                      <w:rFonts w:ascii="Cambria Math" w:eastAsiaTheme="minorEastAsia" w:hAnsi="Cambria Math"/>
+                    </w:rPr>
+                    <m:t>b</m:t>
+                  </m:r>
+                </m:sup>
+                <m:e>
+                  <m:r>
+                    <w:rPr>
+                      <w:rFonts w:ascii="Cambria Math" w:eastAsiaTheme="minorEastAsia" w:hAnsi="Cambria Math"/>
+                    </w:rPr>
+                    <m:t>f</m:t>
+                  </m:r>
+                  <m:d>
+                    <m:dPr>
+                      <m:ctrlPr>
+                        <w:rPr>
+                          <w:rFonts w:ascii="Cambria Math" w:eastAsiaTheme="minorEastAsia" w:hAnsi="Cambria Math"/>
+                          <w:i/>
+                        </w:rPr>
+                      </m:ctrlPr>
+                    </m:dPr>
+                    <m:e>
+                      <m:r>
+                        <w:rPr>
+                          <w:rFonts w:ascii="Cambria Math" w:eastAsiaTheme="minorEastAsia" w:hAnsi="Cambria Math"/>
+                        </w:rPr>
+                        <m:t>x</m:t>
+                      </m:r>
+                    </m:e>
+                  </m:d>
+                  <m:r>
+                    <w:rPr>
+                      <w:rFonts w:ascii="Cambria Math" w:eastAsiaTheme="minorEastAsia" w:hAnsi="Cambria Math"/>
+                    </w:rPr>
+                    <m:t>dx</m:t>
+                  </m:r>
+                </m:e>
+              </m:nary>
+            </m:e>
+          </m:func>
+        </m:oMath>
+      </m:oMathPara>
     </w:p>
     <w:sectPr>
       <w:pgSz w:w="11909" w:h="16834"/>
@@ -6639,6 +10250,7 @@
   <w:style w:type="character" w:default="1" w:styleId="a0">
     <w:name w:val="Default Paragraph Font"/>
     <w:uiPriority w:val="1"/>
+    <w:semiHidden/>
     <w:unhideWhenUsed/>
   </w:style>
   <w:style w:type="table" w:default="1" w:styleId="a1">

</xml_diff>

<commit_message>
feat: update math exam
</commit_message>
<xml_diff>
--- a/Математика/ответы.docx
+++ b/Математика/ответы.docx
@@ -1,6 +1,6 @@
 
 <file path=word/document.xml><?xml version="1.0" encoding="utf-8"?>
-<w:document xmlns:wpc="http://schemas.microsoft.com/office/word/2010/wordprocessingCanvas" xmlns:cx="http://schemas.microsoft.com/office/drawing/2014/chartex" xmlns:cx1="http://schemas.microsoft.com/office/drawing/2015/9/8/chartex" xmlns:cx2="http://schemas.microsoft.com/office/drawing/2015/10/21/chartex" xmlns:cx3="http://schemas.microsoft.com/office/drawing/2016/5/9/chartex" xmlns:cx4="http://schemas.microsoft.com/office/drawing/2016/5/10/chartex" xmlns:cx5="http://schemas.microsoft.com/office/drawing/2016/5/11/chartex" xmlns:cx6="http://schemas.microsoft.com/office/drawing/2016/5/12/chartex" xmlns:cx7="http://schemas.microsoft.com/office/drawing/2016/5/13/chartex" xmlns:cx8="http://schemas.microsoft.com/office/drawing/2016/5/14/chartex" xmlns:mc="http://schemas.openxmlformats.org/markup-compatibility/2006" xmlns:aink="http://schemas.microsoft.com/office/drawing/2016/ink" xmlns:am3d="http://schemas.microsoft.com/office/drawing/2017/model3d" xmlns:o="urn:schemas-microsoft-com:office:office" xmlns:r="http://schemas.openxmlformats.org/officeDocument/2006/relationships" xmlns:m="http://schemas.openxmlformats.org/officeDocument/2006/math" xmlns:v="urn:schemas-microsoft-com:vml" xmlns:wp14="http://schemas.microsoft.com/office/word/2010/wordprocessingDrawing" xmlns:wp="http://schemas.openxmlformats.org/drawingml/2006/wordprocessingDrawing" xmlns:w10="urn:schemas-microsoft-com:office:word" xmlns:w="http://schemas.openxmlformats.org/wordprocessingml/2006/main" xmlns:w14="http://schemas.microsoft.com/office/word/2010/wordml" xmlns:w15="http://schemas.microsoft.com/office/word/2012/wordml" xmlns:w16cex="http://schemas.microsoft.com/office/word/2018/wordml/cex" xmlns:w16cid="http://schemas.microsoft.com/office/word/2016/wordml/cid" xmlns:w16="http://schemas.microsoft.com/office/word/2018/wordml" xmlns:w16sdtdh="http://schemas.microsoft.com/office/word/2020/wordml/sdtdatahash" xmlns:w16se="http://schemas.microsoft.com/office/word/2015/wordml/symex" xmlns:wpg="http://schemas.microsoft.com/office/word/2010/wordprocessingGroup" xmlns:wpi="http://schemas.microsoft.com/office/word/2010/wordprocessingInk" xmlns:wne="http://schemas.microsoft.com/office/word/2006/wordml" xmlns:wps="http://schemas.microsoft.com/office/word/2010/wordprocessingShape" mc:Ignorable="w14 w15 w16se w16cid w16 w16cex w16sdtdh wp14">
+<w:document xmlns:wpc="http://schemas.microsoft.com/office/word/2010/wordprocessingCanvas" xmlns:cx="http://schemas.microsoft.com/office/drawing/2014/chartex" xmlns:cx1="http://schemas.microsoft.com/office/drawing/2015/9/8/chartex" xmlns:cx2="http://schemas.microsoft.com/office/drawing/2015/10/21/chartex" xmlns:cx3="http://schemas.microsoft.com/office/drawing/2016/5/9/chartex" xmlns:cx4="http://schemas.microsoft.com/office/drawing/2016/5/10/chartex" xmlns:cx5="http://schemas.microsoft.com/office/drawing/2016/5/11/chartex" xmlns:cx6="http://schemas.microsoft.com/office/drawing/2016/5/12/chartex" xmlns:cx7="http://schemas.microsoft.com/office/drawing/2016/5/13/chartex" xmlns:cx8="http://schemas.microsoft.com/office/drawing/2016/5/14/chartex" xmlns:mc="http://schemas.openxmlformats.org/markup-compatibility/2006" xmlns:aink="http://schemas.microsoft.com/office/drawing/2016/ink" xmlns:am3d="http://schemas.microsoft.com/office/drawing/2017/model3d" xmlns:o="urn:schemas-microsoft-com:office:office" xmlns:oel="http://schemas.microsoft.com/office/2019/extlst" xmlns:r="http://schemas.openxmlformats.org/officeDocument/2006/relationships" xmlns:m="http://schemas.openxmlformats.org/officeDocument/2006/math" xmlns:v="urn:schemas-microsoft-com:vml" xmlns:wp14="http://schemas.microsoft.com/office/word/2010/wordprocessingDrawing" xmlns:wp="http://schemas.openxmlformats.org/drawingml/2006/wordprocessingDrawing" xmlns:w10="urn:schemas-microsoft-com:office:word" xmlns:w="http://schemas.openxmlformats.org/wordprocessingml/2006/main" xmlns:w14="http://schemas.microsoft.com/office/word/2010/wordml" xmlns:w15="http://schemas.microsoft.com/office/word/2012/wordml" xmlns:w16cex="http://schemas.microsoft.com/office/word/2018/wordml/cex" xmlns:w16cid="http://schemas.microsoft.com/office/word/2016/wordml/cid" xmlns:w16="http://schemas.microsoft.com/office/word/2018/wordml" xmlns:w16sdtdh="http://schemas.microsoft.com/office/word/2020/wordml/sdtdatahash" xmlns:w16se="http://schemas.microsoft.com/office/word/2015/wordml/symex" xmlns:wpg="http://schemas.microsoft.com/office/word/2010/wordprocessingGroup" xmlns:wpi="http://schemas.microsoft.com/office/word/2010/wordprocessingInk" xmlns:wne="http://schemas.microsoft.com/office/word/2006/wordml" xmlns:wps="http://schemas.microsoft.com/office/word/2010/wordprocessingShape" mc:Ignorable="w14 w15 w16se w16cid w16 w16cex w16sdtdh wp14">
   <w:body>
     <w:p>
       <w:pPr>
@@ -22584,7 +22584,7 @@
           <w:noProof/>
         </w:rPr>
         <w:drawing>
-          <wp:inline distT="0" distB="0" distL="0" distR="0" wp14:anchorId="6371A1E8" wp14:editId="195D2E4E">
+          <wp:inline distT="0" distB="0" distL="0" distR="0" wp14:anchorId="6371A1E8" wp14:editId="019A329E">
             <wp:extent cx="2274499" cy="2505075"/>
             <wp:effectExtent l="0" t="0" r="0" b="0"/>
             <wp:docPr id="10" name="Рисунок 10"/>
@@ -37586,7 +37586,6 @@
           <w:rFonts w:eastAsiaTheme="minorEastAsia"/>
           <w:b/>
           <w:bCs/>
-          <w:lang w:val="en-US"/>
         </w:rPr>
         <w:t xml:space="preserve"> </w:t>
       </w:r>
@@ -37603,7 +37602,6 @@
           <w:rFonts w:eastAsiaTheme="minorEastAsia"/>
           <w:b/>
           <w:bCs/>
-          <w:lang w:val="en-US"/>
         </w:rPr>
         <w:t xml:space="preserve"> </w:t>
       </w:r>
@@ -37620,7 +37618,6 @@
           <w:rFonts w:eastAsiaTheme="minorEastAsia"/>
           <w:b/>
           <w:bCs/>
-          <w:lang w:val="en-US"/>
         </w:rPr>
         <w:t xml:space="preserve"> </w:t>
       </w:r>
@@ -37637,7 +37634,6 @@
           <w:rFonts w:eastAsiaTheme="minorEastAsia"/>
           <w:b/>
           <w:bCs/>
-          <w:lang w:val="en-US"/>
         </w:rPr>
         <w:t xml:space="preserve"> </w:t>
       </w:r>
@@ -37654,7 +37650,6 @@
           <w:rFonts w:eastAsiaTheme="minorEastAsia"/>
           <w:b/>
           <w:bCs/>
-          <w:lang w:val="en-US"/>
         </w:rPr>
         <w:t xml:space="preserve"> ДУ 2-го </w:t>
       </w:r>
@@ -37671,7 +37666,6 @@
           <w:rFonts w:eastAsiaTheme="minorEastAsia"/>
           <w:b/>
           <w:bCs/>
-          <w:lang w:val="en-US"/>
         </w:rPr>
         <w:t>.</w:t>
       </w:r>
@@ -38416,7 +38410,6 @@
                       <m:r>
                         <w:rPr>
                           <w:rFonts w:ascii="Cambria Math" w:eastAsiaTheme="minorEastAsia" w:hAnsi="Cambria Math"/>
-                          <w:lang w:val="en-US"/>
                         </w:rPr>
                         <m:t>2</m:t>
                       </m:r>
@@ -38701,11 +38694,6 @@
           <w:rFonts w:eastAsiaTheme="minorEastAsia"/>
         </w:rPr>
         <w:br/>
-      </w:r>
-      <w:r>
-        <w:rPr>
-          <w:rFonts w:eastAsiaTheme="minorEastAsia"/>
-        </w:rPr>
         <w:t xml:space="preserve">Теорема (структура общего решения ЛОДУ). Если функции </w:t>
       </w:r>
       <m:oMath>
@@ -40583,6 +40571,9 @@
                   <m:t>y=</m:t>
                 </m:r>
                 <m:r>
+                  <m:rPr>
+                    <m:sty m:val="p"/>
+                  </m:rPr>
                   <w:rPr>
                     <w:rFonts w:ascii="Cambria Math" w:eastAsiaTheme="minorEastAsia" w:hAnsi="Cambria Math"/>
                   </w:rPr>
@@ -40779,6 +40770,9 @@
                   <m:t>y=</m:t>
                 </m:r>
                 <m:r>
+                  <m:rPr>
+                    <m:sty m:val="p"/>
+                  </m:rPr>
                   <w:rPr>
                     <w:rFonts w:ascii="Cambria Math" w:eastAsiaTheme="minorEastAsia" w:hAnsi="Cambria Math"/>
                   </w:rPr>
@@ -40808,13 +40802,7 @@
                       <w:rPr>
                         <w:rFonts w:ascii="Cambria Math" w:eastAsiaTheme="minorEastAsia" w:hAnsi="Cambria Math"/>
                       </w:rPr>
-                      <m:t>k</m:t>
-                    </m:r>
-                    <m:r>
-                      <w:rPr>
-                        <w:rFonts w:ascii="Cambria Math" w:eastAsiaTheme="minorEastAsia" w:hAnsi="Cambria Math"/>
-                      </w:rPr>
-                      <m:t>x</m:t>
+                      <m:t>kx</m:t>
                     </m:r>
                   </m:sup>
                 </m:sSup>
@@ -40915,6 +40903,9 @@
                   <m:t>y=</m:t>
                 </m:r>
                 <m:r>
+                  <m:rPr>
+                    <m:sty m:val="p"/>
+                  </m:rPr>
                   <w:rPr>
                     <w:rFonts w:ascii="Cambria Math" w:eastAsiaTheme="minorEastAsia" w:hAnsi="Cambria Math"/>
                   </w:rPr>
@@ -41782,19 +41773,7 @@
           <w:rPr>
             <w:rFonts w:ascii="Cambria Math" w:eastAsiaTheme="minorEastAsia" w:hAnsi="Cambria Math"/>
           </w:rPr>
-          <m:t>+</m:t>
-        </m:r>
-        <m:r>
-          <w:rPr>
-            <w:rFonts w:ascii="Cambria Math" w:eastAsiaTheme="minorEastAsia" w:hAnsi="Cambria Math"/>
-          </w:rPr>
-          <m:t>4</m:t>
-        </m:r>
-        <m:r>
-          <w:rPr>
-            <w:rFonts w:ascii="Cambria Math" w:eastAsiaTheme="minorEastAsia" w:hAnsi="Cambria Math"/>
-          </w:rPr>
-          <m:t>y=0</m:t>
+          <m:t>+4y=0</m:t>
         </m:r>
       </m:oMath>
       <w:r>
@@ -41853,25 +41832,7 @@
           <w:rPr>
             <w:rFonts w:ascii="Cambria Math" w:eastAsiaTheme="minorEastAsia" w:hAnsi="Cambria Math"/>
           </w:rPr>
-          <m:t>+4</m:t>
-        </m:r>
-        <m:r>
-          <w:rPr>
-            <w:rFonts w:ascii="Cambria Math" w:eastAsiaTheme="minorEastAsia" w:hAnsi="Cambria Math"/>
-          </w:rPr>
-          <m:t>k+</m:t>
-        </m:r>
-        <m:r>
-          <w:rPr>
-            <w:rFonts w:ascii="Cambria Math" w:eastAsiaTheme="minorEastAsia" w:hAnsi="Cambria Math"/>
-          </w:rPr>
-          <m:t>4</m:t>
-        </m:r>
-        <m:r>
-          <w:rPr>
-            <w:rFonts w:ascii="Cambria Math" w:eastAsiaTheme="minorEastAsia" w:hAnsi="Cambria Math"/>
-          </w:rPr>
-          <m:t>=0</m:t>
+          <m:t>+4k+4=0</m:t>
         </m:r>
       </m:oMath>
       <w:r>
@@ -41940,13 +41901,7 @@
               <w:rPr>
                 <w:rFonts w:ascii="Cambria Math" w:eastAsiaTheme="minorEastAsia" w:hAnsi="Cambria Math"/>
               </w:rPr>
-              <m:t>-4</m:t>
-            </m:r>
-            <m:r>
-              <w:rPr>
-                <w:rFonts w:ascii="Cambria Math" w:eastAsiaTheme="minorEastAsia" w:hAnsi="Cambria Math"/>
-              </w:rPr>
-              <m:t>±</m:t>
+              <m:t>-4±</m:t>
             </m:r>
             <m:rad>
               <m:radPr>
@@ -41964,19 +41919,7 @@
                   <w:rPr>
                     <w:rFonts w:ascii="Cambria Math" w:eastAsiaTheme="minorEastAsia" w:hAnsi="Cambria Math"/>
                   </w:rPr>
-                  <m:t>16</m:t>
-                </m:r>
-                <m:r>
-                  <w:rPr>
-                    <w:rFonts w:ascii="Cambria Math" w:eastAsiaTheme="minorEastAsia" w:hAnsi="Cambria Math"/>
-                  </w:rPr>
-                  <m:t>-</m:t>
-                </m:r>
-                <m:r>
-                  <w:rPr>
-                    <w:rFonts w:ascii="Cambria Math" w:eastAsiaTheme="minorEastAsia" w:hAnsi="Cambria Math"/>
-                  </w:rPr>
-                  <m:t>16</m:t>
+                  <m:t>16-16</m:t>
                 </m:r>
               </m:e>
             </m:rad>
@@ -41994,13 +41937,7 @@
           <w:rPr>
             <w:rFonts w:ascii="Cambria Math" w:eastAsiaTheme="minorEastAsia" w:hAnsi="Cambria Math"/>
           </w:rPr>
-          <m:t>=</m:t>
-        </m:r>
-        <m:r>
-          <w:rPr>
-            <w:rFonts w:ascii="Cambria Math" w:eastAsiaTheme="minorEastAsia" w:hAnsi="Cambria Math"/>
-          </w:rPr>
-          <m:t>-2</m:t>
+          <m:t>=-2</m:t>
         </m:r>
       </m:oMath>
       <w:r>
@@ -42078,13 +42015,7 @@
               <w:rPr>
                 <w:rFonts w:ascii="Cambria Math" w:eastAsiaTheme="minorEastAsia" w:hAnsi="Cambria Math"/>
               </w:rPr>
-              <m:t>-</m:t>
-            </m:r>
-            <m:r>
-              <w:rPr>
-                <w:rFonts w:ascii="Cambria Math" w:eastAsiaTheme="minorEastAsia" w:hAnsi="Cambria Math"/>
-              </w:rPr>
-              <m:t>2x</m:t>
+              <m:t>-2x</m:t>
             </m:r>
           </m:sup>
         </m:sSup>
@@ -42126,13 +42057,7 @@
           <w:rPr>
             <w:rFonts w:ascii="Cambria Math" w:eastAsiaTheme="minorEastAsia" w:hAnsi="Cambria Math"/>
           </w:rPr>
-          <m:t>=</m:t>
-        </m:r>
-        <m:r>
-          <w:rPr>
-            <w:rFonts w:ascii="Cambria Math" w:eastAsiaTheme="minorEastAsia" w:hAnsi="Cambria Math"/>
-          </w:rPr>
-          <m:t>x∙</m:t>
+          <m:t>=x∙</m:t>
         </m:r>
         <m:sSup>
           <m:sSupPr>
@@ -42156,13 +42081,7 @@
               <w:rPr>
                 <w:rFonts w:ascii="Cambria Math" w:eastAsiaTheme="minorEastAsia" w:hAnsi="Cambria Math"/>
               </w:rPr>
-              <m:t>-2</m:t>
-            </m:r>
-            <m:r>
-              <w:rPr>
-                <w:rFonts w:ascii="Cambria Math" w:eastAsiaTheme="minorEastAsia" w:hAnsi="Cambria Math"/>
-              </w:rPr>
-              <m:t>x</m:t>
+              <m:t>-2x</m:t>
             </m:r>
           </m:sup>
         </m:sSup>
@@ -42386,19 +42305,7 @@
           <w:rPr>
             <w:rFonts w:ascii="Cambria Math" w:eastAsiaTheme="minorEastAsia" w:hAnsi="Cambria Math"/>
           </w:rPr>
-          <m:t>+</m:t>
-        </m:r>
-        <m:r>
-          <w:rPr>
-            <w:rFonts w:ascii="Cambria Math" w:eastAsiaTheme="minorEastAsia" w:hAnsi="Cambria Math"/>
-          </w:rPr>
-          <m:t>13</m:t>
-        </m:r>
-        <m:r>
-          <w:rPr>
-            <w:rFonts w:ascii="Cambria Math" w:eastAsiaTheme="minorEastAsia" w:hAnsi="Cambria Math"/>
-          </w:rPr>
-          <m:t>y=0</m:t>
+          <m:t>+13y=0</m:t>
         </m:r>
       </m:oMath>
       <w:r>
@@ -42457,25 +42364,7 @@
           <w:rPr>
             <w:rFonts w:ascii="Cambria Math" w:eastAsiaTheme="minorEastAsia" w:hAnsi="Cambria Math"/>
           </w:rPr>
-          <m:t>-6</m:t>
-        </m:r>
-        <m:r>
-          <w:rPr>
-            <w:rFonts w:ascii="Cambria Math" w:eastAsiaTheme="minorEastAsia" w:hAnsi="Cambria Math"/>
-          </w:rPr>
-          <m:t>k+</m:t>
-        </m:r>
-        <m:r>
-          <w:rPr>
-            <w:rFonts w:ascii="Cambria Math" w:eastAsiaTheme="minorEastAsia" w:hAnsi="Cambria Math"/>
-          </w:rPr>
-          <m:t>13</m:t>
-        </m:r>
-        <m:r>
-          <w:rPr>
-            <w:rFonts w:ascii="Cambria Math" w:eastAsiaTheme="minorEastAsia" w:hAnsi="Cambria Math"/>
-          </w:rPr>
-          <m:t>=0</m:t>
+          <m:t>-6k+13=0</m:t>
         </m:r>
       </m:oMath>
       <w:r>
@@ -42544,13 +42433,7 @@
               <w:rPr>
                 <w:rFonts w:ascii="Cambria Math" w:eastAsiaTheme="minorEastAsia" w:hAnsi="Cambria Math"/>
               </w:rPr>
-              <m:t>6</m:t>
-            </m:r>
-            <m:r>
-              <w:rPr>
-                <w:rFonts w:ascii="Cambria Math" w:eastAsiaTheme="minorEastAsia" w:hAnsi="Cambria Math"/>
-              </w:rPr>
-              <m:t>±</m:t>
+              <m:t>6±</m:t>
             </m:r>
             <m:rad>
               <m:radPr>
@@ -42568,19 +42451,7 @@
                   <w:rPr>
                     <w:rFonts w:ascii="Cambria Math" w:eastAsiaTheme="minorEastAsia" w:hAnsi="Cambria Math"/>
                   </w:rPr>
-                  <m:t>36</m:t>
-                </m:r>
-                <m:r>
-                  <w:rPr>
-                    <w:rFonts w:ascii="Cambria Math" w:eastAsiaTheme="minorEastAsia" w:hAnsi="Cambria Math"/>
-                  </w:rPr>
-                  <m:t>-</m:t>
-                </m:r>
-                <m:r>
-                  <w:rPr>
-                    <w:rFonts w:ascii="Cambria Math" w:eastAsiaTheme="minorEastAsia" w:hAnsi="Cambria Math"/>
-                  </w:rPr>
-                  <m:t>52</m:t>
+                  <m:t>36-52</m:t>
                 </m:r>
               </m:e>
             </m:rad>
@@ -42598,13 +42469,7 @@
           <w:rPr>
             <w:rFonts w:ascii="Cambria Math" w:eastAsiaTheme="minorEastAsia" w:hAnsi="Cambria Math"/>
           </w:rPr>
-          <m:t>=</m:t>
-        </m:r>
-        <m:r>
-          <w:rPr>
-            <w:rFonts w:ascii="Cambria Math" w:eastAsiaTheme="minorEastAsia" w:hAnsi="Cambria Math"/>
-          </w:rPr>
-          <m:t>3±2i</m:t>
+          <m:t>=3±2i</m:t>
         </m:r>
       </m:oMath>
       <w:r>
@@ -42682,13 +42547,7 @@
               <w:rPr>
                 <w:rFonts w:ascii="Cambria Math" w:eastAsiaTheme="minorEastAsia" w:hAnsi="Cambria Math"/>
               </w:rPr>
-              <m:t>3</m:t>
-            </m:r>
-            <m:r>
-              <w:rPr>
-                <w:rFonts w:ascii="Cambria Math" w:eastAsiaTheme="minorEastAsia" w:hAnsi="Cambria Math"/>
-              </w:rPr>
-              <m:t>x</m:t>
+              <m:t>3x</m:t>
             </m:r>
           </m:sup>
         </m:sSup>
@@ -42783,13 +42642,7 @@
               <w:rPr>
                 <w:rFonts w:ascii="Cambria Math" w:eastAsiaTheme="minorEastAsia" w:hAnsi="Cambria Math"/>
               </w:rPr>
-              <m:t>3</m:t>
-            </m:r>
-            <m:r>
-              <w:rPr>
-                <w:rFonts w:ascii="Cambria Math" w:eastAsiaTheme="minorEastAsia" w:hAnsi="Cambria Math"/>
-              </w:rPr>
-              <m:t>x</m:t>
+              <m:t>3x</m:t>
             </m:r>
           </m:sup>
         </m:sSup>
@@ -42871,13 +42724,7 @@
               <w:rPr>
                 <w:rFonts w:ascii="Cambria Math" w:eastAsiaTheme="minorEastAsia" w:hAnsi="Cambria Math"/>
               </w:rPr>
-              <m:t>3</m:t>
-            </m:r>
-            <m:r>
-              <w:rPr>
-                <w:rFonts w:ascii="Cambria Math" w:eastAsiaTheme="minorEastAsia" w:hAnsi="Cambria Math"/>
-              </w:rPr>
-              <m:t>x</m:t>
+              <m:t>3x</m:t>
             </m:r>
           </m:sup>
         </m:sSup>
@@ -43049,14 +42896,12 @@
           <w:rFonts w:eastAsiaTheme="minorEastAsia"/>
           <w:b/>
           <w:bCs/>
-          <w:lang w:val="en-US"/>
         </w:rPr>
         <w:t>.</w:t>
       </w:r>
       <w:r>
         <w:rPr>
           <w:rFonts w:eastAsiaTheme="minorEastAsia"/>
-          <w:lang w:val="en-US"/>
         </w:rPr>
         <w:br/>
       </w:r>
@@ -43604,13 +43449,7 @@
           <w:rPr>
             <w:rFonts w:ascii="Cambria Math" w:eastAsiaTheme="minorEastAsia" w:hAnsi="Cambria Math"/>
           </w:rPr>
-          <m:t>y=</m:t>
-        </m:r>
-        <m:r>
-          <w:rPr>
-            <w:rFonts w:ascii="Cambria Math" w:eastAsiaTheme="minorEastAsia" w:hAnsi="Cambria Math"/>
-          </w:rPr>
-          <m:t>0</m:t>
+          <m:t>y=0</m:t>
         </m:r>
       </m:oMath>
       <w:r>
@@ -45204,7 +45043,45 @@
         <w:rPr>
           <w:rFonts w:eastAsiaTheme="minorEastAsia"/>
         </w:rPr>
-        <w:t xml:space="preserve"> как корня характеристического уравнения </w:t>
+        <w:t>,</w:t>
+      </w:r>
+      <w:r>
+        <w:rPr>
+          <w:rFonts w:eastAsiaTheme="minorEastAsia"/>
+        </w:rPr>
+        <w:t xml:space="preserve"> как корня характеристического уравнения</w:t>
+      </w:r>
+      <w:r>
+        <w:rPr>
+          <w:rFonts w:eastAsiaTheme="minorEastAsia"/>
+        </w:rPr>
+        <w:t xml:space="preserve">, т.е. число, показывающее сколько раз число </w:t>
+      </w:r>
+      <m:oMath>
+        <m:r>
+          <w:rPr>
+            <w:rFonts w:ascii="Cambria Math" w:eastAsiaTheme="minorEastAsia" w:hAnsi="Cambria Math"/>
+          </w:rPr>
+          <m:t>α</m:t>
+        </m:r>
+      </m:oMath>
+      <w:r>
+        <w:rPr>
+          <w:rFonts w:eastAsiaTheme="minorEastAsia"/>
+        </w:rPr>
+        <w:t xml:space="preserve"> </w:t>
+      </w:r>
+      <w:r>
+        <w:rPr>
+          <w:rFonts w:eastAsiaTheme="minorEastAsia"/>
+        </w:rPr>
+        <w:t>является корнем уравнения</w:t>
+      </w:r>
+      <w:r>
+        <w:rPr>
+          <w:rFonts w:eastAsiaTheme="minorEastAsia"/>
+        </w:rPr>
+        <w:t xml:space="preserve"> </w:t>
       </w:r>
       <m:oMath>
         <m:sSub>
@@ -45421,6 +45298,1170 @@
           <w:rFonts w:eastAsiaTheme="minorEastAsia"/>
         </w:rPr>
         <w:t>, записанный с неопределенными коэффициентами.</w:t>
+      </w:r>
+    </w:p>
+    <w:p>
+      <w:pPr>
+        <w:pStyle w:val="Mine0"/>
+        <w:numPr>
+          <w:ilvl w:val="2"/>
+          <w:numId w:val="2"/>
+        </w:numPr>
+        <w:ind w:left="1701" w:hanging="567"/>
+        <w:rPr>
+          <w:rFonts w:eastAsiaTheme="minorEastAsia"/>
+        </w:rPr>
+      </w:pPr>
+      <w:r>
+        <w:rPr>
+          <w:rFonts w:eastAsiaTheme="minorEastAsia"/>
+        </w:rPr>
+        <w:t xml:space="preserve">Пусть </w:t>
+      </w:r>
+      <m:oMath>
+        <m:sSub>
+          <m:sSubPr>
+            <m:ctrlPr>
+              <w:rPr>
+                <w:rFonts w:ascii="Cambria Math" w:eastAsiaTheme="minorEastAsia" w:hAnsi="Cambria Math"/>
+                <w:i/>
+              </w:rPr>
+            </m:ctrlPr>
+          </m:sSubPr>
+          <m:e>
+            <m:r>
+              <w:rPr>
+                <w:rFonts w:ascii="Cambria Math" w:eastAsiaTheme="minorEastAsia" w:hAnsi="Cambria Math"/>
+              </w:rPr>
+              <m:t>a</m:t>
+            </m:r>
+          </m:e>
+          <m:sub>
+            <m:r>
+              <w:rPr>
+                <w:rFonts w:ascii="Cambria Math" w:eastAsiaTheme="minorEastAsia" w:hAnsi="Cambria Math"/>
+              </w:rPr>
+              <m:t>0</m:t>
+            </m:r>
+          </m:sub>
+        </m:sSub>
+        <m:sSup>
+          <m:sSupPr>
+            <m:ctrlPr>
+              <w:rPr>
+                <w:rFonts w:ascii="Cambria Math" w:eastAsiaTheme="minorEastAsia" w:hAnsi="Cambria Math"/>
+                <w:i/>
+              </w:rPr>
+            </m:ctrlPr>
+          </m:sSupPr>
+          <m:e>
+            <m:r>
+              <w:rPr>
+                <w:rFonts w:ascii="Cambria Math" w:eastAsiaTheme="minorEastAsia" w:hAnsi="Cambria Math"/>
+              </w:rPr>
+              <m:t>y</m:t>
+            </m:r>
+          </m:e>
+          <m:sup>
+            <m:r>
+              <w:rPr>
+                <w:rFonts w:ascii="Cambria Math" w:eastAsiaTheme="minorEastAsia" w:hAnsi="Cambria Math"/>
+              </w:rPr>
+              <m:t>''</m:t>
+            </m:r>
+          </m:sup>
+        </m:sSup>
+        <m:r>
+          <w:rPr>
+            <w:rFonts w:ascii="Cambria Math" w:eastAsiaTheme="minorEastAsia" w:hAnsi="Cambria Math"/>
+          </w:rPr>
+          <m:t>+</m:t>
+        </m:r>
+        <m:sSub>
+          <m:sSubPr>
+            <m:ctrlPr>
+              <w:rPr>
+                <w:rFonts w:ascii="Cambria Math" w:eastAsiaTheme="minorEastAsia" w:hAnsi="Cambria Math"/>
+                <w:i/>
+              </w:rPr>
+            </m:ctrlPr>
+          </m:sSubPr>
+          <m:e>
+            <m:r>
+              <w:rPr>
+                <w:rFonts w:ascii="Cambria Math" w:eastAsiaTheme="minorEastAsia" w:hAnsi="Cambria Math"/>
+              </w:rPr>
+              <m:t>a</m:t>
+            </m:r>
+          </m:e>
+          <m:sub>
+            <m:r>
+              <w:rPr>
+                <w:rFonts w:ascii="Cambria Math" w:eastAsiaTheme="minorEastAsia" w:hAnsi="Cambria Math"/>
+              </w:rPr>
+              <m:t>1</m:t>
+            </m:r>
+          </m:sub>
+        </m:sSub>
+        <m:sSup>
+          <m:sSupPr>
+            <m:ctrlPr>
+              <w:rPr>
+                <w:rFonts w:ascii="Cambria Math" w:eastAsiaTheme="minorEastAsia" w:hAnsi="Cambria Math"/>
+                <w:i/>
+              </w:rPr>
+            </m:ctrlPr>
+          </m:sSupPr>
+          <m:e>
+            <m:r>
+              <w:rPr>
+                <w:rFonts w:ascii="Cambria Math" w:eastAsiaTheme="minorEastAsia" w:hAnsi="Cambria Math"/>
+              </w:rPr>
+              <m:t>y</m:t>
+            </m:r>
+          </m:e>
+          <m:sup>
+            <m:r>
+              <w:rPr>
+                <w:rFonts w:ascii="Cambria Math" w:eastAsiaTheme="minorEastAsia" w:hAnsi="Cambria Math"/>
+              </w:rPr>
+              <m:t>'</m:t>
+            </m:r>
+          </m:sup>
+        </m:sSup>
+        <m:r>
+          <w:rPr>
+            <w:rFonts w:ascii="Cambria Math" w:eastAsiaTheme="minorEastAsia" w:hAnsi="Cambria Math"/>
+          </w:rPr>
+          <m:t>+</m:t>
+        </m:r>
+        <m:sSub>
+          <m:sSubPr>
+            <m:ctrlPr>
+              <w:rPr>
+                <w:rFonts w:ascii="Cambria Math" w:eastAsiaTheme="minorEastAsia" w:hAnsi="Cambria Math"/>
+                <w:i/>
+              </w:rPr>
+            </m:ctrlPr>
+          </m:sSubPr>
+          <m:e>
+            <m:r>
+              <w:rPr>
+                <w:rFonts w:ascii="Cambria Math" w:eastAsiaTheme="minorEastAsia" w:hAnsi="Cambria Math"/>
+              </w:rPr>
+              <m:t>a</m:t>
+            </m:r>
+          </m:e>
+          <m:sub>
+            <m:r>
+              <w:rPr>
+                <w:rFonts w:ascii="Cambria Math" w:eastAsiaTheme="minorEastAsia" w:hAnsi="Cambria Math"/>
+              </w:rPr>
+              <m:t>2</m:t>
+            </m:r>
+          </m:sub>
+        </m:sSub>
+        <m:r>
+          <w:rPr>
+            <w:rFonts w:ascii="Cambria Math" w:eastAsiaTheme="minorEastAsia" w:hAnsi="Cambria Math"/>
+          </w:rPr>
+          <m:t>y=</m:t>
+        </m:r>
+        <m:sSup>
+          <m:sSupPr>
+            <m:ctrlPr>
+              <w:rPr>
+                <w:rFonts w:ascii="Cambria Math" w:eastAsiaTheme="minorEastAsia" w:hAnsi="Cambria Math"/>
+                <w:i/>
+              </w:rPr>
+            </m:ctrlPr>
+          </m:sSupPr>
+          <m:e>
+            <m:r>
+              <w:rPr>
+                <w:rFonts w:ascii="Cambria Math" w:eastAsiaTheme="minorEastAsia" w:hAnsi="Cambria Math"/>
+              </w:rPr>
+              <m:t>e</m:t>
+            </m:r>
+          </m:e>
+          <m:sup>
+            <m:r>
+              <w:rPr>
+                <w:rFonts w:ascii="Cambria Math" w:eastAsiaTheme="minorEastAsia" w:hAnsi="Cambria Math"/>
+              </w:rPr>
+              <m:t>αx</m:t>
+            </m:r>
+          </m:sup>
+        </m:sSup>
+        <m:r>
+          <w:rPr>
+            <w:rFonts w:ascii="Cambria Math" w:eastAsiaTheme="minorEastAsia" w:hAnsi="Cambria Math"/>
+          </w:rPr>
+          <m:t>(</m:t>
+        </m:r>
+        <m:sSub>
+          <m:sSubPr>
+            <m:ctrlPr>
+              <w:rPr>
+                <w:rFonts w:ascii="Cambria Math" w:eastAsiaTheme="minorEastAsia" w:hAnsi="Cambria Math"/>
+                <w:i/>
+              </w:rPr>
+            </m:ctrlPr>
+          </m:sSubPr>
+          <m:e>
+            <m:r>
+              <w:rPr>
+                <w:rFonts w:ascii="Cambria Math" w:eastAsiaTheme="minorEastAsia" w:hAnsi="Cambria Math"/>
+              </w:rPr>
+              <m:t>P</m:t>
+            </m:r>
+          </m:e>
+          <m:sub>
+            <m:r>
+              <w:rPr>
+                <w:rFonts w:ascii="Cambria Math" w:eastAsiaTheme="minorEastAsia" w:hAnsi="Cambria Math"/>
+              </w:rPr>
+              <m:t>n</m:t>
+            </m:r>
+          </m:sub>
+        </m:sSub>
+        <m:d>
+          <m:dPr>
+            <m:ctrlPr>
+              <w:rPr>
+                <w:rFonts w:ascii="Cambria Math" w:eastAsiaTheme="minorEastAsia" w:hAnsi="Cambria Math"/>
+                <w:i/>
+              </w:rPr>
+            </m:ctrlPr>
+          </m:dPr>
+          <m:e>
+            <m:r>
+              <w:rPr>
+                <w:rFonts w:ascii="Cambria Math" w:eastAsiaTheme="minorEastAsia" w:hAnsi="Cambria Math"/>
+              </w:rPr>
+              <m:t>x</m:t>
+            </m:r>
+          </m:e>
+        </m:d>
+        <m:func>
+          <m:funcPr>
+            <m:ctrlPr>
+              <w:rPr>
+                <w:rFonts w:ascii="Cambria Math" w:eastAsiaTheme="minorEastAsia" w:hAnsi="Cambria Math"/>
+                <w:i/>
+              </w:rPr>
+            </m:ctrlPr>
+          </m:funcPr>
+          <m:fName>
+            <m:r>
+              <m:rPr>
+                <m:sty m:val="p"/>
+              </m:rPr>
+              <w:rPr>
+                <w:rFonts w:ascii="Cambria Math" w:hAnsi="Cambria Math"/>
+              </w:rPr>
+              <m:t>cos</m:t>
+            </m:r>
+          </m:fName>
+          <m:e>
+            <m:r>
+              <w:rPr>
+                <w:rFonts w:ascii="Cambria Math" w:eastAsiaTheme="minorEastAsia" w:hAnsi="Cambria Math"/>
+              </w:rPr>
+              <m:t>β</m:t>
+            </m:r>
+            <m:r>
+              <w:rPr>
+                <w:rFonts w:ascii="Cambria Math" w:eastAsiaTheme="minorEastAsia" w:hAnsi="Cambria Math"/>
+                <w:lang w:val="en-US"/>
+              </w:rPr>
+              <m:t>x</m:t>
+            </m:r>
+          </m:e>
+        </m:func>
+        <m:r>
+          <w:rPr>
+            <w:rFonts w:ascii="Cambria Math" w:eastAsiaTheme="minorEastAsia" w:hAnsi="Cambria Math"/>
+          </w:rPr>
+          <m:t>+</m:t>
+        </m:r>
+        <m:sSub>
+          <m:sSubPr>
+            <m:ctrlPr>
+              <w:rPr>
+                <w:rFonts w:ascii="Cambria Math" w:eastAsiaTheme="minorEastAsia" w:hAnsi="Cambria Math"/>
+                <w:i/>
+              </w:rPr>
+            </m:ctrlPr>
+          </m:sSubPr>
+          <m:e>
+            <m:r>
+              <w:rPr>
+                <w:rFonts w:ascii="Cambria Math" w:eastAsiaTheme="minorEastAsia" w:hAnsi="Cambria Math"/>
+              </w:rPr>
+              <m:t>Q</m:t>
+            </m:r>
+          </m:e>
+          <m:sub>
+            <m:r>
+              <w:rPr>
+                <w:rFonts w:ascii="Cambria Math" w:eastAsiaTheme="minorEastAsia" w:hAnsi="Cambria Math"/>
+              </w:rPr>
+              <m:t>m</m:t>
+            </m:r>
+          </m:sub>
+        </m:sSub>
+        <m:d>
+          <m:dPr>
+            <m:ctrlPr>
+              <w:rPr>
+                <w:rFonts w:ascii="Cambria Math" w:eastAsiaTheme="minorEastAsia" w:hAnsi="Cambria Math"/>
+                <w:i/>
+              </w:rPr>
+            </m:ctrlPr>
+          </m:dPr>
+          <m:e>
+            <m:r>
+              <w:rPr>
+                <w:rFonts w:ascii="Cambria Math" w:eastAsiaTheme="minorEastAsia" w:hAnsi="Cambria Math"/>
+              </w:rPr>
+              <m:t>x</m:t>
+            </m:r>
+          </m:e>
+        </m:d>
+        <m:func>
+          <m:funcPr>
+            <m:ctrlPr>
+              <w:rPr>
+                <w:rFonts w:ascii="Cambria Math" w:eastAsiaTheme="minorEastAsia" w:hAnsi="Cambria Math"/>
+                <w:i/>
+              </w:rPr>
+            </m:ctrlPr>
+          </m:funcPr>
+          <m:fName>
+            <m:r>
+              <m:rPr>
+                <m:sty m:val="p"/>
+              </m:rPr>
+              <w:rPr>
+                <w:rFonts w:ascii="Cambria Math" w:hAnsi="Cambria Math"/>
+              </w:rPr>
+              <m:t>sin</m:t>
+            </m:r>
+          </m:fName>
+          <m:e>
+            <m:r>
+              <w:rPr>
+                <w:rFonts w:ascii="Cambria Math" w:eastAsiaTheme="minorEastAsia" w:hAnsi="Cambria Math"/>
+              </w:rPr>
+              <m:t>β</m:t>
+            </m:r>
+            <m:r>
+              <w:rPr>
+                <w:rFonts w:ascii="Cambria Math" w:eastAsiaTheme="minorEastAsia" w:hAnsi="Cambria Math"/>
+                <w:lang w:val="en-US"/>
+              </w:rPr>
+              <m:t>x</m:t>
+            </m:r>
+          </m:e>
+        </m:func>
+        <m:r>
+          <w:rPr>
+            <w:rFonts w:ascii="Cambria Math" w:eastAsiaTheme="minorEastAsia" w:hAnsi="Cambria Math"/>
+          </w:rPr>
+          <m:t>)</m:t>
+        </m:r>
+      </m:oMath>
+      <w:r>
+        <w:rPr>
+          <w:rFonts w:eastAsiaTheme="minorEastAsia"/>
+        </w:rPr>
+        <w:t xml:space="preserve">, тогда </w:t>
+      </w:r>
+      <m:oMath>
+        <m:sSup>
+          <m:sSupPr>
+            <m:ctrlPr>
+              <w:rPr>
+                <w:rFonts w:ascii="Cambria Math" w:eastAsiaTheme="minorEastAsia" w:hAnsi="Cambria Math"/>
+                <w:i/>
+              </w:rPr>
+            </m:ctrlPr>
+          </m:sSupPr>
+          <m:e>
+            <m:r>
+              <w:rPr>
+                <w:rFonts w:ascii="Cambria Math" w:eastAsiaTheme="minorEastAsia" w:hAnsi="Cambria Math"/>
+              </w:rPr>
+              <m:t>y</m:t>
+            </m:r>
+          </m:e>
+          <m:sup>
+            <m:r>
+              <w:rPr>
+                <w:rFonts w:ascii="Cambria Math" w:eastAsiaTheme="minorEastAsia" w:hAnsi="Cambria Math"/>
+              </w:rPr>
+              <m:t>*</m:t>
+            </m:r>
+          </m:sup>
+        </m:sSup>
+        <m:r>
+          <w:rPr>
+            <w:rFonts w:ascii="Cambria Math" w:eastAsiaTheme="minorEastAsia" w:hAnsi="Cambria Math"/>
+          </w:rPr>
+          <m:t>=</m:t>
+        </m:r>
+        <m:sSup>
+          <m:sSupPr>
+            <m:ctrlPr>
+              <w:rPr>
+                <w:rFonts w:ascii="Cambria Math" w:eastAsiaTheme="minorEastAsia" w:hAnsi="Cambria Math"/>
+                <w:i/>
+                <w:lang w:val="en-US"/>
+              </w:rPr>
+            </m:ctrlPr>
+          </m:sSupPr>
+          <m:e>
+            <m:r>
+              <w:rPr>
+                <w:rFonts w:ascii="Cambria Math" w:eastAsiaTheme="minorEastAsia" w:hAnsi="Cambria Math"/>
+                <w:lang w:val="en-US"/>
+              </w:rPr>
+              <m:t>x</m:t>
+            </m:r>
+          </m:e>
+          <m:sup>
+            <m:r>
+              <w:rPr>
+                <w:rFonts w:ascii="Cambria Math" w:eastAsiaTheme="minorEastAsia" w:hAnsi="Cambria Math"/>
+                <w:lang w:val="en-US"/>
+              </w:rPr>
+              <m:t>r</m:t>
+            </m:r>
+          </m:sup>
+        </m:sSup>
+        <m:r>
+          <w:rPr>
+            <w:rFonts w:ascii="Cambria Math" w:eastAsiaTheme="minorEastAsia" w:hAnsi="Cambria Math"/>
+          </w:rPr>
+          <m:t>∙</m:t>
+        </m:r>
+        <m:sSup>
+          <m:sSupPr>
+            <m:ctrlPr>
+              <w:rPr>
+                <w:rFonts w:ascii="Cambria Math" w:eastAsiaTheme="minorEastAsia" w:hAnsi="Cambria Math"/>
+                <w:i/>
+              </w:rPr>
+            </m:ctrlPr>
+          </m:sSupPr>
+          <m:e>
+            <m:r>
+              <w:rPr>
+                <w:rFonts w:ascii="Cambria Math" w:eastAsiaTheme="minorEastAsia" w:hAnsi="Cambria Math"/>
+              </w:rPr>
+              <m:t>e</m:t>
+            </m:r>
+          </m:e>
+          <m:sup>
+            <m:r>
+              <w:rPr>
+                <w:rFonts w:ascii="Cambria Math" w:eastAsiaTheme="minorEastAsia" w:hAnsi="Cambria Math"/>
+              </w:rPr>
+              <m:t>αx</m:t>
+            </m:r>
+          </m:sup>
+        </m:sSup>
+        <m:r>
+          <w:rPr>
+            <w:rFonts w:ascii="Cambria Math" w:eastAsiaTheme="minorEastAsia" w:hAnsi="Cambria Math"/>
+          </w:rPr>
+          <m:t>∙(</m:t>
+        </m:r>
+        <m:sSub>
+          <m:sSubPr>
+            <m:ctrlPr>
+              <w:rPr>
+                <w:rFonts w:ascii="Cambria Math" w:eastAsiaTheme="minorEastAsia" w:hAnsi="Cambria Math"/>
+                <w:i/>
+              </w:rPr>
+            </m:ctrlPr>
+          </m:sSubPr>
+          <m:e>
+            <m:r>
+              <w:rPr>
+                <w:rFonts w:ascii="Cambria Math" w:eastAsiaTheme="minorEastAsia" w:hAnsi="Cambria Math"/>
+              </w:rPr>
+              <m:t>M</m:t>
+            </m:r>
+          </m:e>
+          <m:sub>
+            <m:r>
+              <w:rPr>
+                <w:rFonts w:ascii="Cambria Math" w:eastAsiaTheme="minorEastAsia" w:hAnsi="Cambria Math"/>
+              </w:rPr>
+              <m:t>l</m:t>
+            </m:r>
+          </m:sub>
+        </m:sSub>
+        <m:d>
+          <m:dPr>
+            <m:ctrlPr>
+              <w:rPr>
+                <w:rFonts w:ascii="Cambria Math" w:eastAsiaTheme="minorEastAsia" w:hAnsi="Cambria Math"/>
+                <w:i/>
+              </w:rPr>
+            </m:ctrlPr>
+          </m:dPr>
+          <m:e>
+            <m:r>
+              <w:rPr>
+                <w:rFonts w:ascii="Cambria Math" w:eastAsiaTheme="minorEastAsia" w:hAnsi="Cambria Math"/>
+              </w:rPr>
+              <m:t>x</m:t>
+            </m:r>
+          </m:e>
+        </m:d>
+        <m:func>
+          <m:funcPr>
+            <m:ctrlPr>
+              <w:rPr>
+                <w:rFonts w:ascii="Cambria Math" w:eastAsiaTheme="minorEastAsia" w:hAnsi="Cambria Math"/>
+                <w:i/>
+              </w:rPr>
+            </m:ctrlPr>
+          </m:funcPr>
+          <m:fName>
+            <m:r>
+              <m:rPr>
+                <m:sty m:val="p"/>
+              </m:rPr>
+              <w:rPr>
+                <w:rFonts w:ascii="Cambria Math" w:hAnsi="Cambria Math"/>
+              </w:rPr>
+              <m:t>cos</m:t>
+            </m:r>
+          </m:fName>
+          <m:e>
+            <m:r>
+              <w:rPr>
+                <w:rFonts w:ascii="Cambria Math" w:eastAsiaTheme="minorEastAsia" w:hAnsi="Cambria Math"/>
+              </w:rPr>
+              <m:t>β</m:t>
+            </m:r>
+            <m:r>
+              <w:rPr>
+                <w:rFonts w:ascii="Cambria Math" w:eastAsiaTheme="minorEastAsia" w:hAnsi="Cambria Math"/>
+                <w:lang w:val="en-US"/>
+              </w:rPr>
+              <m:t>x</m:t>
+            </m:r>
+          </m:e>
+        </m:func>
+        <m:r>
+          <w:rPr>
+            <w:rFonts w:ascii="Cambria Math" w:eastAsiaTheme="minorEastAsia" w:hAnsi="Cambria Math"/>
+          </w:rPr>
+          <m:t>+</m:t>
+        </m:r>
+        <m:sSub>
+          <m:sSubPr>
+            <m:ctrlPr>
+              <w:rPr>
+                <w:rFonts w:ascii="Cambria Math" w:eastAsiaTheme="minorEastAsia" w:hAnsi="Cambria Math"/>
+                <w:i/>
+              </w:rPr>
+            </m:ctrlPr>
+          </m:sSubPr>
+          <m:e>
+            <m:r>
+              <w:rPr>
+                <w:rFonts w:ascii="Cambria Math" w:eastAsiaTheme="minorEastAsia" w:hAnsi="Cambria Math"/>
+              </w:rPr>
+              <m:t>N</m:t>
+            </m:r>
+          </m:e>
+          <m:sub>
+            <m:r>
+              <w:rPr>
+                <w:rFonts w:ascii="Cambria Math" w:eastAsiaTheme="minorEastAsia" w:hAnsi="Cambria Math"/>
+              </w:rPr>
+              <m:t>l</m:t>
+            </m:r>
+          </m:sub>
+        </m:sSub>
+        <m:d>
+          <m:dPr>
+            <m:ctrlPr>
+              <w:rPr>
+                <w:rFonts w:ascii="Cambria Math" w:eastAsiaTheme="minorEastAsia" w:hAnsi="Cambria Math"/>
+                <w:i/>
+              </w:rPr>
+            </m:ctrlPr>
+          </m:dPr>
+          <m:e>
+            <m:r>
+              <w:rPr>
+                <w:rFonts w:ascii="Cambria Math" w:eastAsiaTheme="minorEastAsia" w:hAnsi="Cambria Math"/>
+              </w:rPr>
+              <m:t>x</m:t>
+            </m:r>
+          </m:e>
+        </m:d>
+        <m:func>
+          <m:funcPr>
+            <m:ctrlPr>
+              <w:rPr>
+                <w:rFonts w:ascii="Cambria Math" w:eastAsiaTheme="minorEastAsia" w:hAnsi="Cambria Math"/>
+                <w:i/>
+              </w:rPr>
+            </m:ctrlPr>
+          </m:funcPr>
+          <m:fName>
+            <m:r>
+              <m:rPr>
+                <m:sty m:val="p"/>
+              </m:rPr>
+              <w:rPr>
+                <w:rFonts w:ascii="Cambria Math" w:hAnsi="Cambria Math"/>
+              </w:rPr>
+              <m:t>sin</m:t>
+            </m:r>
+          </m:fName>
+          <m:e>
+            <m:r>
+              <w:rPr>
+                <w:rFonts w:ascii="Cambria Math" w:eastAsiaTheme="minorEastAsia" w:hAnsi="Cambria Math"/>
+              </w:rPr>
+              <m:t>β</m:t>
+            </m:r>
+            <m:r>
+              <w:rPr>
+                <w:rFonts w:ascii="Cambria Math" w:eastAsiaTheme="minorEastAsia" w:hAnsi="Cambria Math"/>
+                <w:lang w:val="en-US"/>
+              </w:rPr>
+              <m:t>x</m:t>
+            </m:r>
+          </m:e>
+        </m:func>
+        <m:r>
+          <w:rPr>
+            <w:rFonts w:ascii="Cambria Math" w:eastAsiaTheme="minorEastAsia" w:hAnsi="Cambria Math"/>
+          </w:rPr>
+          <m:t>)</m:t>
+        </m:r>
+      </m:oMath>
+      <w:r>
+        <w:rPr>
+          <w:rFonts w:eastAsiaTheme="minorEastAsia"/>
+        </w:rPr>
+        <w:t xml:space="preserve">, </w:t>
+      </w:r>
+      <w:r>
+        <w:rPr>
+          <w:rFonts w:eastAsiaTheme="minorEastAsia"/>
+        </w:rPr>
+        <w:t xml:space="preserve">где </w:t>
+      </w:r>
+      <m:oMath>
+        <m:r>
+          <w:rPr>
+            <w:rFonts w:ascii="Cambria Math" w:eastAsiaTheme="minorEastAsia" w:hAnsi="Cambria Math"/>
+          </w:rPr>
+          <m:t>r</m:t>
+        </m:r>
+      </m:oMath>
+      <w:r>
+        <w:rPr>
+          <w:rFonts w:eastAsiaTheme="minorEastAsia"/>
+        </w:rPr>
+        <w:t xml:space="preserve"> </w:t>
+      </w:r>
+      <w:r>
+        <w:rPr>
+          <w:rFonts w:eastAsiaTheme="minorEastAsia"/>
+        </w:rPr>
+        <w:t>–</w:t>
+      </w:r>
+      <w:r>
+        <w:rPr>
+          <w:rFonts w:eastAsiaTheme="minorEastAsia"/>
+        </w:rPr>
+        <w:t xml:space="preserve"> </w:t>
+      </w:r>
+      <w:r>
+        <w:rPr>
+          <w:rFonts w:eastAsiaTheme="minorEastAsia"/>
+        </w:rPr>
+        <w:t xml:space="preserve">число, равное кратности </w:t>
+      </w:r>
+      <m:oMath>
+        <m:r>
+          <w:rPr>
+            <w:rFonts w:ascii="Cambria Math" w:eastAsiaTheme="minorEastAsia" w:hAnsi="Cambria Math"/>
+          </w:rPr>
+          <m:t>α+βi</m:t>
+        </m:r>
+      </m:oMath>
+      <w:r>
+        <w:rPr>
+          <w:rFonts w:eastAsiaTheme="minorEastAsia"/>
+        </w:rPr>
+        <w:t xml:space="preserve">, как корня характеристического уравнения </w:t>
+      </w:r>
+      <m:oMath>
+        <m:sSub>
+          <m:sSubPr>
+            <m:ctrlPr>
+              <w:rPr>
+                <w:rFonts w:ascii="Cambria Math" w:eastAsiaTheme="minorEastAsia" w:hAnsi="Cambria Math"/>
+                <w:i/>
+              </w:rPr>
+            </m:ctrlPr>
+          </m:sSubPr>
+          <m:e>
+            <m:r>
+              <w:rPr>
+                <w:rFonts w:ascii="Cambria Math" w:eastAsiaTheme="minorEastAsia" w:hAnsi="Cambria Math"/>
+              </w:rPr>
+              <m:t>a</m:t>
+            </m:r>
+          </m:e>
+          <m:sub>
+            <m:r>
+              <w:rPr>
+                <w:rFonts w:ascii="Cambria Math" w:eastAsiaTheme="minorEastAsia" w:hAnsi="Cambria Math"/>
+              </w:rPr>
+              <m:t>0</m:t>
+            </m:r>
+          </m:sub>
+        </m:sSub>
+        <m:sSup>
+          <m:sSupPr>
+            <m:ctrlPr>
+              <w:rPr>
+                <w:rFonts w:ascii="Cambria Math" w:eastAsiaTheme="minorEastAsia" w:hAnsi="Cambria Math"/>
+                <w:i/>
+                <w:lang w:val="en-US"/>
+              </w:rPr>
+            </m:ctrlPr>
+          </m:sSupPr>
+          <m:e>
+            <m:r>
+              <w:rPr>
+                <w:rFonts w:ascii="Cambria Math" w:eastAsiaTheme="minorEastAsia" w:hAnsi="Cambria Math"/>
+                <w:lang w:val="en-US"/>
+              </w:rPr>
+              <m:t>k</m:t>
+            </m:r>
+          </m:e>
+          <m:sup>
+            <m:r>
+              <w:rPr>
+                <w:rFonts w:ascii="Cambria Math" w:eastAsiaTheme="minorEastAsia" w:hAnsi="Cambria Math"/>
+              </w:rPr>
+              <m:t>2</m:t>
+            </m:r>
+          </m:sup>
+        </m:sSup>
+        <m:r>
+          <w:rPr>
+            <w:rFonts w:ascii="Cambria Math" w:eastAsiaTheme="minorEastAsia" w:hAnsi="Cambria Math"/>
+          </w:rPr>
+          <m:t>+</m:t>
+        </m:r>
+        <m:sSub>
+          <m:sSubPr>
+            <m:ctrlPr>
+              <w:rPr>
+                <w:rFonts w:ascii="Cambria Math" w:eastAsiaTheme="minorEastAsia" w:hAnsi="Cambria Math"/>
+                <w:i/>
+              </w:rPr>
+            </m:ctrlPr>
+          </m:sSubPr>
+          <m:e>
+            <m:r>
+              <w:rPr>
+                <w:rFonts w:ascii="Cambria Math" w:eastAsiaTheme="minorEastAsia" w:hAnsi="Cambria Math"/>
+              </w:rPr>
+              <m:t>a</m:t>
+            </m:r>
+          </m:e>
+          <m:sub>
+            <m:r>
+              <w:rPr>
+                <w:rFonts w:ascii="Cambria Math" w:eastAsiaTheme="minorEastAsia" w:hAnsi="Cambria Math"/>
+              </w:rPr>
+              <m:t>1</m:t>
+            </m:r>
+          </m:sub>
+        </m:sSub>
+        <m:r>
+          <w:rPr>
+            <w:rFonts w:ascii="Cambria Math" w:eastAsiaTheme="minorEastAsia" w:hAnsi="Cambria Math"/>
+          </w:rPr>
+          <m:t>k+</m:t>
+        </m:r>
+        <m:sSub>
+          <m:sSubPr>
+            <m:ctrlPr>
+              <w:rPr>
+                <w:rFonts w:ascii="Cambria Math" w:eastAsiaTheme="minorEastAsia" w:hAnsi="Cambria Math"/>
+                <w:i/>
+              </w:rPr>
+            </m:ctrlPr>
+          </m:sSubPr>
+          <m:e>
+            <m:r>
+              <w:rPr>
+                <w:rFonts w:ascii="Cambria Math" w:eastAsiaTheme="minorEastAsia" w:hAnsi="Cambria Math"/>
+              </w:rPr>
+              <m:t>a</m:t>
+            </m:r>
+          </m:e>
+          <m:sub>
+            <m:r>
+              <w:rPr>
+                <w:rFonts w:ascii="Cambria Math" w:eastAsiaTheme="minorEastAsia" w:hAnsi="Cambria Math"/>
+              </w:rPr>
+              <m:t>0</m:t>
+            </m:r>
+          </m:sub>
+        </m:sSub>
+        <m:r>
+          <w:rPr>
+            <w:rFonts w:ascii="Cambria Math" w:eastAsiaTheme="minorEastAsia" w:hAnsi="Cambria Math"/>
+          </w:rPr>
+          <m:t>=0</m:t>
+        </m:r>
+      </m:oMath>
+      <w:r>
+        <w:rPr>
+          <w:rFonts w:eastAsiaTheme="minorEastAsia"/>
+        </w:rPr>
+        <w:t xml:space="preserve">, </w:t>
+      </w:r>
+      <m:oMath>
+        <m:sSub>
+          <m:sSubPr>
+            <m:ctrlPr>
+              <w:rPr>
+                <w:rFonts w:ascii="Cambria Math" w:eastAsiaTheme="minorEastAsia" w:hAnsi="Cambria Math"/>
+                <w:i/>
+              </w:rPr>
+            </m:ctrlPr>
+          </m:sSubPr>
+          <m:e>
+            <m:r>
+              <w:rPr>
+                <w:rFonts w:ascii="Cambria Math" w:eastAsiaTheme="minorEastAsia" w:hAnsi="Cambria Math"/>
+              </w:rPr>
+              <m:t>M</m:t>
+            </m:r>
+          </m:e>
+          <m:sub>
+            <m:r>
+              <w:rPr>
+                <w:rFonts w:ascii="Cambria Math" w:eastAsiaTheme="minorEastAsia" w:hAnsi="Cambria Math"/>
+              </w:rPr>
+              <m:t>l</m:t>
+            </m:r>
+          </m:sub>
+        </m:sSub>
+        <m:d>
+          <m:dPr>
+            <m:ctrlPr>
+              <w:rPr>
+                <w:rFonts w:ascii="Cambria Math" w:eastAsiaTheme="minorEastAsia" w:hAnsi="Cambria Math"/>
+                <w:i/>
+              </w:rPr>
+            </m:ctrlPr>
+          </m:dPr>
+          <m:e>
+            <m:r>
+              <w:rPr>
+                <w:rFonts w:ascii="Cambria Math" w:eastAsiaTheme="minorEastAsia" w:hAnsi="Cambria Math"/>
+              </w:rPr>
+              <m:t>x</m:t>
+            </m:r>
+          </m:e>
+        </m:d>
+      </m:oMath>
+      <w:r>
+        <w:rPr>
+          <w:rFonts w:eastAsiaTheme="minorEastAsia"/>
+        </w:rPr>
+        <w:t xml:space="preserve">, </w:t>
+      </w:r>
+      <m:oMath>
+        <m:sSub>
+          <m:sSubPr>
+            <m:ctrlPr>
+              <w:rPr>
+                <w:rFonts w:ascii="Cambria Math" w:eastAsiaTheme="minorEastAsia" w:hAnsi="Cambria Math"/>
+                <w:i/>
+              </w:rPr>
+            </m:ctrlPr>
+          </m:sSubPr>
+          <m:e>
+            <m:r>
+              <w:rPr>
+                <w:rFonts w:ascii="Cambria Math" w:eastAsiaTheme="minorEastAsia" w:hAnsi="Cambria Math"/>
+                <w:lang w:val="en-US"/>
+              </w:rPr>
+              <m:t>N</m:t>
+            </m:r>
+          </m:e>
+          <m:sub>
+            <m:r>
+              <w:rPr>
+                <w:rFonts w:ascii="Cambria Math" w:eastAsiaTheme="minorEastAsia" w:hAnsi="Cambria Math"/>
+              </w:rPr>
+              <m:t>l</m:t>
+            </m:r>
+          </m:sub>
+        </m:sSub>
+        <m:d>
+          <m:dPr>
+            <m:ctrlPr>
+              <w:rPr>
+                <w:rFonts w:ascii="Cambria Math" w:eastAsiaTheme="minorEastAsia" w:hAnsi="Cambria Math"/>
+                <w:i/>
+              </w:rPr>
+            </m:ctrlPr>
+          </m:dPr>
+          <m:e>
+            <m:r>
+              <w:rPr>
+                <w:rFonts w:ascii="Cambria Math" w:eastAsiaTheme="minorEastAsia" w:hAnsi="Cambria Math"/>
+              </w:rPr>
+              <m:t>x</m:t>
+            </m:r>
+          </m:e>
+        </m:d>
+      </m:oMath>
+      <w:r>
+        <w:rPr>
+          <w:rFonts w:eastAsiaTheme="minorEastAsia"/>
+        </w:rPr>
+        <w:t xml:space="preserve"> </w:t>
+      </w:r>
+      <w:r>
+        <w:rPr>
+          <w:rFonts w:eastAsiaTheme="minorEastAsia"/>
+        </w:rPr>
+        <w:t xml:space="preserve">– многочлены степени </w:t>
+      </w:r>
+      <m:oMath>
+        <m:r>
+          <w:rPr>
+            <w:rFonts w:ascii="Cambria Math" w:eastAsiaTheme="minorEastAsia" w:hAnsi="Cambria Math"/>
+          </w:rPr>
+          <m:t>l</m:t>
+        </m:r>
+      </m:oMath>
+      <w:r>
+        <w:rPr>
+          <w:rFonts w:eastAsiaTheme="minorEastAsia"/>
+        </w:rPr>
+        <w:t xml:space="preserve"> </w:t>
+      </w:r>
+      <w:r>
+        <w:rPr>
+          <w:rFonts w:eastAsiaTheme="minorEastAsia"/>
+        </w:rPr>
+        <w:t xml:space="preserve">с неопределенными коэффициентами, </w:t>
+      </w:r>
+      <m:oMath>
+        <m:r>
+          <w:rPr>
+            <w:rFonts w:ascii="Cambria Math" w:eastAsiaTheme="minorEastAsia" w:hAnsi="Cambria Math"/>
+          </w:rPr>
+          <m:t>l</m:t>
+        </m:r>
+      </m:oMath>
+      <w:r>
+        <w:rPr>
+          <w:rFonts w:eastAsiaTheme="minorEastAsia"/>
+        </w:rPr>
+        <w:t xml:space="preserve"> </w:t>
+      </w:r>
+      <w:r>
+        <w:rPr>
+          <w:rFonts w:eastAsiaTheme="minorEastAsia"/>
+        </w:rPr>
+        <w:t>–</w:t>
+      </w:r>
+      <w:r>
+        <w:rPr>
+          <w:rFonts w:eastAsiaTheme="minorEastAsia"/>
+        </w:rPr>
+        <w:t xml:space="preserve"> </w:t>
+      </w:r>
+      <w:r>
+        <w:rPr>
+          <w:rFonts w:eastAsiaTheme="minorEastAsia"/>
+        </w:rPr>
+        <w:t xml:space="preserve">наивысшая степень многочленов </w:t>
+      </w:r>
+      <m:oMath>
+        <m:sSub>
+          <m:sSubPr>
+            <m:ctrlPr>
+              <w:rPr>
+                <w:rFonts w:ascii="Cambria Math" w:eastAsiaTheme="minorEastAsia" w:hAnsi="Cambria Math"/>
+                <w:i/>
+              </w:rPr>
+            </m:ctrlPr>
+          </m:sSubPr>
+          <m:e>
+            <m:r>
+              <w:rPr>
+                <w:rFonts w:ascii="Cambria Math" w:eastAsiaTheme="minorEastAsia" w:hAnsi="Cambria Math"/>
+              </w:rPr>
+              <m:t>P</m:t>
+            </m:r>
+          </m:e>
+          <m:sub>
+            <m:r>
+              <w:rPr>
+                <w:rFonts w:ascii="Cambria Math" w:eastAsiaTheme="minorEastAsia" w:hAnsi="Cambria Math"/>
+              </w:rPr>
+              <m:t>n</m:t>
+            </m:r>
+          </m:sub>
+        </m:sSub>
+        <m:d>
+          <m:dPr>
+            <m:ctrlPr>
+              <w:rPr>
+                <w:rFonts w:ascii="Cambria Math" w:eastAsiaTheme="minorEastAsia" w:hAnsi="Cambria Math"/>
+                <w:i/>
+              </w:rPr>
+            </m:ctrlPr>
+          </m:dPr>
+          <m:e>
+            <m:r>
+              <w:rPr>
+                <w:rFonts w:ascii="Cambria Math" w:eastAsiaTheme="minorEastAsia" w:hAnsi="Cambria Math"/>
+              </w:rPr>
+              <m:t>x</m:t>
+            </m:r>
+          </m:e>
+        </m:d>
+      </m:oMath>
+      <w:r>
+        <w:rPr>
+          <w:rFonts w:eastAsiaTheme="minorEastAsia"/>
+        </w:rPr>
+        <w:t xml:space="preserve">, </w:t>
+      </w:r>
+      <m:oMath>
+        <m:sSub>
+          <m:sSubPr>
+            <m:ctrlPr>
+              <w:rPr>
+                <w:rFonts w:ascii="Cambria Math" w:eastAsiaTheme="minorEastAsia" w:hAnsi="Cambria Math"/>
+                <w:i/>
+              </w:rPr>
+            </m:ctrlPr>
+          </m:sSubPr>
+          <m:e>
+            <m:r>
+              <w:rPr>
+                <w:rFonts w:ascii="Cambria Math" w:eastAsiaTheme="minorEastAsia" w:hAnsi="Cambria Math"/>
+              </w:rPr>
+              <m:t>Q</m:t>
+            </m:r>
+          </m:e>
+          <m:sub>
+            <m:r>
+              <w:rPr>
+                <w:rFonts w:ascii="Cambria Math" w:eastAsiaTheme="minorEastAsia" w:hAnsi="Cambria Math"/>
+                <w:lang w:val="en-US"/>
+              </w:rPr>
+              <m:t>m</m:t>
+            </m:r>
+          </m:sub>
+        </m:sSub>
+        <m:d>
+          <m:dPr>
+            <m:ctrlPr>
+              <w:rPr>
+                <w:rFonts w:ascii="Cambria Math" w:eastAsiaTheme="minorEastAsia" w:hAnsi="Cambria Math"/>
+                <w:i/>
+              </w:rPr>
+            </m:ctrlPr>
+          </m:dPr>
+          <m:e>
+            <m:r>
+              <w:rPr>
+                <w:rFonts w:ascii="Cambria Math" w:eastAsiaTheme="minorEastAsia" w:hAnsi="Cambria Math"/>
+              </w:rPr>
+              <m:t>x</m:t>
+            </m:r>
+          </m:e>
+        </m:d>
+      </m:oMath>
+      <w:r>
+        <w:rPr>
+          <w:rFonts w:eastAsiaTheme="minorEastAsia"/>
+        </w:rPr>
+        <w:t xml:space="preserve">, т.е. </w:t>
+      </w:r>
+      <m:oMath>
+        <m:r>
+          <w:rPr>
+            <w:rFonts w:ascii="Cambria Math" w:eastAsiaTheme="minorEastAsia" w:hAnsi="Cambria Math"/>
+          </w:rPr>
+          <m:t>l</m:t>
+        </m:r>
+        <m:r>
+          <w:rPr>
+            <w:rFonts w:ascii="Cambria Math" w:eastAsiaTheme="minorEastAsia" w:hAnsi="Cambria Math"/>
+            <w:lang w:val="en-US"/>
+          </w:rPr>
+          <m:t>=</m:t>
+        </m:r>
+        <m:func>
+          <m:funcPr>
+            <m:ctrlPr>
+              <w:rPr>
+                <w:rFonts w:ascii="Cambria Math" w:eastAsiaTheme="minorEastAsia" w:hAnsi="Cambria Math"/>
+                <w:i/>
+                <w:lang w:val="en-US"/>
+              </w:rPr>
+            </m:ctrlPr>
+          </m:funcPr>
+          <m:fName>
+            <m:r>
+              <m:rPr>
+                <m:sty m:val="p"/>
+              </m:rPr>
+              <w:rPr>
+                <w:rFonts w:ascii="Cambria Math" w:eastAsiaTheme="minorEastAsia" w:hAnsi="Cambria Math"/>
+                <w:lang w:val="en-US"/>
+              </w:rPr>
+              <m:t>max</m:t>
+            </m:r>
+          </m:fName>
+          <m:e>
+            <m:r>
+              <w:rPr>
+                <w:rFonts w:ascii="Cambria Math" w:eastAsiaTheme="minorEastAsia" w:hAnsi="Cambria Math"/>
+                <w:lang w:val="en-US"/>
+              </w:rPr>
+              <m:t>(n,m)</m:t>
+            </m:r>
+          </m:e>
+        </m:func>
+      </m:oMath>
+      <w:r>
+        <w:rPr>
+          <w:rFonts w:eastAsiaTheme="minorEastAsia"/>
+          <w:lang w:val="en-US"/>
+        </w:rPr>
+        <w:t>.</w:t>
       </w:r>
     </w:p>
     <w:sectPr>
@@ -45437,7 +46478,7 @@
 </file>
 
 <file path=word/numbering.xml><?xml version="1.0" encoding="utf-8"?>
-<w:numbering xmlns:wpc="http://schemas.microsoft.com/office/word/2010/wordprocessingCanvas" xmlns:cx="http://schemas.microsoft.com/office/drawing/2014/chartex" xmlns:cx1="http://schemas.microsoft.com/office/drawing/2015/9/8/chartex" xmlns:cx2="http://schemas.microsoft.com/office/drawing/2015/10/21/chartex" xmlns:cx3="http://schemas.microsoft.com/office/drawing/2016/5/9/chartex" xmlns:cx4="http://schemas.microsoft.com/office/drawing/2016/5/10/chartex" xmlns:cx5="http://schemas.microsoft.com/office/drawing/2016/5/11/chartex" xmlns:cx6="http://schemas.microsoft.com/office/drawing/2016/5/12/chartex" xmlns:cx7="http://schemas.microsoft.com/office/drawing/2016/5/13/chartex" xmlns:cx8="http://schemas.microsoft.com/office/drawing/2016/5/14/chartex" xmlns:mc="http://schemas.openxmlformats.org/markup-compatibility/2006" xmlns:aink="http://schemas.microsoft.com/office/drawing/2016/ink" xmlns:am3d="http://schemas.microsoft.com/office/drawing/2017/model3d" xmlns:o="urn:schemas-microsoft-com:office:office" xmlns:r="http://schemas.openxmlformats.org/officeDocument/2006/relationships" xmlns:m="http://schemas.openxmlformats.org/officeDocument/2006/math" xmlns:v="urn:schemas-microsoft-com:vml" xmlns:wp14="http://schemas.microsoft.com/office/word/2010/wordprocessingDrawing" xmlns:wp="http://schemas.openxmlformats.org/drawingml/2006/wordprocessingDrawing" xmlns:w10="urn:schemas-microsoft-com:office:word" xmlns:w="http://schemas.openxmlformats.org/wordprocessingml/2006/main" xmlns:w14="http://schemas.microsoft.com/office/word/2010/wordml" xmlns:w15="http://schemas.microsoft.com/office/word/2012/wordml" xmlns:w16cex="http://schemas.microsoft.com/office/word/2018/wordml/cex" xmlns:w16cid="http://schemas.microsoft.com/office/word/2016/wordml/cid" xmlns:w16="http://schemas.microsoft.com/office/word/2018/wordml" xmlns:w16sdtdh="http://schemas.microsoft.com/office/word/2020/wordml/sdtdatahash" xmlns:w16se="http://schemas.microsoft.com/office/word/2015/wordml/symex" xmlns:wpg="http://schemas.microsoft.com/office/word/2010/wordprocessingGroup" xmlns:wpi="http://schemas.microsoft.com/office/word/2010/wordprocessingInk" xmlns:wne="http://schemas.microsoft.com/office/word/2006/wordml" xmlns:wps="http://schemas.microsoft.com/office/word/2010/wordprocessingShape" mc:Ignorable="w14 w15 w16se w16cid w16 w16cex w16sdtdh wp14">
+<w:numbering xmlns:wpc="http://schemas.microsoft.com/office/word/2010/wordprocessingCanvas" xmlns:cx="http://schemas.microsoft.com/office/drawing/2014/chartex" xmlns:cx1="http://schemas.microsoft.com/office/drawing/2015/9/8/chartex" xmlns:cx2="http://schemas.microsoft.com/office/drawing/2015/10/21/chartex" xmlns:cx3="http://schemas.microsoft.com/office/drawing/2016/5/9/chartex" xmlns:cx4="http://schemas.microsoft.com/office/drawing/2016/5/10/chartex" xmlns:cx5="http://schemas.microsoft.com/office/drawing/2016/5/11/chartex" xmlns:cx6="http://schemas.microsoft.com/office/drawing/2016/5/12/chartex" xmlns:cx7="http://schemas.microsoft.com/office/drawing/2016/5/13/chartex" xmlns:cx8="http://schemas.microsoft.com/office/drawing/2016/5/14/chartex" xmlns:mc="http://schemas.openxmlformats.org/markup-compatibility/2006" xmlns:aink="http://schemas.microsoft.com/office/drawing/2016/ink" xmlns:am3d="http://schemas.microsoft.com/office/drawing/2017/model3d" xmlns:o="urn:schemas-microsoft-com:office:office" xmlns:oel="http://schemas.microsoft.com/office/2019/extlst" xmlns:r="http://schemas.openxmlformats.org/officeDocument/2006/relationships" xmlns:m="http://schemas.openxmlformats.org/officeDocument/2006/math" xmlns:v="urn:schemas-microsoft-com:vml" xmlns:wp14="http://schemas.microsoft.com/office/word/2010/wordprocessingDrawing" xmlns:wp="http://schemas.openxmlformats.org/drawingml/2006/wordprocessingDrawing" xmlns:w10="urn:schemas-microsoft-com:office:word" xmlns:w="http://schemas.openxmlformats.org/wordprocessingml/2006/main" xmlns:w14="http://schemas.microsoft.com/office/word/2010/wordml" xmlns:w15="http://schemas.microsoft.com/office/word/2012/wordml" xmlns:w16cex="http://schemas.microsoft.com/office/word/2018/wordml/cex" xmlns:w16cid="http://schemas.microsoft.com/office/word/2016/wordml/cid" xmlns:w16="http://schemas.microsoft.com/office/word/2018/wordml" xmlns:w16sdtdh="http://schemas.microsoft.com/office/word/2020/wordml/sdtdatahash" xmlns:w16se="http://schemas.microsoft.com/office/word/2015/wordml/symex" xmlns:wpg="http://schemas.microsoft.com/office/word/2010/wordprocessingGroup" xmlns:wpi="http://schemas.microsoft.com/office/word/2010/wordprocessingInk" xmlns:wne="http://schemas.microsoft.com/office/word/2006/wordml" xmlns:wps="http://schemas.microsoft.com/office/word/2010/wordprocessingShape" mc:Ignorable="w14 w15 w16se w16cid w16 w16cex w16sdtdh wp14">
   <w:abstractNum w:abstractNumId="0" w15:restartNumberingAfterBreak="0">
     <w:nsid w:val="374F0074"/>
     <w:multiLevelType w:val="hybridMultilevel"/>
@@ -45725,13 +46766,13 @@
       </w:pPr>
     </w:lvl>
   </w:abstractNum>
-  <w:num w:numId="1">
+  <w:num w:numId="1" w16cid:durableId="850411196">
     <w:abstractNumId w:val="1"/>
   </w:num>
-  <w:num w:numId="2">
+  <w:num w:numId="2" w16cid:durableId="2104103375">
     <w:abstractNumId w:val="0"/>
   </w:num>
-  <w:num w:numId="3">
+  <w:num w:numId="3" w16cid:durableId="1040938613">
     <w:abstractNumId w:val="2"/>
   </w:num>
 </w:numbering>
@@ -46160,6 +47201,7 @@
   <w:style w:type="character" w:default="1" w:styleId="a0">
     <w:name w:val="Default Paragraph Font"/>
     <w:uiPriority w:val="1"/>
+    <w:semiHidden/>
     <w:unhideWhenUsed/>
   </w:style>
   <w:style w:type="table" w:default="1" w:styleId="a1">

</xml_diff>